<commit_message>
feat(docs): complete corrected DOCX — promoter, U7, U12, figures, stale-table strip
- cover: author Łukasz Drążek + promoter dr hab. inż. Rafał Dreżewski filled
- U7: corrected Optuna description (default sampler is TPE, not a Gaussian
  process); GA justified by mixed-space handling + cost, not unproven superiority
- U12: 'Tabela 0' -> 'Tabela 1'
- stale Chapter-5 numbers (0.97xx ensembles, 98.4 email, +0.0535/+0.0685 gains)
  stripped from the extracted body so they don't contradict the corrected ch.5
- figures: 5 page renders (architecture diagram s.25-26 + UI screenshots s.48-50)
  embedded in Załącznik A (text extraction cannot recover graphics)

Co-Authored-By: Claude Opus 4.8 <noreply@anthropic.com>
</commit_message>
<xml_diff>
--- a/praca-inzynierska-poprawiona.docx
+++ b/praca-inzynierska-poprawiona.docx
@@ -42,7 +42,7 @@
         <w:t xml:space="preserve"> </w:t>
       </w:r>
       <w:r>
-        <w:t xml:space="preserve">[do uzupełnienia]</w:t>
+        <w:t xml:space="preserve">dr hab. inż. Rafał Dreżewski</w:t>
       </w:r>
     </w:p>
     <w:p>
@@ -2886,7 +2886,7 @@
         <w:pStyle w:val="FirstParagraph"/>
       </w:pPr>
       <w:r>
-        <w:t xml:space="preserve">[stopień. imię nazwisko promotora]</w:t>
+        <w:t xml:space="preserve">dr hab. inż. Rafał Dreżewski</w:t>
       </w:r>
     </w:p>
     <w:p>
@@ -4431,7 +4431,7 @@
         <w:pStyle w:val="BodyText"/>
       </w:pPr>
       <w:r>
-        <w:t xml:space="preserve">Tabela 0. Porównanie wybranych rozwiązań do wykrywania phishingu pod kątem typu, użycia</w:t>
+        <w:t xml:space="preserve">Tabela 1. Porównanie wybranych rozwiązań do wykrywania phishingu pod kątem typu, użycia</w:t>
       </w:r>
       <w:r>
         <w:t xml:space="preserve"> </w:t>
@@ -7793,19 +7793,7 @@
         <w:t xml:space="preserve"> </w:t>
       </w:r>
       <w:r>
-        <w:t xml:space="preserve">modelu zastępczego. Ma jednak wady. Modeluje funkcję jako proces gaussowski, co przy</w:t>
-      </w:r>
-      <w:r>
-        <w:t xml:space="preserve"> </w:t>
-      </w:r>
-      <w:r>
-        <w:t xml:space="preserve">zmiennych kategorialnych wymaga sztucznych przekształceń. Poza tym może utykać w</w:t>
-      </w:r>
-      <w:r>
-        <w:t xml:space="preserve"> </w:t>
-      </w:r>
-      <w:r>
-        <w:t xml:space="preserve">lokalnych ekstremach.</w:t>
+        <w:t xml:space="preserve">modelu zastępczego. Domyślnym samplerem biblioteki Optuna jest TPE (Tree-structured Parzen Estimator), a wariant oparty na procesie Gaussa stanowi osobną, opcjonalną metodę. Optymalizacja bayesowska bywa wrażliwa na zmienne kategorialne i dobór przestrzeni; w tym projekcie wartości kategorialne i tak mapowane są na indeksy (src/optimization/search_spaces.py). Algorytm genetyczny wybrano ze względu na naturalną obsługę mieszanych przestrzeni (całkowitych, ciągłych i kategorialnych) bez sztucznych przekształceń oraz prostą kontrolę kosztu obliczeń, a nie z powodu udowodnionej przewagi skuteczności nad optymalizacją bayesowską.</w:t>
       </w:r>
     </w:p>
     <w:p>
@@ -10906,14 +10894,6 @@
         <w:pStyle w:val="BodyText"/>
       </w:pPr>
       <w:r>
-        <w:t xml:space="preserve">MLP 0,9501 0,9468 0,9485 0,9476 0,9778</w:t>
-      </w:r>
-    </w:p>
-    <w:p>
-      <w:pPr>
-        <w:pStyle w:val="BodyText"/>
-      </w:pPr>
-      <w:r>
         <w:t xml:space="preserve">XGBoost 0,9651 0,9613 0,9628 0,9620 0,9869</w:t>
       </w:r>
     </w:p>
@@ -11086,14 +11066,6 @@
         <w:pStyle w:val="BodyText"/>
       </w:pPr>
       <w:r>
-        <w:t xml:space="preserve">Logistic Regression 0,9214 0,9749 +0,0535</w:t>
-      </w:r>
-    </w:p>
-    <w:p>
-      <w:pPr>
-        <w:pStyle w:val="BodyText"/>
-      </w:pPr>
-      <w:r>
         <w:t xml:space="preserve">Random Forest 0,9597 0,9705 +0,0108</w:t>
       </w:r>
     </w:p>
@@ -11134,14 +11106,6 @@
         <w:pStyle w:val="BodyText"/>
       </w:pPr>
       <w:r>
-        <w:t xml:space="preserve">Naive Bayes 0,8753 0,9438 +0,0685</w:t>
-      </w:r>
-    </w:p>
-    <w:p>
-      <w:pPr>
-        <w:pStyle w:val="BodyText"/>
-      </w:pPr>
-      <w:r>
         <w:t xml:space="preserve">Tabela 5. Porównanie F1-score klasyfikatorów bazowych i zoptymalizowanych GA (wartości</w:t>
       </w:r>
       <w:r>
@@ -11186,18 +11150,6 @@
         <w:t xml:space="preserve"> </w:t>
       </w:r>
       <w:r>
-        <w:t xml:space="preserve">modeli z jednym dominującym hiperparametrem na skali logarytmicznej: Naive Bayes (+0,0685,</w:t>
-      </w:r>
-      <w:r>
-        <w:t xml:space="preserve"> </w:t>
-      </w:r>
-      <w:r>
-        <w:t xml:space="preserve">znaleziona wartość var_smoothing ~4,4·10⁻¹¹) oraz Logistic Regression (+0,0535, znaleziona</w:t>
-      </w:r>
-      <w:r>
-        <w:t xml:space="preserve"> </w:t>
-      </w:r>
-      <w:r>
         <w:t xml:space="preserve">wartość C ~7,97). Trafienie tych wartości metodą siatkową byłoby trudne, bo wrażliwość jest</w:t>
       </w:r>
       <w:r>
@@ -11508,38 +11460,6 @@
         <w:pStyle w:val="BodyText"/>
       </w:pPr>
       <w:r>
-        <w:t xml:space="preserve">Hard voting 0,9701 0,9678 0,9694 0,9686</w:t>
-      </w:r>
-    </w:p>
-    <w:p>
-      <w:pPr>
-        <w:pStyle w:val="BodyText"/>
-      </w:pPr>
-      <w:r>
-        <w:t xml:space="preserve">Soft voting 0,9747 0,9728 0,9739 0,9733</w:t>
-      </w:r>
-    </w:p>
-    <w:p>
-      <w:pPr>
-        <w:pStyle w:val="BodyText"/>
-      </w:pPr>
-      <w:r>
-        <w:t xml:space="preserve">Stacking (meta = LR) 0,9764 0,9745 0,9758 0,9751</w:t>
-      </w:r>
-    </w:p>
-    <w:p>
-      <w:pPr>
-        <w:pStyle w:val="BodyText"/>
-      </w:pPr>
-      <w:r>
-        <w:t xml:space="preserve">Weighted voting (GA-04) 0,9778 0,9762 0,9771 0,9766</w:t>
-      </w:r>
-    </w:p>
-    <w:p>
-      <w:pPr>
-        <w:pStyle w:val="BodyText"/>
-      </w:pPr>
-      <w:r>
         <w:t xml:space="preserve">Tabela 6. Wyniki zespołów klasyfikatorów na zbiorze testowym temporalnym.</w:t>
       </w:r>
     </w:p>
@@ -11548,21 +11468,6 @@
         <w:pStyle w:val="BodyText"/>
       </w:pPr>
       <w:r>
-        <w:t xml:space="preserve">Wartość 97,47% odpowiada deklarowanej w README.md skuteczności</w:t>
-      </w:r>
-      <w:r>
-        <w:t xml:space="preserve"> </w:t>
-      </w:r>
-      <w:r>
-        <w:t xml:space="preserve">“soft voting (97.47%)”</w:t>
-      </w:r>
-      <w:r>
-        <w:t xml:space="preserve">.</w:t>
-      </w:r>
-      <w:r>
-        <w:t xml:space="preserve"> </w:t>
-      </w:r>
-      <w:r>
         <w:t xml:space="preserve">Najwyższą skuteczność uzyskuje ważone głosowanie po optymalizacji wag algorytmem</w:t>
       </w:r>
       <w:r>
@@ -11639,22 +11544,6 @@
         <w:pStyle w:val="BodyText"/>
       </w:pPr>
       <w:r>
-        <w:t xml:space="preserve">E-mail 65 0,9840 0,9823</w:t>
-      </w:r>
-    </w:p>
-    <w:p>
-      <w:pPr>
-        <w:pStyle w:val="BodyText"/>
-      </w:pPr>
-      <w:r>
-        <w:t xml:space="preserve">SMS 70 0,9716 0,9685</w:t>
-      </w:r>
-    </w:p>
-    <w:p>
-      <w:pPr>
-        <w:pStyle w:val="BodyText"/>
-      </w:pPr>
-      <w:r>
         <w:t xml:space="preserve">Tabela 7. Wyniki modeli wyspecjalizowanych dla wiadomości e-mail i SMS.</w:t>
       </w:r>
     </w:p>
@@ -11662,12 +11551,6 @@
       <w:pPr>
         <w:pStyle w:val="BodyText"/>
       </w:pPr>
-      <w:r>
-        <w:t xml:space="preserve">Wartość 98,4% pochodzi bezpośrednio z metadanych zapisanych w pliku</w:t>
-      </w:r>
-      <w:r>
-        <w:t xml:space="preserve"> </w:t>
-      </w:r>
       <w:r>
         <w:t xml:space="preserve">models/email_sms/ensemble_email.joblib i jest logowana w konsoli serwera przy starcie:</w:t>
       </w:r>
@@ -12707,12 +12590,6 @@
         <w:t xml:space="preserve"> </w:t>
       </w:r>
       <w:r>
-        <w:t xml:space="preserve">• soft voting zespołu siedmiu klasyfikatorów osiąga 97,47% dokładności na temporalnym</w:t>
-      </w:r>
-      <w:r>
-        <w:t xml:space="preserve"> </w:t>
-      </w:r>
-      <w:r>
         <w:t xml:space="preserve">zbiorze testowym URL (zgodnie z README.md); ważone głosowanie po dodatkowej</w:t>
       </w:r>
       <w:r>
@@ -12725,25 +12602,7 @@
         <w:t xml:space="preserve"> </w:t>
       </w:r>
       <w:r>
-        <w:t xml:space="preserve">• model wyspecjalizowany dla e-maili (65 cech) osiąga 98,4% dokładności na zbiorze</w:t>
-      </w:r>
-      <w:r>
-        <w:t xml:space="preserve"> </w:t>
-      </w:r>
-      <w:r>
         <w:t xml:space="preserve">testowym;</w:t>
-      </w:r>
-      <w:r>
-        <w:t xml:space="preserve"> </w:t>
-      </w:r>
-      <w:r>
-        <w:t xml:space="preserve">• największy zysk z optymalizacji uzyskał Naive Bayes (+0,0685 F1) oraz Logistic</w:t>
-      </w:r>
-      <w:r>
-        <w:t xml:space="preserve"> </w:t>
-      </w:r>
-      <w:r>
-        <w:t xml:space="preserve">Regression (+0,0535 F1) - oba modele są małowymiarowe parametrycznie, lecz silnie</w:t>
       </w:r>
       <w:r>
         <w:t xml:space="preserve"> </w:t>
@@ -14211,6 +14070,371 @@
       </w:r>
     </w:p>
     <w:bookmarkEnd w:id="15"/>
+    <w:bookmarkStart w:id="31" w:name="X76524fbbc7d67c5c8a9c1febf3aee3aa1a15cb5"/>
+    <w:p>
+      <w:pPr>
+        <w:pStyle w:val="Heading1"/>
+      </w:pPr>
+      <w:r>
+        <w:t xml:space="preserve">Załącznik A — rysunki (rendery stron oryginału)</w:t>
+      </w:r>
+    </w:p>
+    <w:p>
+      <w:pPr>
+        <w:pStyle w:val="BlockText"/>
+      </w:pPr>
+      <w:r>
+        <w:t xml:space="preserve">Ekstrakcja tekstu nie zawiera grafiki, więc rysunki dołączono jako</w:t>
+      </w:r>
+      <w:r>
+        <w:t xml:space="preserve"> </w:t>
+      </w:r>
+      <w:r>
+        <w:t xml:space="preserve">rendery odpowiednich stron PDF. Przy finalnym składzie zastąp je</w:t>
+      </w:r>
+      <w:r>
+        <w:t xml:space="preserve"> </w:t>
+      </w:r>
+      <w:r>
+        <w:t xml:space="preserve">właściwymi, przyciętymi obrazami.</w:t>
+      </w:r>
+    </w:p>
+    <w:p>
+      <w:pPr>
+        <w:pStyle w:val="CaptionedFigure"/>
+      </w:pPr>
+      <w:r>
+        <w:drawing>
+          <wp:inline>
+            <wp:extent cx="5334000" cy="6902823"/>
+            <wp:effectExtent b="0" l="0" r="0" t="0"/>
+            <wp:docPr descr="Rysunek A1. Architektura systemu (s. 25 oryginału)." title="" id="17" name="Picture"/>
+            <a:graphic>
+              <a:graphicData uri="http://schemas.openxmlformats.org/drawingml/2006/picture">
+                <pic:pic>
+                  <pic:nvPicPr>
+                    <pic:cNvPr descr="/Users/lukaszdrazek/Inzynierka/reports/figury/strona-25.png" id="18" name="Picture"/>
+                    <pic:cNvPicPr>
+                      <a:picLocks noChangeArrowheads="1" noChangeAspect="1"/>
+                    </pic:cNvPicPr>
+                  </pic:nvPicPr>
+                  <pic:blipFill>
+                    <a:blip r:embed="rId16"/>
+                    <a:stretch>
+                      <a:fillRect/>
+                    </a:stretch>
+                  </pic:blipFill>
+                  <pic:spPr bwMode="auto">
+                    <a:xfrm>
+                      <a:off x="0" y="0"/>
+                      <a:ext cx="5334000" cy="6902823"/>
+                    </a:xfrm>
+                    <a:prstGeom prst="rect">
+                      <a:avLst/>
+                    </a:prstGeom>
+                    <a:noFill/>
+                    <a:ln w="9525">
+                      <a:noFill/>
+                      <a:headEnd/>
+                      <a:tailEnd/>
+                    </a:ln>
+                  </pic:spPr>
+                </pic:pic>
+              </a:graphicData>
+            </a:graphic>
+          </wp:inline>
+        </w:drawing>
+      </w:r>
+    </w:p>
+    <w:p>
+      <w:pPr>
+        <w:pStyle w:val="ImageCaption"/>
+      </w:pPr>
+      <w:r>
+        <w:t xml:space="preserve">Rysunek A1. Architektura systemu (s. 25 oryginału).</w:t>
+      </w:r>
+    </w:p>
+    <w:p>
+      <w:pPr>
+        <w:pStyle w:val="BodyText"/>
+      </w:pPr>
+      <w:r>
+        <w:rPr>
+          <w:i/>
+          <w:iCs/>
+        </w:rPr>
+        <w:t xml:space="preserve">Rysunek A1. Architektura systemu (s. 25 oryginału).</w:t>
+      </w:r>
+    </w:p>
+    <w:p>
+      <w:pPr>
+        <w:pStyle w:val="CaptionedFigure"/>
+      </w:pPr>
+      <w:r>
+        <w:drawing>
+          <wp:inline>
+            <wp:extent cx="5334000" cy="6902823"/>
+            <wp:effectExtent b="0" l="0" r="0" t="0"/>
+            <wp:docPr descr="Rysunek A2. Architektura / przepływ danych (s. 26 oryginału)." title="" id="20" name="Picture"/>
+            <a:graphic>
+              <a:graphicData uri="http://schemas.openxmlformats.org/drawingml/2006/picture">
+                <pic:pic>
+                  <pic:nvPicPr>
+                    <pic:cNvPr descr="/Users/lukaszdrazek/Inzynierka/reports/figury/strona-26.png" id="21" name="Picture"/>
+                    <pic:cNvPicPr>
+                      <a:picLocks noChangeArrowheads="1" noChangeAspect="1"/>
+                    </pic:cNvPicPr>
+                  </pic:nvPicPr>
+                  <pic:blipFill>
+                    <a:blip r:embed="rId19"/>
+                    <a:stretch>
+                      <a:fillRect/>
+                    </a:stretch>
+                  </pic:blipFill>
+                  <pic:spPr bwMode="auto">
+                    <a:xfrm>
+                      <a:off x="0" y="0"/>
+                      <a:ext cx="5334000" cy="6902823"/>
+                    </a:xfrm>
+                    <a:prstGeom prst="rect">
+                      <a:avLst/>
+                    </a:prstGeom>
+                    <a:noFill/>
+                    <a:ln w="9525">
+                      <a:noFill/>
+                      <a:headEnd/>
+                      <a:tailEnd/>
+                    </a:ln>
+                  </pic:spPr>
+                </pic:pic>
+              </a:graphicData>
+            </a:graphic>
+          </wp:inline>
+        </w:drawing>
+      </w:r>
+    </w:p>
+    <w:p>
+      <w:pPr>
+        <w:pStyle w:val="ImageCaption"/>
+      </w:pPr>
+      <w:r>
+        <w:t xml:space="preserve">Rysunek A2. Architektura / przepływ danych (s. 26 oryginału).</w:t>
+      </w:r>
+    </w:p>
+    <w:p>
+      <w:pPr>
+        <w:pStyle w:val="BodyText"/>
+      </w:pPr>
+      <w:r>
+        <w:rPr>
+          <w:i/>
+          <w:iCs/>
+        </w:rPr>
+        <w:t xml:space="preserve">Rysunek A2. Architektura / przepływ danych (s. 26 oryginału).</w:t>
+      </w:r>
+    </w:p>
+    <w:p>
+      <w:pPr>
+        <w:pStyle w:val="CaptionedFigure"/>
+      </w:pPr>
+      <w:r>
+        <w:drawing>
+          <wp:inline>
+            <wp:extent cx="5334000" cy="6902823"/>
+            <wp:effectExtent b="0" l="0" r="0" t="0"/>
+            <wp:docPr descr="Rysunek A3. Interfejs — zrzut ekranu (s. 48 oryginału)." title="" id="23" name="Picture"/>
+            <a:graphic>
+              <a:graphicData uri="http://schemas.openxmlformats.org/drawingml/2006/picture">
+                <pic:pic>
+                  <pic:nvPicPr>
+                    <pic:cNvPr descr="/Users/lukaszdrazek/Inzynierka/reports/figury/strona-48.png" id="24" name="Picture"/>
+                    <pic:cNvPicPr>
+                      <a:picLocks noChangeArrowheads="1" noChangeAspect="1"/>
+                    </pic:cNvPicPr>
+                  </pic:nvPicPr>
+                  <pic:blipFill>
+                    <a:blip r:embed="rId22"/>
+                    <a:stretch>
+                      <a:fillRect/>
+                    </a:stretch>
+                  </pic:blipFill>
+                  <pic:spPr bwMode="auto">
+                    <a:xfrm>
+                      <a:off x="0" y="0"/>
+                      <a:ext cx="5334000" cy="6902823"/>
+                    </a:xfrm>
+                    <a:prstGeom prst="rect">
+                      <a:avLst/>
+                    </a:prstGeom>
+                    <a:noFill/>
+                    <a:ln w="9525">
+                      <a:noFill/>
+                      <a:headEnd/>
+                      <a:tailEnd/>
+                    </a:ln>
+                  </pic:spPr>
+                </pic:pic>
+              </a:graphicData>
+            </a:graphic>
+          </wp:inline>
+        </w:drawing>
+      </w:r>
+    </w:p>
+    <w:p>
+      <w:pPr>
+        <w:pStyle w:val="ImageCaption"/>
+      </w:pPr>
+      <w:r>
+        <w:t xml:space="preserve">Rysunek A3. Interfejs — zrzut ekranu (s. 48 oryginału).</w:t>
+      </w:r>
+    </w:p>
+    <w:p>
+      <w:pPr>
+        <w:pStyle w:val="BodyText"/>
+      </w:pPr>
+      <w:r>
+        <w:rPr>
+          <w:i/>
+          <w:iCs/>
+        </w:rPr>
+        <w:t xml:space="preserve">Rysunek A3. Interfejs — zrzut ekranu (s. 48 oryginału).</w:t>
+      </w:r>
+    </w:p>
+    <w:p>
+      <w:pPr>
+        <w:pStyle w:val="CaptionedFigure"/>
+      </w:pPr>
+      <w:r>
+        <w:drawing>
+          <wp:inline>
+            <wp:extent cx="5334000" cy="6902823"/>
+            <wp:effectExtent b="0" l="0" r="0" t="0"/>
+            <wp:docPr descr="Rysunek A4. Interfejs — zrzut ekranu (s. 49 oryginału)." title="" id="26" name="Picture"/>
+            <a:graphic>
+              <a:graphicData uri="http://schemas.openxmlformats.org/drawingml/2006/picture">
+                <pic:pic>
+                  <pic:nvPicPr>
+                    <pic:cNvPr descr="/Users/lukaszdrazek/Inzynierka/reports/figury/strona-49.png" id="27" name="Picture"/>
+                    <pic:cNvPicPr>
+                      <a:picLocks noChangeArrowheads="1" noChangeAspect="1"/>
+                    </pic:cNvPicPr>
+                  </pic:nvPicPr>
+                  <pic:blipFill>
+                    <a:blip r:embed="rId25"/>
+                    <a:stretch>
+                      <a:fillRect/>
+                    </a:stretch>
+                  </pic:blipFill>
+                  <pic:spPr bwMode="auto">
+                    <a:xfrm>
+                      <a:off x="0" y="0"/>
+                      <a:ext cx="5334000" cy="6902823"/>
+                    </a:xfrm>
+                    <a:prstGeom prst="rect">
+                      <a:avLst/>
+                    </a:prstGeom>
+                    <a:noFill/>
+                    <a:ln w="9525">
+                      <a:noFill/>
+                      <a:headEnd/>
+                      <a:tailEnd/>
+                    </a:ln>
+                  </pic:spPr>
+                </pic:pic>
+              </a:graphicData>
+            </a:graphic>
+          </wp:inline>
+        </w:drawing>
+      </w:r>
+    </w:p>
+    <w:p>
+      <w:pPr>
+        <w:pStyle w:val="ImageCaption"/>
+      </w:pPr>
+      <w:r>
+        <w:t xml:space="preserve">Rysunek A4. Interfejs — zrzut ekranu (s. 49 oryginału).</w:t>
+      </w:r>
+    </w:p>
+    <w:p>
+      <w:pPr>
+        <w:pStyle w:val="BodyText"/>
+      </w:pPr>
+      <w:r>
+        <w:rPr>
+          <w:i/>
+          <w:iCs/>
+        </w:rPr>
+        <w:t xml:space="preserve">Rysunek A4. Interfejs — zrzut ekranu (s. 49 oryginału).</w:t>
+      </w:r>
+    </w:p>
+    <w:p>
+      <w:pPr>
+        <w:pStyle w:val="CaptionedFigure"/>
+      </w:pPr>
+      <w:r>
+        <w:drawing>
+          <wp:inline>
+            <wp:extent cx="5334000" cy="6902823"/>
+            <wp:effectExtent b="0" l="0" r="0" t="0"/>
+            <wp:docPr descr="Rysunek A5. Interfejs — zrzut ekranu (s. 50 oryginału)." title="" id="29" name="Picture"/>
+            <a:graphic>
+              <a:graphicData uri="http://schemas.openxmlformats.org/drawingml/2006/picture">
+                <pic:pic>
+                  <pic:nvPicPr>
+                    <pic:cNvPr descr="/Users/lukaszdrazek/Inzynierka/reports/figury/strona-50.png" id="30" name="Picture"/>
+                    <pic:cNvPicPr>
+                      <a:picLocks noChangeArrowheads="1" noChangeAspect="1"/>
+                    </pic:cNvPicPr>
+                  </pic:nvPicPr>
+                  <pic:blipFill>
+                    <a:blip r:embed="rId28"/>
+                    <a:stretch>
+                      <a:fillRect/>
+                    </a:stretch>
+                  </pic:blipFill>
+                  <pic:spPr bwMode="auto">
+                    <a:xfrm>
+                      <a:off x="0" y="0"/>
+                      <a:ext cx="5334000" cy="6902823"/>
+                    </a:xfrm>
+                    <a:prstGeom prst="rect">
+                      <a:avLst/>
+                    </a:prstGeom>
+                    <a:noFill/>
+                    <a:ln w="9525">
+                      <a:noFill/>
+                      <a:headEnd/>
+                      <a:tailEnd/>
+                    </a:ln>
+                  </pic:spPr>
+                </pic:pic>
+              </a:graphicData>
+            </a:graphic>
+          </wp:inline>
+        </w:drawing>
+      </w:r>
+    </w:p>
+    <w:p>
+      <w:pPr>
+        <w:pStyle w:val="ImageCaption"/>
+      </w:pPr>
+      <w:r>
+        <w:t xml:space="preserve">Rysunek A5. Interfejs — zrzut ekranu (s. 50 oryginału).</w:t>
+      </w:r>
+    </w:p>
+    <w:p>
+      <w:pPr>
+        <w:pStyle w:val="BodyText"/>
+      </w:pPr>
+      <w:r>
+        <w:rPr>
+          <w:i/>
+          <w:iCs/>
+        </w:rPr>
+        <w:t xml:space="preserve">Rysunek A5. Interfejs — zrzut ekranu (s. 50 oryginału).</w:t>
+      </w:r>
+    </w:p>
+    <w:bookmarkEnd w:id="31"/>
     <w:sectPr>
       <w:footnotePr>
         <w:numRestart w:val="eachSect"/>

</xml_diff>

<commit_message>
feat(docs): apply WSZiB editorial standard + clean code listings (U11)
- WSZiB standard (from Standard_pisania_pracy_WSZiB-ANS.pdf): Times New Roman
  12 pt, line spacing 1.5, justified body, 2.5 cm margins, bold headings 16/14 pt
  left-aligned — applied via python-docx in the build (_apply_wszib_styles).
- U11: Załącznik B with clean code listings read from the real source
  (disagreement measure, paradigm weights) instead of the garbled PDF listings.
- python-docx added to requirements.

Co-Authored-By: Claude Opus 4.8 <noreply@anthropic.com>
</commit_message>
<xml_diff>
--- a/praca-inzynierska-poprawiona.docx
+++ b/praca-inzynierska-poprawiona.docx
@@ -14435,10 +14435,2638 @@
       </w:r>
     </w:p>
     <w:bookmarkEnd w:id="31"/>
+    <w:bookmarkStart w:id="32" w:name="X6aa2ea93f36e86d4a816f8245b4a3606ca86790"/>
+    <w:p>
+      <w:pPr>
+        <w:pStyle w:val="Heading1"/>
+      </w:pPr>
+      <w:r>
+        <w:t xml:space="preserve">Załącznik B — wybrane listingi kodu (czyste, z repozytorium)</w:t>
+      </w:r>
+    </w:p>
+    <w:p>
+      <w:pPr>
+        <w:pStyle w:val="FirstParagraph"/>
+      </w:pPr>
+      <w:r>
+        <w:rPr>
+          <w:b/>
+          <w:bCs/>
+        </w:rPr>
+        <w:t xml:space="preserve">Miara rozbieżności (poprawiona normalizacja)</w:t>
+      </w:r>
+      <w:r>
+        <w:t xml:space="preserve"> </w:t>
+      </w:r>
+      <w:r>
+        <w:t xml:space="preserve">(</w:t>
+      </w:r>
+      <w:r>
+        <w:rPr>
+          <w:rStyle w:val="VerbatimChar"/>
+        </w:rPr>
+        <w:t xml:space="preserve">src/paradigms/aggregation/disagreement.py</w:t>
+      </w:r>
+      <w:r>
+        <w:t xml:space="preserve">):</w:t>
+      </w:r>
+    </w:p>
+    <w:p>
+      <w:pPr>
+        <w:pStyle w:val="SourceCode"/>
+      </w:pPr>
+      <w:r>
+        <w:rPr>
+          <w:rStyle w:val="CommentTok"/>
+        </w:rPr>
+        <w:t xml:space="preserve">"""Cross-paradigm disagreement detection using normalized Shannon entropy.</w:t>
+      </w:r>
+      <w:r>
+        <w:br/>
+      </w:r>
+      <w:r>
+        <w:br/>
+      </w:r>
+      <w:r>
+        <w:rPr>
+          <w:rStyle w:val="CommentTok"/>
+        </w:rPr>
+        <w:t xml:space="preserve">Extends Phase 3 classifier disagreement approach to detect disagreements</w:t>
+      </w:r>
+      <w:r>
+        <w:br/>
+      </w:r>
+      <w:r>
+        <w:rPr>
+          <w:rStyle w:val="CommentTok"/>
+        </w:rPr>
+        <w:t xml:space="preserve">between the three paradigms: ML ensemble, rule-based, and Bayesian.</w:t>
+      </w:r>
+      <w:r>
+        <w:br/>
+      </w:r>
+      <w:r>
+        <w:br/>
+      </w:r>
+      <w:r>
+        <w:rPr>
+          <w:rStyle w:val="CommentTok"/>
+        </w:rPr>
+        <w:t xml:space="preserve">Key differences from classifier disagreement:</w:t>
+      </w:r>
+      <w:r>
+        <w:br/>
+      </w:r>
+      <w:r>
+        <w:rPr>
+          <w:rStyle w:val="CommentTok"/>
+        </w:rPr>
+        <w:t xml:space="preserve">- 3 paradigms vs 7 classifiers</w:t>
+      </w:r>
+      <w:r>
+        <w:br/>
+      </w:r>
+      <w:r>
+        <w:rPr>
+          <w:rStyle w:val="CommentTok"/>
+        </w:rPr>
+        <w:t xml:space="preserve">- Max entropy for 3 paradigms: log2(3) = 1.585</w:t>
+      </w:r>
+      <w:r>
+        <w:br/>
+      </w:r>
+      <w:r>
+        <w:rPr>
+          <w:rStyle w:val="CommentTok"/>
+        </w:rPr>
+        <w:t xml:space="preserve">- Different probability scales (ML proba, rule score, Bayesian posterior)</w:t>
+      </w:r>
+      <w:r>
+        <w:br/>
+      </w:r>
+      <w:r>
+        <w:rPr>
+          <w:rStyle w:val="CommentTok"/>
+        </w:rPr>
+        <w:t xml:space="preserve">"""</w:t>
+      </w:r>
+      <w:r>
+        <w:br/>
+      </w:r>
+      <w:r>
+        <w:br/>
+      </w:r>
+      <w:r>
+        <w:rPr>
+          <w:rStyle w:val="ImportTok"/>
+        </w:rPr>
+        <w:t xml:space="preserve">import</w:t>
+      </w:r>
+      <w:r>
+        <w:rPr>
+          <w:rStyle w:val="NormalTok"/>
+        </w:rPr>
+        <w:t xml:space="preserve"> numpy </w:t>
+      </w:r>
+      <w:r>
+        <w:rPr>
+          <w:rStyle w:val="ImportTok"/>
+        </w:rPr>
+        <w:t xml:space="preserve">as</w:t>
+      </w:r>
+      <w:r>
+        <w:rPr>
+          <w:rStyle w:val="NormalTok"/>
+        </w:rPr>
+        <w:t xml:space="preserve"> np</w:t>
+      </w:r>
+      <w:r>
+        <w:br/>
+      </w:r>
+      <w:r>
+        <w:rPr>
+          <w:rStyle w:val="ImportTok"/>
+        </w:rPr>
+        <w:t xml:space="preserve">from</w:t>
+      </w:r>
+      <w:r>
+        <w:rPr>
+          <w:rStyle w:val="NormalTok"/>
+        </w:rPr>
+        <w:t xml:space="preserve"> scipy.stats </w:t>
+      </w:r>
+      <w:r>
+        <w:rPr>
+          <w:rStyle w:val="ImportTok"/>
+        </w:rPr>
+        <w:t xml:space="preserve">import</w:t>
+      </w:r>
+      <w:r>
+        <w:rPr>
+          <w:rStyle w:val="NormalTok"/>
+        </w:rPr>
+        <w:t xml:space="preserve"> entropy</w:t>
+      </w:r>
+      <w:r>
+        <w:br/>
+      </w:r>
+      <w:r>
+        <w:rPr>
+          <w:rStyle w:val="ImportTok"/>
+        </w:rPr>
+        <w:t xml:space="preserve">from</w:t>
+      </w:r>
+      <w:r>
+        <w:rPr>
+          <w:rStyle w:val="NormalTok"/>
+        </w:rPr>
+        <w:t xml:space="preserve"> typing </w:t>
+      </w:r>
+      <w:r>
+        <w:rPr>
+          <w:rStyle w:val="ImportTok"/>
+        </w:rPr>
+        <w:t xml:space="preserve">import</w:t>
+      </w:r>
+      <w:r>
+        <w:rPr>
+          <w:rStyle w:val="NormalTok"/>
+        </w:rPr>
+        <w:t xml:space="preserve"> Dict, List, Tuple</w:t>
+      </w:r>
+      <w:r>
+        <w:br/>
+      </w:r>
+      <w:r>
+        <w:br/>
+      </w:r>
+      <w:r>
+        <w:rPr>
+          <w:rStyle w:val="CommentTok"/>
+        </w:rPr>
+        <w:t xml:space="preserve"># Threshold for edge case detection (consistent with Phase 3)</w:t>
+      </w:r>
+      <w:r>
+        <w:br/>
+      </w:r>
+      <w:r>
+        <w:rPr>
+          <w:rStyle w:val="NormalTok"/>
+        </w:rPr>
+        <w:t xml:space="preserve">PARADIGM_DISAGREEMENT_THRESHOLD </w:t>
+      </w:r>
+      <w:r>
+        <w:rPr>
+          <w:rStyle w:val="OperatorTok"/>
+        </w:rPr>
+        <w:t xml:space="preserve">=</w:t>
+      </w:r>
+      <w:r>
+        <w:rPr>
+          <w:rStyle w:val="NormalTok"/>
+        </w:rPr>
+        <w:t xml:space="preserve"> </w:t>
+      </w:r>
+      <w:r>
+        <w:rPr>
+          <w:rStyle w:val="FloatTok"/>
+        </w:rPr>
+        <w:t xml:space="preserve">0.7</w:t>
+      </w:r>
+      <w:r>
+        <w:br/>
+      </w:r>
+      <w:r>
+        <w:br/>
+      </w:r>
+      <w:r>
+        <w:br/>
+      </w:r>
+      <w:r>
+        <w:rPr>
+          <w:rStyle w:val="KeywordTok"/>
+        </w:rPr>
+        <w:t xml:space="preserve">def</w:t>
+      </w:r>
+      <w:r>
+        <w:rPr>
+          <w:rStyle w:val="NormalTok"/>
+        </w:rPr>
+        <w:t xml:space="preserve"> calculate_paradigm_disagreement(</w:t>
+      </w:r>
+      <w:r>
+        <w:br/>
+      </w:r>
+      <w:r>
+        <w:rPr>
+          <w:rStyle w:val="NormalTok"/>
+        </w:rPr>
+        <w:t xml:space="preserve">    ml_prediction: </w:t>
+      </w:r>
+      <w:r>
+        <w:rPr>
+          <w:rStyle w:val="BuiltInTok"/>
+        </w:rPr>
+        <w:t xml:space="preserve">str</w:t>
+      </w:r>
+      <w:r>
+        <w:rPr>
+          <w:rStyle w:val="NormalTok"/>
+        </w:rPr>
+        <w:t xml:space="preserve">,</w:t>
+      </w:r>
+      <w:r>
+        <w:br/>
+      </w:r>
+      <w:r>
+        <w:rPr>
+          <w:rStyle w:val="NormalTok"/>
+        </w:rPr>
+        <w:t xml:space="preserve">    ml_probability: </w:t>
+      </w:r>
+      <w:r>
+        <w:rPr>
+          <w:rStyle w:val="BuiltInTok"/>
+        </w:rPr>
+        <w:t xml:space="preserve">float</w:t>
+      </w:r>
+      <w:r>
+        <w:rPr>
+          <w:rStyle w:val="NormalTok"/>
+        </w:rPr>
+        <w:t xml:space="preserve">,</w:t>
+      </w:r>
+      <w:r>
+        <w:br/>
+      </w:r>
+      <w:r>
+        <w:rPr>
+          <w:rStyle w:val="NormalTok"/>
+        </w:rPr>
+        <w:t xml:space="preserve">    rule_prediction: </w:t>
+      </w:r>
+      <w:r>
+        <w:rPr>
+          <w:rStyle w:val="BuiltInTok"/>
+        </w:rPr>
+        <w:t xml:space="preserve">str</w:t>
+      </w:r>
+      <w:r>
+        <w:rPr>
+          <w:rStyle w:val="NormalTok"/>
+        </w:rPr>
+        <w:t xml:space="preserve">,</w:t>
+      </w:r>
+      <w:r>
+        <w:br/>
+      </w:r>
+      <w:r>
+        <w:rPr>
+          <w:rStyle w:val="NormalTok"/>
+        </w:rPr>
+        <w:t xml:space="preserve">    rule_probability: </w:t>
+      </w:r>
+      <w:r>
+        <w:rPr>
+          <w:rStyle w:val="BuiltInTok"/>
+        </w:rPr>
+        <w:t xml:space="preserve">float</w:t>
+      </w:r>
+      <w:r>
+        <w:rPr>
+          <w:rStyle w:val="NormalTok"/>
+        </w:rPr>
+        <w:t xml:space="preserve">,</w:t>
+      </w:r>
+      <w:r>
+        <w:br/>
+      </w:r>
+      <w:r>
+        <w:rPr>
+          <w:rStyle w:val="NormalTok"/>
+        </w:rPr>
+        <w:t xml:space="preserve">    bayesian_prediction: </w:t>
+      </w:r>
+      <w:r>
+        <w:rPr>
+          <w:rStyle w:val="BuiltInTok"/>
+        </w:rPr>
+        <w:t xml:space="preserve">str</w:t>
+      </w:r>
+      <w:r>
+        <w:rPr>
+          <w:rStyle w:val="NormalTok"/>
+        </w:rPr>
+        <w:t xml:space="preserve">,</w:t>
+      </w:r>
+      <w:r>
+        <w:br/>
+      </w:r>
+      <w:r>
+        <w:rPr>
+          <w:rStyle w:val="NormalTok"/>
+        </w:rPr>
+        <w:t xml:space="preserve">    bayesian_probability: </w:t>
+      </w:r>
+      <w:r>
+        <w:rPr>
+          <w:rStyle w:val="BuiltInTok"/>
+        </w:rPr>
+        <w:t xml:space="preserve">float</w:t>
+      </w:r>
+      <w:r>
+        <w:br/>
+      </w:r>
+      <w:r>
+        <w:rPr>
+          <w:rStyle w:val="NormalTok"/>
+        </w:rPr>
+        <w:t xml:space="preserve">) </w:t>
+      </w:r>
+      <w:r>
+        <w:rPr>
+          <w:rStyle w:val="OperatorTok"/>
+        </w:rPr>
+        <w:t xml:space="preserve">-&gt;</w:t>
+      </w:r>
+      <w:r>
+        <w:rPr>
+          <w:rStyle w:val="NormalTok"/>
+        </w:rPr>
+        <w:t xml:space="preserve"> Dict:</w:t>
+      </w:r>
+      <w:r>
+        <w:br/>
+      </w:r>
+      <w:r>
+        <w:rPr>
+          <w:rStyle w:val="NormalTok"/>
+        </w:rPr>
+        <w:t xml:space="preserve">    </w:t>
+      </w:r>
+      <w:r>
+        <w:rPr>
+          <w:rStyle w:val="CommentTok"/>
+        </w:rPr>
+        <w:t xml:space="preserve">"""Calculate disagreement across three paradigms.</w:t>
+      </w:r>
+      <w:r>
+        <w:br/>
+      </w:r>
+      <w:r>
+        <w:br/>
+      </w:r>
+      <w:r>
+        <w:rPr>
+          <w:rStyle w:val="CommentTok"/>
+        </w:rPr>
+        <w:t xml:space="preserve">    Args:</w:t>
+      </w:r>
+      <w:r>
+        <w:br/>
+      </w:r>
+      <w:r>
+        <w:rPr>
+          <w:rStyle w:val="CommentTok"/>
+        </w:rPr>
+        <w:t xml:space="preserve">        ml_prediction: 'phishing' or 'legitimate' from ML ensemble</w:t>
+      </w:r>
+      <w:r>
+        <w:br/>
+      </w:r>
+      <w:r>
+        <w:rPr>
+          <w:rStyle w:val="CommentTok"/>
+        </w:rPr>
+        <w:t xml:space="preserve">        ml_probability: Phishing probability from ML (0-1)</w:t>
+      </w:r>
+      <w:r>
+        <w:br/>
+      </w:r>
+      <w:r>
+        <w:rPr>
+          <w:rStyle w:val="CommentTok"/>
+        </w:rPr>
+        <w:t xml:space="preserve">        rule_prediction: 'phishing' or 'legitimate' from rules</w:t>
+      </w:r>
+      <w:r>
+        <w:br/>
+      </w:r>
+      <w:r>
+        <w:rPr>
+          <w:rStyle w:val="CommentTok"/>
+        </w:rPr>
+        <w:t xml:space="preserve">        rule_probability: Rule score (0-1)</w:t>
+      </w:r>
+      <w:r>
+        <w:br/>
+      </w:r>
+      <w:r>
+        <w:rPr>
+          <w:rStyle w:val="CommentTok"/>
+        </w:rPr>
+        <w:t xml:space="preserve">        bayesian_prediction: 'phishing' or 'legitimate' from Bayesian</w:t>
+      </w:r>
+      <w:r>
+        <w:br/>
+      </w:r>
+      <w:r>
+        <w:rPr>
+          <w:rStyle w:val="CommentTok"/>
+        </w:rPr>
+        <w:t xml:space="preserve">        bayesian_probability: Posterior phishing probability (0-1)</w:t>
+      </w:r>
+      <w:r>
+        <w:br/>
+      </w:r>
+      <w:r>
+        <w:br/>
+      </w:r>
+      <w:r>
+        <w:rPr>
+          <w:rStyle w:val="CommentTok"/>
+        </w:rPr>
+        <w:t xml:space="preserve">    Returns:</w:t>
+      </w:r>
+      <w:r>
+        <w:br/>
+      </w:r>
+      <w:r>
+        <w:rPr>
+          <w:rStyle w:val="CommentTok"/>
+        </w:rPr>
+        <w:t xml:space="preserve">        Dict with:</w:t>
+      </w:r>
+      <w:r>
+        <w:br/>
+      </w:r>
+      <w:r>
+        <w:rPr>
+          <w:rStyle w:val="CommentTok"/>
+        </w:rPr>
+        <w:t xml:space="preserve">            'score': Normalized entropy (0-1)</w:t>
+      </w:r>
+      <w:r>
+        <w:br/>
+      </w:r>
+      <w:r>
+        <w:rPr>
+          <w:rStyle w:val="CommentTok"/>
+        </w:rPr>
+        <w:t xml:space="preserve">            'is_edge_case': True if score &gt; threshold</w:t>
+      </w:r>
+      <w:r>
+        <w:br/>
+      </w:r>
+      <w:r>
+        <w:rPr>
+          <w:rStyle w:val="CommentTok"/>
+        </w:rPr>
+        <w:t xml:space="preserve">            'vote_distribution': {'phishing': N, 'legitimate': M}</w:t>
+      </w:r>
+      <w:r>
+        <w:br/>
+      </w:r>
+      <w:r>
+        <w:rPr>
+          <w:rStyle w:val="CommentTok"/>
+        </w:rPr>
+        <w:t xml:space="preserve">            'probability_variance': Variance across paradigm probabilities</w:t>
+      </w:r>
+      <w:r>
+        <w:br/>
+      </w:r>
+      <w:r>
+        <w:rPr>
+          <w:rStyle w:val="CommentTok"/>
+        </w:rPr>
+        <w:t xml:space="preserve">            'disagreeing_paradigms': List of paradigms disagreeing with majority</w:t>
+      </w:r>
+      <w:r>
+        <w:br/>
+      </w:r>
+      <w:r>
+        <w:rPr>
+          <w:rStyle w:val="CommentTok"/>
+        </w:rPr>
+        <w:t xml:space="preserve">            'probability_spread': Max - min probability across paradigms</w:t>
+      </w:r>
+      <w:r>
+        <w:br/>
+      </w:r>
+      <w:r>
+        <w:rPr>
+          <w:rStyle w:val="CommentTok"/>
+        </w:rPr>
+        <w:t xml:space="preserve">    """</w:t>
+      </w:r>
+      <w:r>
+        <w:br/>
+      </w:r>
+      <w:r>
+        <w:rPr>
+          <w:rStyle w:val="NormalTok"/>
+        </w:rPr>
+        <w:t xml:space="preserve">    predictions </w:t>
+      </w:r>
+      <w:r>
+        <w:rPr>
+          <w:rStyle w:val="OperatorTok"/>
+        </w:rPr>
+        <w:t xml:space="preserve">=</w:t>
+      </w:r>
+      <w:r>
+        <w:rPr>
+          <w:rStyle w:val="NormalTok"/>
+        </w:rPr>
+        <w:t xml:space="preserve"> {</w:t>
+      </w:r>
+      <w:r>
+        <w:br/>
+      </w:r>
+      <w:r>
+        <w:rPr>
+          <w:rStyle w:val="NormalTok"/>
+        </w:rPr>
+        <w:t xml:space="preserve">        </w:t>
+      </w:r>
+      <w:r>
+        <w:rPr>
+          <w:rStyle w:val="StringTok"/>
+        </w:rPr>
+        <w:t xml:space="preserve">'ml_ensemble'</w:t>
+      </w:r>
+      <w:r>
+        <w:rPr>
+          <w:rStyle w:val="NormalTok"/>
+        </w:rPr>
+        <w:t xml:space="preserve">: ml_prediction,</w:t>
+      </w:r>
+      <w:r>
+        <w:br/>
+      </w:r>
+      <w:r>
+        <w:rPr>
+          <w:rStyle w:val="NormalTok"/>
+        </w:rPr>
+        <w:t xml:space="preserve">        </w:t>
+      </w:r>
+      <w:r>
+        <w:rPr>
+          <w:rStyle w:val="StringTok"/>
+        </w:rPr>
+        <w:t xml:space="preserve">'rules'</w:t>
+      </w:r>
+      <w:r>
+        <w:rPr>
+          <w:rStyle w:val="NormalTok"/>
+        </w:rPr>
+        <w:t xml:space="preserve">: rule_prediction,</w:t>
+      </w:r>
+      <w:r>
+        <w:br/>
+      </w:r>
+      <w:r>
+        <w:rPr>
+          <w:rStyle w:val="NormalTok"/>
+        </w:rPr>
+        <w:t xml:space="preserve">        </w:t>
+      </w:r>
+      <w:r>
+        <w:rPr>
+          <w:rStyle w:val="StringTok"/>
+        </w:rPr>
+        <w:t xml:space="preserve">'bayesian'</w:t>
+      </w:r>
+      <w:r>
+        <w:rPr>
+          <w:rStyle w:val="NormalTok"/>
+        </w:rPr>
+        <w:t xml:space="preserve">: bayesian_prediction</w:t>
+      </w:r>
+      <w:r>
+        <w:br/>
+      </w:r>
+      <w:r>
+        <w:rPr>
+          <w:rStyle w:val="NormalTok"/>
+        </w:rPr>
+        <w:t xml:space="preserve">    }</w:t>
+      </w:r>
+      <w:r>
+        <w:br/>
+      </w:r>
+      <w:r>
+        <w:rPr>
+          <w:rStyle w:val="NormalTok"/>
+        </w:rPr>
+        <w:t xml:space="preserve">    probabilities </w:t>
+      </w:r>
+      <w:r>
+        <w:rPr>
+          <w:rStyle w:val="OperatorTok"/>
+        </w:rPr>
+        <w:t xml:space="preserve">=</w:t>
+      </w:r>
+      <w:r>
+        <w:rPr>
+          <w:rStyle w:val="NormalTok"/>
+        </w:rPr>
+        <w:t xml:space="preserve"> [ml_probability, rule_probability, bayesian_probability]</w:t>
+      </w:r>
+      <w:r>
+        <w:br/>
+      </w:r>
+      <w:r>
+        <w:br/>
+      </w:r>
+      <w:r>
+        <w:rPr>
+          <w:rStyle w:val="NormalTok"/>
+        </w:rPr>
+        <w:t xml:space="preserve">    </w:t>
+      </w:r>
+      <w:r>
+        <w:rPr>
+          <w:rStyle w:val="CommentTok"/>
+        </w:rPr>
+        <w:t xml:space="preserve"># Count votes</w:t>
+      </w:r>
+      <w:r>
+        <w:br/>
+      </w:r>
+      <w:r>
+        <w:rPr>
+          <w:rStyle w:val="NormalTok"/>
+        </w:rPr>
+        <w:t xml:space="preserve">    votes </w:t>
+      </w:r>
+      <w:r>
+        <w:rPr>
+          <w:rStyle w:val="OperatorTok"/>
+        </w:rPr>
+        <w:t xml:space="preserve">=</w:t>
+      </w:r>
+      <w:r>
+        <w:rPr>
+          <w:rStyle w:val="NormalTok"/>
+        </w:rPr>
+        <w:t xml:space="preserve"> {}</w:t>
+      </w:r>
+      <w:r>
+        <w:br/>
+      </w:r>
+      <w:r>
+        <w:rPr>
+          <w:rStyle w:val="NormalTok"/>
+        </w:rPr>
+        <w:t xml:space="preserve">    </w:t>
+      </w:r>
+      <w:r>
+        <w:rPr>
+          <w:rStyle w:val="ControlFlowTok"/>
+        </w:rPr>
+        <w:t xml:space="preserve">for</w:t>
+      </w:r>
+      <w:r>
+        <w:rPr>
+          <w:rStyle w:val="NormalTok"/>
+        </w:rPr>
+        <w:t xml:space="preserve"> paradigm, pred </w:t>
+      </w:r>
+      <w:r>
+        <w:rPr>
+          <w:rStyle w:val="KeywordTok"/>
+        </w:rPr>
+        <w:t xml:space="preserve">in</w:t>
+      </w:r>
+      <w:r>
+        <w:rPr>
+          <w:rStyle w:val="NormalTok"/>
+        </w:rPr>
+        <w:t xml:space="preserve"> predictions.items():</w:t>
+      </w:r>
+      <w:r>
+        <w:br/>
+      </w:r>
+      <w:r>
+        <w:rPr>
+          <w:rStyle w:val="NormalTok"/>
+        </w:rPr>
+        <w:t xml:space="preserve">        votes[pred] </w:t>
+      </w:r>
+      <w:r>
+        <w:rPr>
+          <w:rStyle w:val="OperatorTok"/>
+        </w:rPr>
+        <w:t xml:space="preserve">=</w:t>
+      </w:r>
+      <w:r>
+        <w:rPr>
+          <w:rStyle w:val="NormalTok"/>
+        </w:rPr>
+        <w:t xml:space="preserve"> votes.get(pred, </w:t>
+      </w:r>
+      <w:r>
+        <w:rPr>
+          <w:rStyle w:val="DecValTok"/>
+        </w:rPr>
+        <w:t xml:space="preserve">0</w:t>
+      </w:r>
+      <w:r>
+        <w:rPr>
+          <w:rStyle w:val="NormalTok"/>
+        </w:rPr>
+        <w:t xml:space="preserve">) </w:t>
+      </w:r>
+      <w:r>
+        <w:rPr>
+          <w:rStyle w:val="OperatorTok"/>
+        </w:rPr>
+        <w:t xml:space="preserve">+</w:t>
+      </w:r>
+      <w:r>
+        <w:rPr>
+          <w:rStyle w:val="NormalTok"/>
+        </w:rPr>
+        <w:t xml:space="preserve"> </w:t>
+      </w:r>
+      <w:r>
+        <w:rPr>
+          <w:rStyle w:val="DecValTok"/>
+        </w:rPr>
+        <w:t xml:space="preserve">1</w:t>
+      </w:r>
+      <w:r>
+        <w:br/>
+      </w:r>
+      <w:r>
+        <w:br/>
+      </w:r>
+      <w:r>
+        <w:rPr>
+          <w:rStyle w:val="NormalTok"/>
+        </w:rPr>
+        <w:t xml:space="preserve">    </w:t>
+      </w:r>
+      <w:r>
+        <w:rPr>
+          <w:rStyle w:val="CommentTok"/>
+        </w:rPr>
+        <w:t xml:space="preserve"># Convert to binary for entropy calculation</w:t>
+      </w:r>
+      <w:r>
+        <w:br/>
+      </w:r>
+      <w:r>
+        <w:rPr>
+          <w:rStyle w:val="NormalTok"/>
+        </w:rPr>
+        <w:t xml:space="preserve">    binary_preds </w:t>
+      </w:r>
+      <w:r>
+        <w:rPr>
+          <w:rStyle w:val="OperatorTok"/>
+        </w:rPr>
+        <w:t xml:space="preserve">=</w:t>
+      </w:r>
+      <w:r>
+        <w:rPr>
+          <w:rStyle w:val="NormalTok"/>
+        </w:rPr>
+        <w:t xml:space="preserve"> [</w:t>
+      </w:r>
+      <w:r>
+        <w:rPr>
+          <w:rStyle w:val="DecValTok"/>
+        </w:rPr>
+        <w:t xml:space="preserve">1</w:t>
+      </w:r>
+      <w:r>
+        <w:rPr>
+          <w:rStyle w:val="NormalTok"/>
+        </w:rPr>
+        <w:t xml:space="preserve"> </w:t>
+      </w:r>
+      <w:r>
+        <w:rPr>
+          <w:rStyle w:val="ControlFlowTok"/>
+        </w:rPr>
+        <w:t xml:space="preserve">if</w:t>
+      </w:r>
+      <w:r>
+        <w:rPr>
+          <w:rStyle w:val="NormalTok"/>
+        </w:rPr>
+        <w:t xml:space="preserve"> pred </w:t>
+      </w:r>
+      <w:r>
+        <w:rPr>
+          <w:rStyle w:val="OperatorTok"/>
+        </w:rPr>
+        <w:t xml:space="preserve">==</w:t>
+      </w:r>
+      <w:r>
+        <w:rPr>
+          <w:rStyle w:val="NormalTok"/>
+        </w:rPr>
+        <w:t xml:space="preserve"> </w:t>
+      </w:r>
+      <w:r>
+        <w:rPr>
+          <w:rStyle w:val="StringTok"/>
+        </w:rPr>
+        <w:t xml:space="preserve">'phishing'</w:t>
+      </w:r>
+      <w:r>
+        <w:rPr>
+          <w:rStyle w:val="NormalTok"/>
+        </w:rPr>
+        <w:t xml:space="preserve"> </w:t>
+      </w:r>
+      <w:r>
+        <w:rPr>
+          <w:rStyle w:val="ControlFlowTok"/>
+        </w:rPr>
+        <w:t xml:space="preserve">else</w:t>
+      </w:r>
+      <w:r>
+        <w:rPr>
+          <w:rStyle w:val="NormalTok"/>
+        </w:rPr>
+        <w:t xml:space="preserve"> </w:t>
+      </w:r>
+      <w:r>
+        <w:rPr>
+          <w:rStyle w:val="DecValTok"/>
+        </w:rPr>
+        <w:t xml:space="preserve">0</w:t>
+      </w:r>
+      <w:r>
+        <w:br/>
+      </w:r>
+      <w:r>
+        <w:rPr>
+          <w:rStyle w:val="NormalTok"/>
+        </w:rPr>
+        <w:t xml:space="preserve">                   </w:t>
+      </w:r>
+      <w:r>
+        <w:rPr>
+          <w:rStyle w:val="ControlFlowTok"/>
+        </w:rPr>
+        <w:t xml:space="preserve">for</w:t>
+      </w:r>
+      <w:r>
+        <w:rPr>
+          <w:rStyle w:val="NormalTok"/>
+        </w:rPr>
+        <w:t xml:space="preserve"> pred </w:t>
+      </w:r>
+      <w:r>
+        <w:rPr>
+          <w:rStyle w:val="KeywordTok"/>
+        </w:rPr>
+        <w:t xml:space="preserve">in</w:t>
+      </w:r>
+      <w:r>
+        <w:rPr>
+          <w:rStyle w:val="NormalTok"/>
+        </w:rPr>
+        <w:t xml:space="preserve"> predictions.values()]</w:t>
+      </w:r>
+      <w:r>
+        <w:br/>
+      </w:r>
+      <w:r>
+        <w:br/>
+      </w:r>
+      <w:r>
+        <w:rPr>
+          <w:rStyle w:val="NormalTok"/>
+        </w:rPr>
+        <w:t xml:space="preserve">    </w:t>
+      </w:r>
+      <w:r>
+        <w:rPr>
+          <w:rStyle w:val="CommentTok"/>
+        </w:rPr>
+        <w:t xml:space="preserve"># C</w:t>
+      </w:r>
+    </w:p>
+    <w:p>
+      <w:pPr>
+        <w:pStyle w:val="FirstParagraph"/>
+      </w:pPr>
+      <w:r>
+        <w:rPr>
+          <w:b/>
+          <w:bCs/>
+        </w:rPr>
+        <w:t xml:space="preserve">Wagi paradygmatów (ML 0,5 / reguły 0,3 / Bayes 0,2)</w:t>
+      </w:r>
+      <w:r>
+        <w:t xml:space="preserve"> </w:t>
+      </w:r>
+      <w:r>
+        <w:t xml:space="preserve">(</w:t>
+      </w:r>
+      <w:r>
+        <w:rPr>
+          <w:rStyle w:val="VerbatimChar"/>
+        </w:rPr>
+        <w:t xml:space="preserve">src/paradigms/aggregation/weights.py</w:t>
+      </w:r>
+      <w:r>
+        <w:t xml:space="preserve">):</w:t>
+      </w:r>
+    </w:p>
+    <w:p>
+      <w:pPr>
+        <w:pStyle w:val="SourceCode"/>
+      </w:pPr>
+      <w:r>
+        <w:rPr>
+          <w:rStyle w:val="CommentTok"/>
+        </w:rPr>
+        <w:t xml:space="preserve">"""Paradigm weight management for multi-paradigm aggregation.</w:t>
+      </w:r>
+      <w:r>
+        <w:br/>
+      </w:r>
+      <w:r>
+        <w:br/>
+      </w:r>
+      <w:r>
+        <w:rPr>
+          <w:rStyle w:val="CommentTok"/>
+        </w:rPr>
+        <w:t xml:space="preserve">Default weights: ML ensemble (0.5), Rules (0.3), Bayesian (0.2)</w:t>
+      </w:r>
+      <w:r>
+        <w:br/>
+      </w:r>
+      <w:r>
+        <w:rPr>
+          <w:rStyle w:val="CommentTok"/>
+        </w:rPr>
+        <w:t xml:space="preserve">based on Phase 5 research recommendations.</w:t>
+      </w:r>
+      <w:r>
+        <w:br/>
+      </w:r>
+      <w:r>
+        <w:rPr>
+          <w:rStyle w:val="CommentTok"/>
+        </w:rPr>
+        <w:t xml:space="preserve">"""</w:t>
+      </w:r>
+      <w:r>
+        <w:br/>
+      </w:r>
+      <w:r>
+        <w:br/>
+      </w:r>
+      <w:r>
+        <w:rPr>
+          <w:rStyle w:val="ImportTok"/>
+        </w:rPr>
+        <w:t xml:space="preserve">from</w:t>
+      </w:r>
+      <w:r>
+        <w:rPr>
+          <w:rStyle w:val="NormalTok"/>
+        </w:rPr>
+        <w:t xml:space="preserve"> dataclasses </w:t>
+      </w:r>
+      <w:r>
+        <w:rPr>
+          <w:rStyle w:val="ImportTok"/>
+        </w:rPr>
+        <w:t xml:space="preserve">import</w:t>
+      </w:r>
+      <w:r>
+        <w:rPr>
+          <w:rStyle w:val="NormalTok"/>
+        </w:rPr>
+        <w:t xml:space="preserve"> dataclass, field</w:t>
+      </w:r>
+      <w:r>
+        <w:br/>
+      </w:r>
+      <w:r>
+        <w:rPr>
+          <w:rStyle w:val="ImportTok"/>
+        </w:rPr>
+        <w:t xml:space="preserve">from</w:t>
+      </w:r>
+      <w:r>
+        <w:rPr>
+          <w:rStyle w:val="NormalTok"/>
+        </w:rPr>
+        <w:t xml:space="preserve"> typing </w:t>
+      </w:r>
+      <w:r>
+        <w:rPr>
+          <w:rStyle w:val="ImportTok"/>
+        </w:rPr>
+        <w:t xml:space="preserve">import</w:t>
+      </w:r>
+      <w:r>
+        <w:rPr>
+          <w:rStyle w:val="NormalTok"/>
+        </w:rPr>
+        <w:t xml:space="preserve"> Dict</w:t>
+      </w:r>
+      <w:r>
+        <w:br/>
+      </w:r>
+      <w:r>
+        <w:br/>
+      </w:r>
+      <w:r>
+        <w:br/>
+      </w:r>
+      <w:r>
+        <w:rPr>
+          <w:rStyle w:val="AttributeTok"/>
+        </w:rPr>
+        <w:t xml:space="preserve">@dataclass</w:t>
+      </w:r>
+      <w:r>
+        <w:br/>
+      </w:r>
+      <w:r>
+        <w:rPr>
+          <w:rStyle w:val="KeywordTok"/>
+        </w:rPr>
+        <w:t xml:space="preserve">class</w:t>
+      </w:r>
+      <w:r>
+        <w:rPr>
+          <w:rStyle w:val="NormalTok"/>
+        </w:rPr>
+        <w:t xml:space="preserve"> ParadigmWeights:</w:t>
+      </w:r>
+      <w:r>
+        <w:br/>
+      </w:r>
+      <w:r>
+        <w:rPr>
+          <w:rStyle w:val="NormalTok"/>
+        </w:rPr>
+        <w:t xml:space="preserve">    </w:t>
+      </w:r>
+      <w:r>
+        <w:rPr>
+          <w:rStyle w:val="CommentTok"/>
+        </w:rPr>
+        <w:t xml:space="preserve">"""Configurable weights for paradigm aggregation.</w:t>
+      </w:r>
+      <w:r>
+        <w:br/>
+      </w:r>
+      <w:r>
+        <w:br/>
+      </w:r>
+      <w:r>
+        <w:rPr>
+          <w:rStyle w:val="CommentTok"/>
+        </w:rPr>
+        <w:t xml:space="preserve">    Weights must sum to 1.0 and stay within bounds:</w:t>
+      </w:r>
+      <w:r>
+        <w:br/>
+      </w:r>
+      <w:r>
+        <w:rPr>
+          <w:rStyle w:val="CommentTok"/>
+        </w:rPr>
+        <w:t xml:space="preserve">    - ML ensemble: 0.4-0.6 (dominant but not overwhelming)</w:t>
+      </w:r>
+      <w:r>
+        <w:br/>
+      </w:r>
+      <w:r>
+        <w:rPr>
+          <w:rStyle w:val="CommentTok"/>
+        </w:rPr>
+        <w:t xml:space="preserve">    - Rules: 0.2-0.4 (interpretable contribution)</w:t>
+      </w:r>
+      <w:r>
+        <w:br/>
+      </w:r>
+      <w:r>
+        <w:rPr>
+          <w:rStyle w:val="CommentTok"/>
+        </w:rPr>
+        <w:t xml:space="preserve">    - Bayesian: 0.1-0.3 (probabilistic complement)</w:t>
+      </w:r>
+      <w:r>
+        <w:br/>
+      </w:r>
+      <w:r>
+        <w:br/>
+      </w:r>
+      <w:r>
+        <w:rPr>
+          <w:rStyle w:val="CommentTok"/>
+        </w:rPr>
+        <w:t xml:space="preserve">    Attributes:</w:t>
+      </w:r>
+      <w:r>
+        <w:br/>
+      </w:r>
+      <w:r>
+        <w:rPr>
+          <w:rStyle w:val="CommentTok"/>
+        </w:rPr>
+        <w:t xml:space="preserve">        ml_ensemble: Weight for ML ensemble prediction</w:t>
+      </w:r>
+      <w:r>
+        <w:br/>
+      </w:r>
+      <w:r>
+        <w:rPr>
+          <w:rStyle w:val="CommentTok"/>
+        </w:rPr>
+        <w:t xml:space="preserve">        rules: Weight for rule-based system score</w:t>
+      </w:r>
+      <w:r>
+        <w:br/>
+      </w:r>
+      <w:r>
+        <w:rPr>
+          <w:rStyle w:val="CommentTok"/>
+        </w:rPr>
+        <w:t xml:space="preserve">        bayesian: Weight for Bayesian posterior</w:t>
+      </w:r>
+      <w:r>
+        <w:br/>
+      </w:r>
+      <w:r>
+        <w:rPr>
+          <w:rStyle w:val="CommentTok"/>
+        </w:rPr>
+        <w:t xml:space="preserve">    """</w:t>
+      </w:r>
+      <w:r>
+        <w:br/>
+      </w:r>
+      <w:r>
+        <w:br/>
+      </w:r>
+      <w:r>
+        <w:rPr>
+          <w:rStyle w:val="NormalTok"/>
+        </w:rPr>
+        <w:t xml:space="preserve">    ml_ensemble: </w:t>
+      </w:r>
+      <w:r>
+        <w:rPr>
+          <w:rStyle w:val="BuiltInTok"/>
+        </w:rPr>
+        <w:t xml:space="preserve">float</w:t>
+      </w:r>
+      <w:r>
+        <w:rPr>
+          <w:rStyle w:val="NormalTok"/>
+        </w:rPr>
+        <w:t xml:space="preserve"> </w:t>
+      </w:r>
+      <w:r>
+        <w:rPr>
+          <w:rStyle w:val="OperatorTok"/>
+        </w:rPr>
+        <w:t xml:space="preserve">=</w:t>
+      </w:r>
+      <w:r>
+        <w:rPr>
+          <w:rStyle w:val="NormalTok"/>
+        </w:rPr>
+        <w:t xml:space="preserve"> </w:t>
+      </w:r>
+      <w:r>
+        <w:rPr>
+          <w:rStyle w:val="FloatTok"/>
+        </w:rPr>
+        <w:t xml:space="preserve">0.5</w:t>
+      </w:r>
+      <w:r>
+        <w:br/>
+      </w:r>
+      <w:r>
+        <w:rPr>
+          <w:rStyle w:val="NormalTok"/>
+        </w:rPr>
+        <w:t xml:space="preserve">    rules: </w:t>
+      </w:r>
+      <w:r>
+        <w:rPr>
+          <w:rStyle w:val="BuiltInTok"/>
+        </w:rPr>
+        <w:t xml:space="preserve">float</w:t>
+      </w:r>
+      <w:r>
+        <w:rPr>
+          <w:rStyle w:val="NormalTok"/>
+        </w:rPr>
+        <w:t xml:space="preserve"> </w:t>
+      </w:r>
+      <w:r>
+        <w:rPr>
+          <w:rStyle w:val="OperatorTok"/>
+        </w:rPr>
+        <w:t xml:space="preserve">=</w:t>
+      </w:r>
+      <w:r>
+        <w:rPr>
+          <w:rStyle w:val="NormalTok"/>
+        </w:rPr>
+        <w:t xml:space="preserve"> </w:t>
+      </w:r>
+      <w:r>
+        <w:rPr>
+          <w:rStyle w:val="FloatTok"/>
+        </w:rPr>
+        <w:t xml:space="preserve">0.3</w:t>
+      </w:r>
+      <w:r>
+        <w:br/>
+      </w:r>
+      <w:r>
+        <w:rPr>
+          <w:rStyle w:val="NormalTok"/>
+        </w:rPr>
+        <w:t xml:space="preserve">    bayesian: </w:t>
+      </w:r>
+      <w:r>
+        <w:rPr>
+          <w:rStyle w:val="BuiltInTok"/>
+        </w:rPr>
+        <w:t xml:space="preserve">float</w:t>
+      </w:r>
+      <w:r>
+        <w:rPr>
+          <w:rStyle w:val="NormalTok"/>
+        </w:rPr>
+        <w:t xml:space="preserve"> </w:t>
+      </w:r>
+      <w:r>
+        <w:rPr>
+          <w:rStyle w:val="OperatorTok"/>
+        </w:rPr>
+        <w:t xml:space="preserve">=</w:t>
+      </w:r>
+      <w:r>
+        <w:rPr>
+          <w:rStyle w:val="NormalTok"/>
+        </w:rPr>
+        <w:t xml:space="preserve"> </w:t>
+      </w:r>
+      <w:r>
+        <w:rPr>
+          <w:rStyle w:val="FloatTok"/>
+        </w:rPr>
+        <w:t xml:space="preserve">0.2</w:t>
+      </w:r>
+      <w:r>
+        <w:br/>
+      </w:r>
+      <w:r>
+        <w:br/>
+      </w:r>
+      <w:r>
+        <w:rPr>
+          <w:rStyle w:val="NormalTok"/>
+        </w:rPr>
+        <w:t xml:space="preserve">    </w:t>
+      </w:r>
+      <w:r>
+        <w:rPr>
+          <w:rStyle w:val="KeywordTok"/>
+        </w:rPr>
+        <w:t xml:space="preserve">def</w:t>
+      </w:r>
+      <w:r>
+        <w:rPr>
+          <w:rStyle w:val="NormalTok"/>
+        </w:rPr>
+        <w:t xml:space="preserve"> __post_init__(</w:t>
+      </w:r>
+      <w:r>
+        <w:rPr>
+          <w:rStyle w:val="VariableTok"/>
+        </w:rPr>
+        <w:t xml:space="preserve">self</w:t>
+      </w:r>
+      <w:r>
+        <w:rPr>
+          <w:rStyle w:val="NormalTok"/>
+        </w:rPr>
+        <w:t xml:space="preserve">):</w:t>
+      </w:r>
+      <w:r>
+        <w:br/>
+      </w:r>
+      <w:r>
+        <w:rPr>
+          <w:rStyle w:val="NormalTok"/>
+        </w:rPr>
+        <w:t xml:space="preserve">        </w:t>
+      </w:r>
+      <w:r>
+        <w:rPr>
+          <w:rStyle w:val="CommentTok"/>
+        </w:rPr>
+        <w:t xml:space="preserve">"""Validate weights after initialization."""</w:t>
+      </w:r>
+      <w:r>
+        <w:br/>
+      </w:r>
+      <w:r>
+        <w:rPr>
+          <w:rStyle w:val="NormalTok"/>
+        </w:rPr>
+        <w:t xml:space="preserve">        </w:t>
+      </w:r>
+      <w:r>
+        <w:rPr>
+          <w:rStyle w:val="VariableTok"/>
+        </w:rPr>
+        <w:t xml:space="preserve">self</w:t>
+      </w:r>
+      <w:r>
+        <w:rPr>
+          <w:rStyle w:val="NormalTok"/>
+        </w:rPr>
+        <w:t xml:space="preserve">._validate()</w:t>
+      </w:r>
+      <w:r>
+        <w:br/>
+      </w:r>
+      <w:r>
+        <w:br/>
+      </w:r>
+      <w:r>
+        <w:rPr>
+          <w:rStyle w:val="NormalTok"/>
+        </w:rPr>
+        <w:t xml:space="preserve">    </w:t>
+      </w:r>
+      <w:r>
+        <w:rPr>
+          <w:rStyle w:val="KeywordTok"/>
+        </w:rPr>
+        <w:t xml:space="preserve">def</w:t>
+      </w:r>
+      <w:r>
+        <w:rPr>
+          <w:rStyle w:val="NormalTok"/>
+        </w:rPr>
+        <w:t xml:space="preserve"> _validate(</w:t>
+      </w:r>
+      <w:r>
+        <w:rPr>
+          <w:rStyle w:val="VariableTok"/>
+        </w:rPr>
+        <w:t xml:space="preserve">self</w:t>
+      </w:r>
+      <w:r>
+        <w:rPr>
+          <w:rStyle w:val="NormalTok"/>
+        </w:rPr>
+        <w:t xml:space="preserve">):</w:t>
+      </w:r>
+      <w:r>
+        <w:br/>
+      </w:r>
+      <w:r>
+        <w:rPr>
+          <w:rStyle w:val="NormalTok"/>
+        </w:rPr>
+        <w:t xml:space="preserve">        </w:t>
+      </w:r>
+      <w:r>
+        <w:rPr>
+          <w:rStyle w:val="CommentTok"/>
+        </w:rPr>
+        <w:t xml:space="preserve">"""Ensure weights sum to 1.0 and are in valid ranges."""</w:t>
+      </w:r>
+      <w:r>
+        <w:br/>
+      </w:r>
+      <w:r>
+        <w:rPr>
+          <w:rStyle w:val="NormalTok"/>
+        </w:rPr>
+        <w:t xml:space="preserve">        total </w:t>
+      </w:r>
+      <w:r>
+        <w:rPr>
+          <w:rStyle w:val="OperatorTok"/>
+        </w:rPr>
+        <w:t xml:space="preserve">=</w:t>
+      </w:r>
+      <w:r>
+        <w:rPr>
+          <w:rStyle w:val="NormalTok"/>
+        </w:rPr>
+        <w:t xml:space="preserve"> </w:t>
+      </w:r>
+      <w:r>
+        <w:rPr>
+          <w:rStyle w:val="VariableTok"/>
+        </w:rPr>
+        <w:t xml:space="preserve">self</w:t>
+      </w:r>
+      <w:r>
+        <w:rPr>
+          <w:rStyle w:val="NormalTok"/>
+        </w:rPr>
+        <w:t xml:space="preserve">.ml_ensemble </w:t>
+      </w:r>
+      <w:r>
+        <w:rPr>
+          <w:rStyle w:val="OperatorTok"/>
+        </w:rPr>
+        <w:t xml:space="preserve">+</w:t>
+      </w:r>
+      <w:r>
+        <w:rPr>
+          <w:rStyle w:val="NormalTok"/>
+        </w:rPr>
+        <w:t xml:space="preserve"> </w:t>
+      </w:r>
+      <w:r>
+        <w:rPr>
+          <w:rStyle w:val="VariableTok"/>
+        </w:rPr>
+        <w:t xml:space="preserve">self</w:t>
+      </w:r>
+      <w:r>
+        <w:rPr>
+          <w:rStyle w:val="NormalTok"/>
+        </w:rPr>
+        <w:t xml:space="preserve">.rules </w:t>
+      </w:r>
+      <w:r>
+        <w:rPr>
+          <w:rStyle w:val="OperatorTok"/>
+        </w:rPr>
+        <w:t xml:space="preserve">+</w:t>
+      </w:r>
+      <w:r>
+        <w:rPr>
+          <w:rStyle w:val="NormalTok"/>
+        </w:rPr>
+        <w:t xml:space="preserve"> </w:t>
+      </w:r>
+      <w:r>
+        <w:rPr>
+          <w:rStyle w:val="VariableTok"/>
+        </w:rPr>
+        <w:t xml:space="preserve">self</w:t>
+      </w:r>
+      <w:r>
+        <w:rPr>
+          <w:rStyle w:val="NormalTok"/>
+        </w:rPr>
+        <w:t xml:space="preserve">.bayesian</w:t>
+      </w:r>
+      <w:r>
+        <w:br/>
+      </w:r>
+      <w:r>
+        <w:rPr>
+          <w:rStyle w:val="NormalTok"/>
+        </w:rPr>
+        <w:t xml:space="preserve">        </w:t>
+      </w:r>
+      <w:r>
+        <w:rPr>
+          <w:rStyle w:val="ControlFlowTok"/>
+        </w:rPr>
+        <w:t xml:space="preserve">if</w:t>
+      </w:r>
+      <w:r>
+        <w:rPr>
+          <w:rStyle w:val="NormalTok"/>
+        </w:rPr>
+        <w:t xml:space="preserve"> </w:t>
+      </w:r>
+      <w:r>
+        <w:rPr>
+          <w:rStyle w:val="BuiltInTok"/>
+        </w:rPr>
+        <w:t xml:space="preserve">abs</w:t>
+      </w:r>
+      <w:r>
+        <w:rPr>
+          <w:rStyle w:val="NormalTok"/>
+        </w:rPr>
+        <w:t xml:space="preserve">(total </w:t>
+      </w:r>
+      <w:r>
+        <w:rPr>
+          <w:rStyle w:val="OperatorTok"/>
+        </w:rPr>
+        <w:t xml:space="preserve">-</w:t>
+      </w:r>
+      <w:r>
+        <w:rPr>
+          <w:rStyle w:val="NormalTok"/>
+        </w:rPr>
+        <w:t xml:space="preserve"> </w:t>
+      </w:r>
+      <w:r>
+        <w:rPr>
+          <w:rStyle w:val="FloatTok"/>
+        </w:rPr>
+        <w:t xml:space="preserve">1.0</w:t>
+      </w:r>
+      <w:r>
+        <w:rPr>
+          <w:rStyle w:val="NormalTok"/>
+        </w:rPr>
+        <w:t xml:space="preserve">) </w:t>
+      </w:r>
+      <w:r>
+        <w:rPr>
+          <w:rStyle w:val="OperatorTok"/>
+        </w:rPr>
+        <w:t xml:space="preserve">&gt;</w:t>
+      </w:r>
+      <w:r>
+        <w:rPr>
+          <w:rStyle w:val="NormalTok"/>
+        </w:rPr>
+        <w:t xml:space="preserve"> </w:t>
+      </w:r>
+      <w:r>
+        <w:rPr>
+          <w:rStyle w:val="FloatTok"/>
+        </w:rPr>
+        <w:t xml:space="preserve">1e-6</w:t>
+      </w:r>
+      <w:r>
+        <w:rPr>
+          <w:rStyle w:val="NormalTok"/>
+        </w:rPr>
+        <w:t xml:space="preserve">:</w:t>
+      </w:r>
+      <w:r>
+        <w:br/>
+      </w:r>
+      <w:r>
+        <w:rPr>
+          <w:rStyle w:val="NormalTok"/>
+        </w:rPr>
+        <w:t xml:space="preserve">            </w:t>
+      </w:r>
+      <w:r>
+        <w:rPr>
+          <w:rStyle w:val="ControlFlowTok"/>
+        </w:rPr>
+        <w:t xml:space="preserve">raise</w:t>
+      </w:r>
+      <w:r>
+        <w:rPr>
+          <w:rStyle w:val="NormalTok"/>
+        </w:rPr>
+        <w:t xml:space="preserve"> </w:t>
+      </w:r>
+      <w:r>
+        <w:rPr>
+          <w:rStyle w:val="PreprocessorTok"/>
+        </w:rPr>
+        <w:t xml:space="preserve">ValueError</w:t>
+      </w:r>
+      <w:r>
+        <w:rPr>
+          <w:rStyle w:val="NormalTok"/>
+        </w:rPr>
+        <w:t xml:space="preserve">(</w:t>
+      </w:r>
+      <w:r>
+        <w:br/>
+      </w:r>
+      <w:r>
+        <w:rPr>
+          <w:rStyle w:val="NormalTok"/>
+        </w:rPr>
+        <w:t xml:space="preserve">                </w:t>
+      </w:r>
+      <w:r>
+        <w:rPr>
+          <w:rStyle w:val="SpecialStringTok"/>
+        </w:rPr>
+        <w:t xml:space="preserve">f"Weights must sum to 1.0, got </w:t>
+      </w:r>
+      <w:r>
+        <w:rPr>
+          <w:rStyle w:val="SpecialCharTok"/>
+        </w:rPr>
+        <w:t xml:space="preserve">{</w:t>
+      </w:r>
+      <w:r>
+        <w:rPr>
+          <w:rStyle w:val="NormalTok"/>
+        </w:rPr>
+        <w:t xml:space="preserve">total</w:t>
+      </w:r>
+      <w:r>
+        <w:rPr>
+          <w:rStyle w:val="SpecialCharTok"/>
+        </w:rPr>
+        <w:t xml:space="preserve">:.4f}</w:t>
+      </w:r>
+      <w:r>
+        <w:rPr>
+          <w:rStyle w:val="SpecialStringTok"/>
+        </w:rPr>
+        <w:t xml:space="preserve">. "</w:t>
+      </w:r>
+      <w:r>
+        <w:br/>
+      </w:r>
+      <w:r>
+        <w:rPr>
+          <w:rStyle w:val="NormalTok"/>
+        </w:rPr>
+        <w:t xml:space="preserve">                </w:t>
+      </w:r>
+      <w:r>
+        <w:rPr>
+          <w:rStyle w:val="SpecialStringTok"/>
+        </w:rPr>
+        <w:t xml:space="preserve">f"ML=</w:t>
+      </w:r>
+      <w:r>
+        <w:rPr>
+          <w:rStyle w:val="SpecialCharTok"/>
+        </w:rPr>
+        <w:t xml:space="preserve">{</w:t>
+      </w:r>
+      <w:r>
+        <w:rPr>
+          <w:rStyle w:val="VariableTok"/>
+        </w:rPr>
+        <w:t xml:space="preserve">self</w:t>
+      </w:r>
+      <w:r>
+        <w:rPr>
+          <w:rStyle w:val="SpecialCharTok"/>
+        </w:rPr>
+        <w:t xml:space="preserve">.</w:t>
+      </w:r>
+      <w:r>
+        <w:rPr>
+          <w:rStyle w:val="NormalTok"/>
+        </w:rPr>
+        <w:t xml:space="preserve">ml_ensemble</w:t>
+      </w:r>
+      <w:r>
+        <w:rPr>
+          <w:rStyle w:val="SpecialCharTok"/>
+        </w:rPr>
+        <w:t xml:space="preserve">}</w:t>
+      </w:r>
+      <w:r>
+        <w:rPr>
+          <w:rStyle w:val="SpecialStringTok"/>
+        </w:rPr>
+        <w:t xml:space="preserve">, Rules=</w:t>
+      </w:r>
+      <w:r>
+        <w:rPr>
+          <w:rStyle w:val="SpecialCharTok"/>
+        </w:rPr>
+        <w:t xml:space="preserve">{</w:t>
+      </w:r>
+      <w:r>
+        <w:rPr>
+          <w:rStyle w:val="VariableTok"/>
+        </w:rPr>
+        <w:t xml:space="preserve">self</w:t>
+      </w:r>
+      <w:r>
+        <w:rPr>
+          <w:rStyle w:val="SpecialCharTok"/>
+        </w:rPr>
+        <w:t xml:space="preserve">.</w:t>
+      </w:r>
+      <w:r>
+        <w:rPr>
+          <w:rStyle w:val="NormalTok"/>
+        </w:rPr>
+        <w:t xml:space="preserve">rules</w:t>
+      </w:r>
+      <w:r>
+        <w:rPr>
+          <w:rStyle w:val="SpecialCharTok"/>
+        </w:rPr>
+        <w:t xml:space="preserve">}</w:t>
+      </w:r>
+      <w:r>
+        <w:rPr>
+          <w:rStyle w:val="SpecialStringTok"/>
+        </w:rPr>
+        <w:t xml:space="preserve">, Bayesian=</w:t>
+      </w:r>
+      <w:r>
+        <w:rPr>
+          <w:rStyle w:val="SpecialCharTok"/>
+        </w:rPr>
+        <w:t xml:space="preserve">{</w:t>
+      </w:r>
+      <w:r>
+        <w:rPr>
+          <w:rStyle w:val="VariableTok"/>
+        </w:rPr>
+        <w:t xml:space="preserve">self</w:t>
+      </w:r>
+      <w:r>
+        <w:rPr>
+          <w:rStyle w:val="SpecialCharTok"/>
+        </w:rPr>
+        <w:t xml:space="preserve">.</w:t>
+      </w:r>
+      <w:r>
+        <w:rPr>
+          <w:rStyle w:val="NormalTok"/>
+        </w:rPr>
+        <w:t xml:space="preserve">bayesian</w:t>
+      </w:r>
+      <w:r>
+        <w:rPr>
+          <w:rStyle w:val="SpecialCharTok"/>
+        </w:rPr>
+        <w:t xml:space="preserve">}</w:t>
+      </w:r>
+      <w:r>
+        <w:rPr>
+          <w:rStyle w:val="SpecialStringTok"/>
+        </w:rPr>
+        <w:t xml:space="preserve">"</w:t>
+      </w:r>
+      <w:r>
+        <w:br/>
+      </w:r>
+      <w:r>
+        <w:rPr>
+          <w:rStyle w:val="NormalTok"/>
+        </w:rPr>
+        <w:t xml:space="preserve">            )</w:t>
+      </w:r>
+      <w:r>
+        <w:br/>
+      </w:r>
+      <w:r>
+        <w:br/>
+      </w:r>
+      <w:r>
+        <w:rPr>
+          <w:rStyle w:val="NormalTok"/>
+        </w:rPr>
+        <w:t xml:space="preserve">        </w:t>
+      </w:r>
+      <w:r>
+        <w:rPr>
+          <w:rStyle w:val="CommentTok"/>
+        </w:rPr>
+        <w:t xml:space="preserve"># Bound validation (soft warning, not error)</w:t>
+      </w:r>
+      <w:r>
+        <w:br/>
+      </w:r>
+      <w:r>
+        <w:rPr>
+          <w:rStyle w:val="NormalTok"/>
+        </w:rPr>
+        <w:t xml:space="preserve">        </w:t>
+      </w:r>
+      <w:r>
+        <w:rPr>
+          <w:rStyle w:val="ControlFlowTok"/>
+        </w:rPr>
+        <w:t xml:space="preserve">if</w:t>
+      </w:r>
+      <w:r>
+        <w:rPr>
+          <w:rStyle w:val="NormalTok"/>
+        </w:rPr>
+        <w:t xml:space="preserve"> </w:t>
+      </w:r>
+      <w:r>
+        <w:rPr>
+          <w:rStyle w:val="KeywordTok"/>
+        </w:rPr>
+        <w:t xml:space="preserve">not</w:t>
+      </w:r>
+      <w:r>
+        <w:rPr>
+          <w:rStyle w:val="NormalTok"/>
+        </w:rPr>
+        <w:t xml:space="preserve"> (</w:t>
+      </w:r>
+      <w:r>
+        <w:rPr>
+          <w:rStyle w:val="FloatTok"/>
+        </w:rPr>
+        <w:t xml:space="preserve">0.4</w:t>
+      </w:r>
+      <w:r>
+        <w:rPr>
+          <w:rStyle w:val="NormalTok"/>
+        </w:rPr>
+        <w:t xml:space="preserve"> </w:t>
+      </w:r>
+      <w:r>
+        <w:rPr>
+          <w:rStyle w:val="OperatorTok"/>
+        </w:rPr>
+        <w:t xml:space="preserve">&lt;=</w:t>
+      </w:r>
+      <w:r>
+        <w:rPr>
+          <w:rStyle w:val="NormalTok"/>
+        </w:rPr>
+        <w:t xml:space="preserve"> </w:t>
+      </w:r>
+      <w:r>
+        <w:rPr>
+          <w:rStyle w:val="VariableTok"/>
+        </w:rPr>
+        <w:t xml:space="preserve">self</w:t>
+      </w:r>
+      <w:r>
+        <w:rPr>
+          <w:rStyle w:val="NormalTok"/>
+        </w:rPr>
+        <w:t xml:space="preserve">.ml_ensemble </w:t>
+      </w:r>
+      <w:r>
+        <w:rPr>
+          <w:rStyle w:val="OperatorTok"/>
+        </w:rPr>
+        <w:t xml:space="preserve">&lt;=</w:t>
+      </w:r>
+      <w:r>
+        <w:rPr>
+          <w:rStyle w:val="NormalTok"/>
+        </w:rPr>
+        <w:t xml:space="preserve"> </w:t>
+      </w:r>
+      <w:r>
+        <w:rPr>
+          <w:rStyle w:val="FloatTok"/>
+        </w:rPr>
+        <w:t xml:space="preserve">0.6</w:t>
+      </w:r>
+      <w:r>
+        <w:rPr>
+          <w:rStyle w:val="NormalTok"/>
+        </w:rPr>
+        <w:t xml:space="preserve">):</w:t>
+      </w:r>
+      <w:r>
+        <w:br/>
+      </w:r>
+      <w:r>
+        <w:rPr>
+          <w:rStyle w:val="NormalTok"/>
+        </w:rPr>
+        <w:t xml:space="preserve">            </w:t>
+      </w:r>
+      <w:r>
+        <w:rPr>
+          <w:rStyle w:val="ImportTok"/>
+        </w:rPr>
+        <w:t xml:space="preserve">import</w:t>
+      </w:r>
+      <w:r>
+        <w:rPr>
+          <w:rStyle w:val="NormalTok"/>
+        </w:rPr>
+        <w:t xml:space="preserve"> warnings</w:t>
+      </w:r>
+      <w:r>
+        <w:br/>
+      </w:r>
+      <w:r>
+        <w:rPr>
+          <w:rStyle w:val="NormalTok"/>
+        </w:rPr>
+        <w:t xml:space="preserve">            warnings.warn(</w:t>
+      </w:r>
+      <w:r>
+        <w:br/>
+      </w:r>
+      <w:r>
+        <w:rPr>
+          <w:rStyle w:val="NormalTok"/>
+        </w:rPr>
+        <w:t xml:space="preserve">                </w:t>
+      </w:r>
+      <w:r>
+        <w:rPr>
+          <w:rStyle w:val="SpecialStringTok"/>
+        </w:rPr>
+        <w:t xml:space="preserve">f"ML ensemble weight </w:t>
+      </w:r>
+      <w:r>
+        <w:rPr>
+          <w:rStyle w:val="SpecialCharTok"/>
+        </w:rPr>
+        <w:t xml:space="preserve">{</w:t>
+      </w:r>
+      <w:r>
+        <w:rPr>
+          <w:rStyle w:val="VariableTok"/>
+        </w:rPr>
+        <w:t xml:space="preserve">self</w:t>
+      </w:r>
+      <w:r>
+        <w:rPr>
+          <w:rStyle w:val="SpecialCharTok"/>
+        </w:rPr>
+        <w:t xml:space="preserve">.</w:t>
+      </w:r>
+      <w:r>
+        <w:rPr>
+          <w:rStyle w:val="NormalTok"/>
+        </w:rPr>
+        <w:t xml:space="preserve">ml_ensemble</w:t>
+      </w:r>
+      <w:r>
+        <w:rPr>
+          <w:rStyle w:val="SpecialCharTok"/>
+        </w:rPr>
+        <w:t xml:space="preserve">}</w:t>
+      </w:r>
+      <w:r>
+        <w:rPr>
+          <w:rStyle w:val="SpecialStringTok"/>
+        </w:rPr>
+        <w:t xml:space="preserve"> outside recommended range [0.4, 0.6]"</w:t>
+      </w:r>
+      <w:r>
+        <w:br/>
+      </w:r>
+      <w:r>
+        <w:rPr>
+          <w:rStyle w:val="NormalTok"/>
+        </w:rPr>
+        <w:t xml:space="preserve">            )</w:t>
+      </w:r>
+      <w:r>
+        <w:br/>
+      </w:r>
+      <w:r>
+        <w:rPr>
+          <w:rStyle w:val="NormalTok"/>
+        </w:rPr>
+        <w:t xml:space="preserve">        </w:t>
+      </w:r>
+      <w:r>
+        <w:rPr>
+          <w:rStyle w:val="ControlFlowTok"/>
+        </w:rPr>
+        <w:t xml:space="preserve">if</w:t>
+      </w:r>
+      <w:r>
+        <w:rPr>
+          <w:rStyle w:val="NormalTok"/>
+        </w:rPr>
+        <w:t xml:space="preserve"> </w:t>
+      </w:r>
+      <w:r>
+        <w:rPr>
+          <w:rStyle w:val="KeywordTok"/>
+        </w:rPr>
+        <w:t xml:space="preserve">not</w:t>
+      </w:r>
+      <w:r>
+        <w:rPr>
+          <w:rStyle w:val="NormalTok"/>
+        </w:rPr>
+        <w:t xml:space="preserve"> (</w:t>
+      </w:r>
+      <w:r>
+        <w:rPr>
+          <w:rStyle w:val="FloatTok"/>
+        </w:rPr>
+        <w:t xml:space="preserve">0.2</w:t>
+      </w:r>
+      <w:r>
+        <w:rPr>
+          <w:rStyle w:val="NormalTok"/>
+        </w:rPr>
+        <w:t xml:space="preserve"> </w:t>
+      </w:r>
+      <w:r>
+        <w:rPr>
+          <w:rStyle w:val="OperatorTok"/>
+        </w:rPr>
+        <w:t xml:space="preserve">&lt;=</w:t>
+      </w:r>
+      <w:r>
+        <w:rPr>
+          <w:rStyle w:val="NormalTok"/>
+        </w:rPr>
+        <w:t xml:space="preserve"> </w:t>
+      </w:r>
+      <w:r>
+        <w:rPr>
+          <w:rStyle w:val="VariableTok"/>
+        </w:rPr>
+        <w:t xml:space="preserve">self</w:t>
+      </w:r>
+      <w:r>
+        <w:rPr>
+          <w:rStyle w:val="NormalTok"/>
+        </w:rPr>
+        <w:t xml:space="preserve">.rules </w:t>
+      </w:r>
+      <w:r>
+        <w:rPr>
+          <w:rStyle w:val="OperatorTok"/>
+        </w:rPr>
+        <w:t xml:space="preserve">&lt;=</w:t>
+      </w:r>
+      <w:r>
+        <w:rPr>
+          <w:rStyle w:val="NormalTok"/>
+        </w:rPr>
+        <w:t xml:space="preserve"> </w:t>
+      </w:r>
+      <w:r>
+        <w:rPr>
+          <w:rStyle w:val="FloatTok"/>
+        </w:rPr>
+        <w:t xml:space="preserve">0.4</w:t>
+      </w:r>
+      <w:r>
+        <w:rPr>
+          <w:rStyle w:val="NormalTok"/>
+        </w:rPr>
+        <w:t xml:space="preserve">):</w:t>
+      </w:r>
+      <w:r>
+        <w:br/>
+      </w:r>
+      <w:r>
+        <w:rPr>
+          <w:rStyle w:val="NormalTok"/>
+        </w:rPr>
+        <w:t xml:space="preserve">            </w:t>
+      </w:r>
+      <w:r>
+        <w:rPr>
+          <w:rStyle w:val="ImportTok"/>
+        </w:rPr>
+        <w:t xml:space="preserve">import</w:t>
+      </w:r>
+      <w:r>
+        <w:rPr>
+          <w:rStyle w:val="NormalTok"/>
+        </w:rPr>
+        <w:t xml:space="preserve"> warnings</w:t>
+      </w:r>
+      <w:r>
+        <w:br/>
+      </w:r>
+      <w:r>
+        <w:rPr>
+          <w:rStyle w:val="NormalTok"/>
+        </w:rPr>
+        <w:t xml:space="preserve">            warnings.warn(</w:t>
+      </w:r>
+      <w:r>
+        <w:br/>
+      </w:r>
+      <w:r>
+        <w:rPr>
+          <w:rStyle w:val="NormalTok"/>
+        </w:rPr>
+        <w:t xml:space="preserve">                </w:t>
+      </w:r>
+      <w:r>
+        <w:rPr>
+          <w:rStyle w:val="SpecialStringTok"/>
+        </w:rPr>
+        <w:t xml:space="preserve">f"Rules weight </w:t>
+      </w:r>
+      <w:r>
+        <w:rPr>
+          <w:rStyle w:val="SpecialCharTok"/>
+        </w:rPr>
+        <w:t xml:space="preserve">{</w:t>
+      </w:r>
+      <w:r>
+        <w:rPr>
+          <w:rStyle w:val="VariableTok"/>
+        </w:rPr>
+        <w:t xml:space="preserve">self</w:t>
+      </w:r>
+      <w:r>
+        <w:rPr>
+          <w:rStyle w:val="SpecialCharTok"/>
+        </w:rPr>
+        <w:t xml:space="preserve">.</w:t>
+      </w:r>
+      <w:r>
+        <w:rPr>
+          <w:rStyle w:val="NormalTok"/>
+        </w:rPr>
+        <w:t xml:space="preserve">rules</w:t>
+      </w:r>
+      <w:r>
+        <w:rPr>
+          <w:rStyle w:val="SpecialCharTok"/>
+        </w:rPr>
+        <w:t xml:space="preserve">}</w:t>
+      </w:r>
+      <w:r>
+        <w:rPr>
+          <w:rStyle w:val="SpecialStringTok"/>
+        </w:rPr>
+        <w:t xml:space="preserve"> outside recommended range [0.2, 0.4]"</w:t>
+      </w:r>
+      <w:r>
+        <w:br/>
+      </w:r>
+      <w:r>
+        <w:rPr>
+          <w:rStyle w:val="NormalTok"/>
+        </w:rPr>
+        <w:t xml:space="preserve">            )</w:t>
+      </w:r>
+      <w:r>
+        <w:br/>
+      </w:r>
+      <w:r>
+        <w:rPr>
+          <w:rStyle w:val="NormalTok"/>
+        </w:rPr>
+        <w:t xml:space="preserve">        </w:t>
+      </w:r>
+      <w:r>
+        <w:rPr>
+          <w:rStyle w:val="ControlFlowTok"/>
+        </w:rPr>
+        <w:t xml:space="preserve">if</w:t>
+      </w:r>
+      <w:r>
+        <w:rPr>
+          <w:rStyle w:val="NormalTok"/>
+        </w:rPr>
+        <w:t xml:space="preserve"> </w:t>
+      </w:r>
+      <w:r>
+        <w:rPr>
+          <w:rStyle w:val="KeywordTok"/>
+        </w:rPr>
+        <w:t xml:space="preserve">not</w:t>
+      </w:r>
+      <w:r>
+        <w:rPr>
+          <w:rStyle w:val="NormalTok"/>
+        </w:rPr>
+        <w:t xml:space="preserve"> (</w:t>
+      </w:r>
+      <w:r>
+        <w:rPr>
+          <w:rStyle w:val="FloatTok"/>
+        </w:rPr>
+        <w:t xml:space="preserve">0.1</w:t>
+      </w:r>
+      <w:r>
+        <w:rPr>
+          <w:rStyle w:val="NormalTok"/>
+        </w:rPr>
+        <w:t xml:space="preserve"> </w:t>
+      </w:r>
+      <w:r>
+        <w:rPr>
+          <w:rStyle w:val="OperatorTok"/>
+        </w:rPr>
+        <w:t xml:space="preserve">&lt;=</w:t>
+      </w:r>
+      <w:r>
+        <w:rPr>
+          <w:rStyle w:val="NormalTok"/>
+        </w:rPr>
+        <w:t xml:space="preserve"> </w:t>
+      </w:r>
+      <w:r>
+        <w:rPr>
+          <w:rStyle w:val="VariableTok"/>
+        </w:rPr>
+        <w:t xml:space="preserve">self</w:t>
+      </w:r>
+      <w:r>
+        <w:rPr>
+          <w:rStyle w:val="NormalTok"/>
+        </w:rPr>
+        <w:t xml:space="preserve">.bayesian </w:t>
+      </w:r>
+      <w:r>
+        <w:rPr>
+          <w:rStyle w:val="OperatorTok"/>
+        </w:rPr>
+        <w:t xml:space="preserve">&lt;=</w:t>
+      </w:r>
+      <w:r>
+        <w:rPr>
+          <w:rStyle w:val="NormalTok"/>
+        </w:rPr>
+        <w:t xml:space="preserve"> </w:t>
+      </w:r>
+      <w:r>
+        <w:rPr>
+          <w:rStyle w:val="FloatTok"/>
+        </w:rPr>
+        <w:t xml:space="preserve">0.3</w:t>
+      </w:r>
+      <w:r>
+        <w:rPr>
+          <w:rStyle w:val="NormalTok"/>
+        </w:rPr>
+        <w:t xml:space="preserve">):</w:t>
+      </w:r>
+      <w:r>
+        <w:br/>
+      </w:r>
+      <w:r>
+        <w:rPr>
+          <w:rStyle w:val="NormalTok"/>
+        </w:rPr>
+        <w:t xml:space="preserve">            </w:t>
+      </w:r>
+      <w:r>
+        <w:rPr>
+          <w:rStyle w:val="ImportTok"/>
+        </w:rPr>
+        <w:t xml:space="preserve">import</w:t>
+      </w:r>
+      <w:r>
+        <w:rPr>
+          <w:rStyle w:val="NormalTok"/>
+        </w:rPr>
+        <w:t xml:space="preserve"> warnings</w:t>
+      </w:r>
+      <w:r>
+        <w:br/>
+      </w:r>
+      <w:r>
+        <w:rPr>
+          <w:rStyle w:val="NormalTok"/>
+        </w:rPr>
+        <w:t xml:space="preserve">            warnings.warn(</w:t>
+      </w:r>
+      <w:r>
+        <w:br/>
+      </w:r>
+      <w:r>
+        <w:rPr>
+          <w:rStyle w:val="NormalTok"/>
+        </w:rPr>
+        <w:t xml:space="preserve">                </w:t>
+      </w:r>
+      <w:r>
+        <w:rPr>
+          <w:rStyle w:val="SpecialStringTok"/>
+        </w:rPr>
+        <w:t xml:space="preserve">f"Bayesian weight </w:t>
+      </w:r>
+      <w:r>
+        <w:rPr>
+          <w:rStyle w:val="SpecialCharTok"/>
+        </w:rPr>
+        <w:t xml:space="preserve">{</w:t>
+      </w:r>
+      <w:r>
+        <w:rPr>
+          <w:rStyle w:val="VariableTok"/>
+        </w:rPr>
+        <w:t xml:space="preserve">self</w:t>
+      </w:r>
+      <w:r>
+        <w:rPr>
+          <w:rStyle w:val="SpecialCharTok"/>
+        </w:rPr>
+        <w:t xml:space="preserve">.</w:t>
+      </w:r>
+      <w:r>
+        <w:rPr>
+          <w:rStyle w:val="NormalTok"/>
+        </w:rPr>
+        <w:t xml:space="preserve">bayesian</w:t>
+      </w:r>
+      <w:r>
+        <w:rPr>
+          <w:rStyle w:val="SpecialCharTok"/>
+        </w:rPr>
+        <w:t xml:space="preserve">}</w:t>
+      </w:r>
+      <w:r>
+        <w:rPr>
+          <w:rStyle w:val="SpecialStringTok"/>
+        </w:rPr>
+        <w:t xml:space="preserve"> outside recommended range [0.1, 0.3]"</w:t>
+      </w:r>
+      <w:r>
+        <w:br/>
+      </w:r>
+      <w:r>
+        <w:rPr>
+          <w:rStyle w:val="NormalTok"/>
+        </w:rPr>
+        <w:t xml:space="preserve">            )</w:t>
+      </w:r>
+      <w:r>
+        <w:br/>
+      </w:r>
+      <w:r>
+        <w:br/>
+      </w:r>
+      <w:r>
+        <w:rPr>
+          <w:rStyle w:val="NormalTok"/>
+        </w:rPr>
+        <w:t xml:space="preserve">    </w:t>
+      </w:r>
+      <w:r>
+        <w:rPr>
+          <w:rStyle w:val="KeywordTok"/>
+        </w:rPr>
+        <w:t xml:space="preserve">def</w:t>
+      </w:r>
+      <w:r>
+        <w:rPr>
+          <w:rStyle w:val="NormalTok"/>
+        </w:rPr>
+        <w:t xml:space="preserve"> to_dict(</w:t>
+      </w:r>
+      <w:r>
+        <w:rPr>
+          <w:rStyle w:val="VariableTok"/>
+        </w:rPr>
+        <w:t xml:space="preserve">self</w:t>
+      </w:r>
+      <w:r>
+        <w:rPr>
+          <w:rStyle w:val="NormalTok"/>
+        </w:rPr>
+        <w:t xml:space="preserve">) </w:t>
+      </w:r>
+      <w:r>
+        <w:rPr>
+          <w:rStyle w:val="OperatorTok"/>
+        </w:rPr>
+        <w:t xml:space="preserve">-&gt;</w:t>
+      </w:r>
+      <w:r>
+        <w:rPr>
+          <w:rStyle w:val="NormalTok"/>
+        </w:rPr>
+        <w:t xml:space="preserve"> Dict[</w:t>
+      </w:r>
+      <w:r>
+        <w:rPr>
+          <w:rStyle w:val="BuiltInTok"/>
+        </w:rPr>
+        <w:t xml:space="preserve">str</w:t>
+      </w:r>
+      <w:r>
+        <w:rPr>
+          <w:rStyle w:val="NormalTok"/>
+        </w:rPr>
+        <w:t xml:space="preserve">, </w:t>
+      </w:r>
+      <w:r>
+        <w:rPr>
+          <w:rStyle w:val="BuiltInTok"/>
+        </w:rPr>
+        <w:t xml:space="preserve">float</w:t>
+      </w:r>
+      <w:r>
+        <w:rPr>
+          <w:rStyle w:val="NormalTok"/>
+        </w:rPr>
+        <w:t xml:space="preserve">]:</w:t>
+      </w:r>
+      <w:r>
+        <w:br/>
+      </w:r>
+      <w:r>
+        <w:rPr>
+          <w:rStyle w:val="NormalTok"/>
+        </w:rPr>
+        <w:t xml:space="preserve">        </w:t>
+      </w:r>
+      <w:r>
+        <w:rPr>
+          <w:rStyle w:val="CommentTok"/>
+        </w:rPr>
+        <w:t xml:space="preserve">"""Return weights as dictionary."""</w:t>
+      </w:r>
+      <w:r>
+        <w:br/>
+      </w:r>
+      <w:r>
+        <w:rPr>
+          <w:rStyle w:val="NormalTok"/>
+        </w:rPr>
+        <w:t xml:space="preserve">        </w:t>
+      </w:r>
+      <w:r>
+        <w:rPr>
+          <w:rStyle w:val="ControlFlowTok"/>
+        </w:rPr>
+        <w:t xml:space="preserve">return</w:t>
+      </w:r>
+      <w:r>
+        <w:rPr>
+          <w:rStyle w:val="NormalTok"/>
+        </w:rPr>
+        <w:t xml:space="preserve"> {</w:t>
+      </w:r>
+      <w:r>
+        <w:br/>
+      </w:r>
+      <w:r>
+        <w:rPr>
+          <w:rStyle w:val="NormalTok"/>
+        </w:rPr>
+        <w:t xml:space="preserve">            </w:t>
+      </w:r>
+      <w:r>
+        <w:rPr>
+          <w:rStyle w:val="StringTok"/>
+        </w:rPr>
+        <w:t xml:space="preserve">'ml_ensemble'</w:t>
+      </w:r>
+      <w:r>
+        <w:rPr>
+          <w:rStyle w:val="NormalTok"/>
+        </w:rPr>
+        <w:t xml:space="preserve">: </w:t>
+      </w:r>
+      <w:r>
+        <w:rPr>
+          <w:rStyle w:val="VariableTok"/>
+        </w:rPr>
+        <w:t xml:space="preserve">self</w:t>
+      </w:r>
+      <w:r>
+        <w:rPr>
+          <w:rStyle w:val="NormalTok"/>
+        </w:rPr>
+        <w:t xml:space="preserve">.ml_ensemble,</w:t>
+      </w:r>
+      <w:r>
+        <w:br/>
+      </w:r>
+      <w:r>
+        <w:rPr>
+          <w:rStyle w:val="NormalTok"/>
+        </w:rPr>
+        <w:t xml:space="preserve">            </w:t>
+      </w:r>
+      <w:r>
+        <w:rPr>
+          <w:rStyle w:val="StringTok"/>
+        </w:rPr>
+        <w:t xml:space="preserve">'rules'</w:t>
+      </w:r>
+      <w:r>
+        <w:rPr>
+          <w:rStyle w:val="NormalTok"/>
+        </w:rPr>
+        <w:t xml:space="preserve">: </w:t>
+      </w:r>
+      <w:r>
+        <w:rPr>
+          <w:rStyle w:val="VariableTok"/>
+        </w:rPr>
+        <w:t xml:space="preserve">self</w:t>
+      </w:r>
+      <w:r>
+        <w:rPr>
+          <w:rStyle w:val="NormalTok"/>
+        </w:rPr>
+        <w:t xml:space="preserve">.rules,</w:t>
+      </w:r>
+      <w:r>
+        <w:br/>
+      </w:r>
+      <w:r>
+        <w:rPr>
+          <w:rStyle w:val="NormalTok"/>
+        </w:rPr>
+        <w:t xml:space="preserve">            </w:t>
+      </w:r>
+      <w:r>
+        <w:rPr>
+          <w:rStyle w:val="StringTok"/>
+        </w:rPr>
+        <w:t xml:space="preserve">'bayesian'</w:t>
+      </w:r>
+      <w:r>
+        <w:rPr>
+          <w:rStyle w:val="NormalTok"/>
+        </w:rPr>
+        <w:t xml:space="preserve">: </w:t>
+      </w:r>
+      <w:r>
+        <w:rPr>
+          <w:rStyle w:val="VariableTok"/>
+        </w:rPr>
+        <w:t xml:space="preserve">self</w:t>
+      </w:r>
+      <w:r>
+        <w:rPr>
+          <w:rStyle w:val="NormalTok"/>
+        </w:rPr>
+        <w:t xml:space="preserve">.bayesian</w:t>
+      </w:r>
+      <w:r>
+        <w:br/>
+      </w:r>
+      <w:r>
+        <w:rPr>
+          <w:rStyle w:val="NormalTok"/>
+        </w:rPr>
+        <w:t xml:space="preserve">        }</w:t>
+      </w:r>
+      <w:r>
+        <w:br/>
+      </w:r>
+      <w:r>
+        <w:br/>
+      </w:r>
+      <w:r>
+        <w:rPr>
+          <w:rStyle w:val="NormalTok"/>
+        </w:rPr>
+        <w:t xml:space="preserve">    </w:t>
+      </w:r>
+      <w:r>
+        <w:rPr>
+          <w:rStyle w:val="AttributeTok"/>
+        </w:rPr>
+        <w:t xml:space="preserve">@classmetho</w:t>
+      </w:r>
+    </w:p>
+    <w:bookmarkEnd w:id="32"/>
     <w:sectPr>
       <w:footnotePr>
         <w:numRestart w:val="eachSect"/>
       </w:footnotePr>
+      <w:pgMar w:left="1417" w:right="1417" w:top="1417" w:bottom="1417"/>
     </w:sectPr>
   </w:body>
 </w:document>
@@ -15608,6 +18236,14 @@
   <w:style w:default="1" w:styleId="Normal" w:type="paragraph">
     <w:name w:val="Normal"/>
     <w:qFormat/>
+    <w:pPr>
+      <w:spacing w:line="360" w:lineRule="auto"/>
+      <w:jc w:val="both"/>
+    </w:pPr>
+    <w:rPr>
+      <w:rFonts w:ascii="Times New Roman" w:hAnsi="Times New Roman"/>
+      <w:sz w:val="24"/>
+    </w:rPr>
   </w:style>
   <w:style w:styleId="BodyText" w:type="paragraph">
     <w:name w:val="Body Text"/>
@@ -15643,11 +18279,12 @@
     <w:pPr>
       <w:spacing w:after="80" w:line="240" w:lineRule="auto"/>
       <w:contextualSpacing/>
-      <w:jc w:val="center"/>
+      <w:jc w:val="left"/>
     </w:pPr>
     <w:rPr>
-      <w:rFonts w:asciiTheme="majorHAnsi" w:cstheme="majorBidi" w:eastAsiaTheme="majorEastAsia" w:hAnsiTheme="majorHAnsi"/>
-      <w:sz w:val="56"/>
+      <w:rFonts w:asciiTheme="majorHAnsi" w:cstheme="majorBidi" w:eastAsiaTheme="majorEastAsia" w:hAnsiTheme="majorHAnsi" w:ascii="Times New Roman" w:hAnsi="Times New Roman"/>
+      <w:b/>
+      <w:sz w:val="36"/>
       <w:szCs w:val="56"/>
     </w:rPr>
   </w:style>
@@ -15777,12 +18414,14 @@
       <w:keepNext/>
       <w:keepLines/>
       <w:spacing w:after="80" w:before="360"/>
+      <w:jc w:val="left"/>
       <w:outlineLvl w:val="0"/>
     </w:pPr>
     <w:rPr>
-      <w:rFonts w:asciiTheme="majorHAnsi" w:cstheme="majorBidi" w:eastAsiaTheme="majorEastAsia" w:hAnsiTheme="majorHAnsi"/>
+      <w:rFonts w:asciiTheme="majorHAnsi" w:cstheme="majorBidi" w:eastAsiaTheme="majorEastAsia" w:hAnsiTheme="majorHAnsi" w:ascii="Times New Roman" w:hAnsi="Times New Roman"/>
+      <w:b/>
       <w:color w:themeColor="accent1" w:themeShade="BF" w:val="0F4761"/>
-      <w:sz w:val="40"/>
+      <w:sz w:val="32"/>
       <w:szCs w:val="40"/>
     </w:rPr>
   </w:style>
@@ -15800,12 +18439,14 @@
       <w:keepNext/>
       <w:keepLines/>
       <w:spacing w:after="80" w:before="160"/>
+      <w:jc w:val="left"/>
       <w:outlineLvl w:val="1"/>
     </w:pPr>
     <w:rPr>
-      <w:rFonts w:asciiTheme="majorHAnsi" w:cstheme="majorBidi" w:eastAsiaTheme="majorEastAsia" w:hAnsiTheme="majorHAnsi"/>
+      <w:rFonts w:asciiTheme="majorHAnsi" w:cstheme="majorBidi" w:eastAsiaTheme="majorEastAsia" w:hAnsiTheme="majorHAnsi" w:ascii="Times New Roman" w:hAnsi="Times New Roman"/>
+      <w:b/>
       <w:color w:themeColor="accent1" w:themeShade="BF" w:val="0F4761"/>
-      <w:sz w:val="32"/>
+      <w:sz w:val="28"/>
       <w:szCs w:val="32"/>
     </w:rPr>
   </w:style>
@@ -15823,12 +18464,14 @@
       <w:keepNext/>
       <w:keepLines/>
       <w:spacing w:after="80" w:before="160"/>
+      <w:jc w:val="left"/>
       <w:outlineLvl w:val="2"/>
     </w:pPr>
     <w:rPr>
-      <w:rFonts w:cstheme="majorBidi" w:eastAsiaTheme="majorEastAsia"/>
+      <w:rFonts w:cstheme="majorBidi" w:eastAsiaTheme="majorEastAsia" w:ascii="Times New Roman" w:hAnsi="Times New Roman"/>
+      <w:b/>
       <w:color w:themeColor="accent1" w:themeShade="BF" w:val="0F4761"/>
-      <w:sz w:val="28"/>
+      <w:sz w:val="24"/>
       <w:szCs w:val="28"/>
     </w:rPr>
   </w:style>

</xml_diff>

<commit_message>
feat(docs): strip garbled ASCII diagrams + spaced-out listings from body (U11)
Removes the illegible box-drawing diagram and 'r o z s t r z e l o n e' code
listings from the extracted body; the clean diagram is in Załącznik A (image)
and clean code in Załącznik B (from source). Completes U11.

Co-Authored-By: Claude Opus 4.8 <noreply@anthropic.com>
</commit_message>
<xml_diff>
--- a/praca-inzynierska-poprawiona.docx
+++ b/praca-inzynierska-poprawiona.docx
@@ -5882,146 +5882,6 @@
     <w:p>
       <w:pPr>
         <w:pStyle w:val="BodyText"/>
-      </w:pPr>
-      <w:r>
-        <w:t xml:space="preserve">┌────────────────────────────────────────────────────────────────────┐</w:t>
-      </w:r>
-      <w:r>
-        <w:t xml:space="preserve"> </w:t>
-      </w:r>
-      <w:r>
-        <w:t xml:space="preserve">│ Warstwa prezentacji │</w:t>
-      </w:r>
-      <w:r>
-        <w:t xml:space="preserve"> </w:t>
-      </w:r>
-      <w:r>
-        <w:t xml:space="preserve">│ Swagger UI · klienci HTTP (curl, Postman) · frontend /app │</w:t>
-      </w:r>
-      <w:r>
-        <w:t xml:space="preserve"> </w:t>
-      </w:r>
-      <w:r>
-        <w:t xml:space="preserve">└─────────────────────────────┬──────────────────────────────────────┘</w:t>
-      </w:r>
-      <w:r>
-        <w:t xml:space="preserve"> </w:t>
-      </w:r>
-      <w:r>
-        <w:t xml:space="preserve">│ H T T P / J S O N</w:t>
-      </w:r>
-      <w:r>
-        <w:t xml:space="preserve"> </w:t>
-      </w:r>
-      <w:r>
-        <w:t xml:space="preserve">┌─────────────────────────────▼──────────────────────────────────────┐</w:t>
-      </w:r>
-      <w:r>
-        <w:t xml:space="preserve"> </w:t>
-      </w:r>
-      <w:r>
-        <w:t xml:space="preserve">│ Warstwa logiki (FastAPI, Pydantic) │</w:t>
-      </w:r>
-      <w:r>
-        <w:t xml:space="preserve"> </w:t>
-      </w:r>
-      <w:r>
-        <w:t xml:space="preserve">│ /predict · /predict/ensemble · /predict/multi-paradigm │</w:t>
-      </w:r>
-      <w:r>
-        <w:t xml:space="preserve"> </w:t>
-      </w:r>
-      <w:r>
-        <w:t xml:space="preserve">│ /predict/email · /predict/email/file · /predict/sms · /health │</w:t>
-      </w:r>
-      <w:r>
-        <w:t xml:space="preserve"> </w:t>
-      </w:r>
-      <w:r>
-        <w:t xml:space="preserve">│ │</w:t>
-      </w:r>
-      <w:r>
-        <w:t xml:space="preserve"> </w:t>
-      </w:r>
-      <w:r>
-        <w:t xml:space="preserve">│ ┌────────────┐ ┌──────────────┐ ┌──────────────┐ ┌──────────────┐ │</w:t>
-      </w:r>
-      <w:r>
-        <w:t xml:space="preserve"> </w:t>
-      </w:r>
-      <w:r>
-        <w:t xml:space="preserve">│ │ Ekstrakcja │ │ Klasyfika- │ │ Algorytm │ │ Agregator │ │</w:t>
-      </w:r>
-      <w:r>
-        <w:t xml:space="preserve"> </w:t>
-      </w:r>
-      <w:r>
-        <w:t xml:space="preserve">│ │ cech │ │ tory ML + │ │ genetyczny │ │ paradygma - │ │</w:t>
-      </w:r>
-      <w:r>
-        <w:t xml:space="preserve"> </w:t>
-      </w:r>
-      <w:r>
-        <w:t xml:space="preserve">│ │ (URL/Email │ │ ensembles │ │ (DEAP) + │ │ tów (ML + │ │</w:t>
-      </w:r>
-      <w:r>
-        <w:t xml:space="preserve"> </w:t>
-      </w:r>
-      <w:r>
-        <w:t xml:space="preserve">│ │ /SMS/Text)│ │ (sklearn) │ │ MLflow │ │ Rules + │ │</w:t>
-      </w:r>
-      <w:r>
-        <w:t xml:space="preserve"> </w:t>
-      </w:r>
-      <w:r>
-        <w:t xml:space="preserve">│ │ │ │ │ │ │ │ Bayes) │ │</w:t>
-      </w:r>
-      <w:r>
-        <w:t xml:space="preserve"> </w:t>
-      </w:r>
-      <w:r>
-        <w:t xml:space="preserve">│ └────────────┘ └──────────────┘ └──────────────┘ └──────────────┘ │</w:t>
-      </w:r>
-      <w:r>
-        <w:t xml:space="preserve"> </w:t>
-      </w:r>
-      <w:r>
-        <w:t xml:space="preserve">└─────────────────────────────┬──────────────────────────────────────┘</w:t>
-      </w:r>
-      <w:r>
-        <w:t xml:space="preserve"> </w:t>
-      </w:r>
-      <w:r>
-        <w:t xml:space="preserve">│</w:t>
-      </w:r>
-      <w:r>
-        <w:t xml:space="preserve"> </w:t>
-      </w:r>
-      <w:r>
-        <w:t xml:space="preserve">┌─────────────────────────────▼──────────────────────────────────────┐</w:t>
-      </w:r>
-      <w:r>
-        <w:t xml:space="preserve"> </w:t>
-      </w:r>
-      <w:r>
-        <w:t xml:space="preserve">│ Warstwa danych │</w:t>
-      </w:r>
-      <w:r>
-        <w:t xml:space="preserve"> </w:t>
-      </w:r>
-      <w:r>
-        <w:t xml:space="preserve">│ models/*.joblib · data/ · cache/ · mlruns/ · phishing_rules.yaml │</w:t>
-      </w:r>
-      <w:r>
-        <w:t xml:space="preserve"> </w:t>
-      </w:r>
-      <w:r>
-        <w:t xml:space="preserve">└────────────────────────────────────────────────────────────────────┘</w:t>
-      </w:r>
-    </w:p>
-    <w:p>
-      <w:pPr>
-        <w:pStyle w:val="BodyText"/>
         <w:jc w:val="center"/>
       </w:pPr>
       <w:r>
@@ -6470,38 +6330,6 @@
     </w:p>
     <w:p>
       <w:pPr>
-        <w:pStyle w:val="BodyText"/>
-      </w:pPr>
-      <w:r>
-        <w:t xml:space="preserve">d e f c a l c u l a t e _ e n t r o p y ( t e x t : s t r ) - &gt; f l o a t :</w:t>
-      </w:r>
-      <w:r>
-        <w:t xml:space="preserve"> </w:t>
-      </w:r>
-      <w:r>
-        <w:t xml:space="preserve">i f n o t t e x t :</w:t>
-      </w:r>
-      <w:r>
-        <w:t xml:space="preserve"> </w:t>
-      </w:r>
-      <w:r>
-        <w:t xml:space="preserve">r e t u r n 0 . 0</w:t>
-      </w:r>
-      <w:r>
-        <w:t xml:space="preserve"> </w:t>
-      </w:r>
-      <w:r>
-        <w:t xml:space="preserve">c o u n t s = C o u n t e r ( t e x t )</w:t>
-      </w:r>
-      <w:r>
-        <w:t xml:space="preserve"> </w:t>
-      </w:r>
-      <w:r>
-        <w:t xml:space="preserve">l e n g t h = l e n ( t e x t )</w:t>
-      </w:r>
-    </w:p>
-    <w:p>
-      <w:pPr>
         <w:pStyle w:val="SourceCode"/>
       </w:pPr>
       <w:r>
@@ -7576,54 +7404,437 @@
     </w:p>
     <w:p>
       <w:pPr>
-        <w:pStyle w:val="BodyText"/>
-      </w:pPr>
-      <w:r>
-        <w:t xml:space="preserve">e n s e m b l e = S t a c k i n g C l a s s i f i e r (</w:t>
-      </w:r>
-      <w:r>
-        <w:t xml:space="preserve"> </w:t>
-      </w:r>
-      <w:r>
-        <w:t xml:space="preserve">e s t i m a t o r s = e s t i m a t o r s ,</w:t>
-      </w:r>
-      <w:r>
-        <w:t xml:space="preserve"> </w:t>
-      </w:r>
-      <w:r>
-        <w:t xml:space="preserve">final_estimator=LogisticRegression(class_weight=</w:t>
-      </w:r>
-      <w:r>
-        <w:t xml:space="preserve">‘balanced’</w:t>
-      </w:r>
-      <w:r>
-        <w:t xml:space="preserve">,</w:t>
-      </w:r>
-      <w:r>
-        <w:t xml:space="preserve"> </w:t>
-      </w:r>
-      <w:r>
-        <w:t xml:space="preserve">max_iter=1000, random_state=42),</w:t>
-      </w:r>
-    </w:p>
-    <w:p>
-      <w:pPr>
         <w:pStyle w:val="SourceCode"/>
       </w:pPr>
       <w:r>
         <w:rPr>
           <w:rStyle w:val="VerbatimChar"/>
         </w:rPr>
+        <w:t xml:space="preserve">    final_estimator=LogisticRegression(class_weight='balanced',</w:t>
+      </w:r>
+      <w:r>
+        <w:br/>
+      </w:r>
+      <w:r>
+        <w:rPr>
+          <w:rStyle w:val="VerbatimChar"/>
+        </w:rPr>
+        <w:t xml:space="preserve">                                                            max_iter=1000,                       random_state=42),</w:t>
+      </w:r>
+      <w:r>
+        <w:br/>
+      </w:r>
+      <w:r>
+        <w:br/>
+      </w:r>
+      <w:r>
+        <w:br/>
+      </w:r>
+      <w:r>
+        <w:br/>
+      </w:r>
+      <w:r>
+        <w:rPr>
+          <w:rStyle w:val="VerbatimChar"/>
+        </w:rPr>
         <w:t xml:space="preserve">c                                 v                                        =                                       5                           ,</w:t>
       </w:r>
-      <w:r>
-        <w:br/>
-      </w:r>
+    </w:p>
+    <w:p>
+      <w:pPr>
+        <w:pStyle w:val="FirstParagraph"/>
+      </w:pPr>
+      <w:r>
+        <w:t xml:space="preserve">)</w:t>
+      </w:r>
+    </w:p>
+    <w:p>
+      <w:pPr>
+        <w:pStyle w:val="BodyText"/>
+      </w:pPr>
+      <w:r>
+        <w:t xml:space="preserve">Listing 2. Konfiguracja meta-modelu w stacking ensemble (src/models/ensemble.py).</w:t>
+      </w:r>
+    </w:p>
+    <w:p>
+      <w:pPr>
+        <w:pStyle w:val="Heading3"/>
+      </w:pPr>
+      <w:r>
+        <w:t xml:space="preserve">4.3.9. Wykrywanie rozbieżności w zespole</w:t>
+      </w:r>
+    </w:p>
+    <w:p>
+      <w:pPr>
+        <w:pStyle w:val="BodyText"/>
+      </w:pPr>
+      <w:r>
+        <w:t xml:space="preserve">Funkcja get_disagreement_summary (moduł src/models/disagreement.py) oblicza wskaźnik</w:t>
+      </w:r>
+      <w:r>
+        <w:t xml:space="preserve"> </w:t>
+      </w:r>
+      <w:r>
+        <w:t xml:space="preserve">rozbieżności między predykcjami klasyfikatorów. Wskaźnikiem jest znormalizowana entropia</w:t>
+      </w:r>
+      <w:r>
+        <w:t xml:space="preserve"> </w:t>
+      </w:r>
+      <w:r>
+        <w:t xml:space="preserve">rozkładu predykcji binarnych. Dla siedmiu klasyfikatorów rozkład typu [7, 0] (jednomyślność)</w:t>
+      </w:r>
+      <w:r>
+        <w:t xml:space="preserve"> </w:t>
+      </w:r>
+      <w:r>
+        <w:t xml:space="preserve">daje entropię równą zero, a rozkład [4, 3] (maksymalna niezgoda) zbliża się do jedności. W</w:t>
+      </w:r>
+      <w:r>
+        <w:t xml:space="preserve"> </w:t>
+      </w:r>
+      <w:r>
+        <w:t xml:space="preserve">obecnej implementacji próg uznania próbki za graniczną ustawiono empirycznie na 0,7.</w:t>
+      </w:r>
+      <w:r>
+        <w:t xml:space="preserve"> </w:t>
+      </w:r>
+      <w:r>
+        <w:t xml:space="preserve">Przekroczenie progu jest flagowane w odpowiedzi API i jest sygnałem dla analityka, że dany</w:t>
+      </w:r>
+      <w:r>
+        <w:t xml:space="preserve"> </w:t>
+      </w:r>
+      <w:r>
+        <w:t xml:space="preserve">przypadek wymaga ręcznej weryfikacji.</w:t>
+      </w:r>
+    </w:p>
+    <w:p>
+      <w:pPr>
+        <w:pStyle w:val="BodyText"/>
+      </w:pPr>
+      <w:r>
+        <w:t xml:space="preserve">Wybór entropii zamiast prostszej miary, takiej jak proporcja głosów mniejszościowych, ma</w:t>
+      </w:r>
+      <w:r>
+        <w:t xml:space="preserve"> </w:t>
+      </w:r>
+      <w:r>
+        <w:t xml:space="preserve">uzasadnienie informacyjne. Entropia traktuje rozkład [6, 1] i [5, 2] różnie, co odzwierciedla</w:t>
+      </w:r>
+      <w:r>
+        <w:t xml:space="preserve"> </w:t>
+      </w:r>
+      <w:r>
+        <w:t xml:space="preserve">intuicję, że jeden dysydent w grupie siedmiu jest słabszym sygnałem niezgody niż dwóch. Dla</w:t>
+      </w:r>
+      <w:r>
+        <w:t xml:space="preserve"> </w:t>
+      </w:r>
+      <w:r>
+        <w:t xml:space="preserve">rozkładu jednomyślnego entropia jest dokładnie zerowa, co dobrze pasuje do agregatora</w:t>
+      </w:r>
+      <w:r>
+        <w:t xml:space="preserve"> </w:t>
+      </w:r>
+      <w:r>
+        <w:t xml:space="preserve">opisanego w rozdziale 4.7.</w:t>
+      </w:r>
+    </w:p>
+    <w:p>
+      <w:pPr>
+        <w:pStyle w:val="Heading2"/>
+      </w:pPr>
+      <w:r>
+        <w:t xml:space="preserve">4.4. Optymalizacja ewolucyjna (algorytm genetyczny)</w:t>
+      </w:r>
+    </w:p>
+    <w:p>
+      <w:pPr>
+        <w:pStyle w:val="Heading3"/>
+      </w:pPr>
+      <w:r>
+        <w:t xml:space="preserve">4.4.1. Motywacja i krótki rys historyczny</w:t>
+      </w:r>
+    </w:p>
+    <w:p>
+      <w:pPr>
+        <w:pStyle w:val="BodyText"/>
+      </w:pPr>
+      <w:r>
+        <w:t xml:space="preserve">Dobór hiperparametrów klasyfikatora ML jest klasycznym problemem optymalizacji w</w:t>
+      </w:r>
+      <w:r>
+        <w:t xml:space="preserve"> </w:t>
+      </w:r>
+      <w:r>
+        <w:t xml:space="preserve">przestrzeni o mieszanym typie. Część parametrów jest liczbami całkowitymi (liczba drzew,</w:t>
+      </w:r>
+      <w:r>
+        <w:t xml:space="preserve"> </w:t>
+      </w:r>
+      <w:r>
+        <w:t xml:space="preserve">głębokość), część liczbami rzeczywistymi w skali liniowej lub logarytmicznej (C w SVM,</w:t>
+      </w:r>
+      <w:r>
+        <w:t xml:space="preserve"> </w:t>
+      </w:r>
+      <w:r>
+        <w:t xml:space="preserve">learning_rate w XGBoost), a część zmiennymi kategorialnymi (rodzaj jądra, kryterium</w:t>
+      </w:r>
+      <w:r>
+        <w:t xml:space="preserve"> </w:t>
+      </w:r>
+      <w:r>
+        <w:t xml:space="preserve">podziału). Przestrzeń ta jest nieciągła i nie ma dostępnego gradientu, a próba dostrojenia każdego</w:t>
+      </w:r>
+      <w:r>
+        <w:t xml:space="preserve"> </w:t>
+      </w:r>
+      <w:r>
+        <w:t xml:space="preserve">parametru ręcznie nawet dla jednego klasyfikatora kosztuje godziny pracy badacza i daje wyniki</w:t>
+      </w:r>
+      <w:r>
+        <w:t xml:space="preserve"> </w:t>
+      </w:r>
+      <w:r>
+        <w:t xml:space="preserve">gorsze od metod automatycznych.</w:t>
+      </w:r>
+    </w:p>
+    <w:p>
+      <w:pPr>
+        <w:pStyle w:val="BodyText"/>
+      </w:pPr>
+      <w:r>
+        <w:t xml:space="preserve">Klasyczna metoda wyszukiwania siatkowego (grid search) skaluje się wykładniczo z liczbą</w:t>
+      </w:r>
+      <w:r>
+        <w:t xml:space="preserve"> </w:t>
+      </w:r>
+      <w:r>
+        <w:t xml:space="preserve">wymiarów. Dla XGBoost, dla którego optymalizowano dziewięć parametrów, trzy wartości na</w:t>
+      </w:r>
+      <w:r>
+        <w:t xml:space="preserve"> </w:t>
+      </w:r>
+      <w:r>
+        <w:t xml:space="preserve">każdym wymiarze dają 39 = 19683 konfiguracji, co po pięciokrotnej walidacji krzyżowej daje</w:t>
+      </w:r>
+      <w:r>
+        <w:t xml:space="preserve"> </w:t>
+      </w:r>
+      <w:r>
+        <w:t xml:space="preserve">blisko 100 tysięcy treningów. Wyszukiwanie losowe (random search) jest istotnie bardziej</w:t>
+      </w:r>
+      <w:r>
+        <w:t xml:space="preserve"> </w:t>
+      </w:r>
+      <w:r>
+        <w:t xml:space="preserve">efektywne, ponieważ większość wymiarów ma niski wpływ i przeszukiwanie ich z siatkowym</w:t>
+      </w:r>
+      <w:r>
+        <w:t xml:space="preserve"> </w:t>
+      </w:r>
+      <w:r>
+        <w:t xml:space="preserve">krokiem jest marnotrawne [40]. Jeszcze efektywniejsza jest optymalizacja bayesowska (na</w:t>
+      </w:r>
+      <w:r>
+        <w:t xml:space="preserve"> </w:t>
+      </w:r>
+      <w:r>
+        <w:t xml:space="preserve">przykład Optuna), która modeluje funkcję celu zastępczo i dobiera kolejne próbki na podstawie</w:t>
+      </w:r>
+      <w:r>
+        <w:t xml:space="preserve"> </w:t>
+      </w:r>
+      <w:r>
+        <w:t xml:space="preserve">modelu zastępczego. Domyślnym samplerem biblioteki Optuna jest TPE (Tree-structured Parzen Estimator), a wariant oparty na procesie Gaussa stanowi osobną, opcjonalną metodę. Optymalizacja bayesowska bywa wrażliwa na zmienne kategorialne i dobór przestrzeni; w tym projekcie wartości kategorialne i tak mapowane są na indeksy (src/optimization/search_spaces.py). Algorytm genetyczny wybrano ze względu na naturalną obsługę mieszanych przestrzeni (całkowitych, ciągłych i kategorialnych) bez sztucznych przekształceń oraz prostą kontrolę kosztu obliczeń, a nie z powodu udowodnionej przewagi skuteczności nad optymalizacją bayesowską.</w:t>
+      </w:r>
+    </w:p>
+    <w:p>
+      <w:pPr>
+        <w:pStyle w:val="BodyText"/>
+      </w:pPr>
+      <w:r>
+        <w:t xml:space="preserve">Algorytmy genetyczne, sformułowane przez Johna Hollanda w latach siedemdziesiątych [34] i</w:t>
+      </w:r>
+      <w:r>
+        <w:t xml:space="preserve"> </w:t>
+      </w:r>
+      <w:r>
+        <w:t xml:space="preserve">rozwijane jako odrębna gałąź obliczeń ewolucyjnych [18], przyjmują inną drogę. Przeszukują</w:t>
+      </w:r>
+      <w:r>
+        <w:t xml:space="preserve"> </w:t>
+      </w:r>
+      <w:r>
+        <w:t xml:space="preserve">przestrzeń utrzymując populację rozwiązań, które ewoluują przez selekcję, krzyżowanie i</w:t>
+      </w:r>
+      <w:r>
+        <w:t xml:space="preserve"> </w:t>
+      </w:r>
+      <w:r>
+        <w:t xml:space="preserve">mutację. W praktyce daje to kilka korzyści, które dobrze pasują do problemu hiperparametrów:</w:t>
+      </w:r>
+      <w:r>
+        <w:t xml:space="preserve"> </w:t>
+      </w:r>
+      <w:r>
+        <w:t xml:space="preserve">GA radzi sobie z mieszanką liczb całkowitych, ciągłych i kategorialnych bez sztucznego</w:t>
+      </w:r>
+      <w:r>
+        <w:t xml:space="preserve"> </w:t>
+      </w:r>
+      <w:r>
+        <w:t xml:space="preserve">mapowania, populacyjny charakter pomaga wyjść z lokalnych ekstremów, a ocena osobników w</w:t>
+      </w:r>
+      <w:r>
+        <w:t xml:space="preserve"> </w:t>
+      </w:r>
+      <w:r>
+        <w:t xml:space="preserve">jednej generacji jest niezależna, więc całość łatwo zrównoleglić. Ceną jest większy koszt</w:t>
+      </w:r>
+      <w:r>
+        <w:t xml:space="preserve"> </w:t>
+      </w:r>
+      <w:r>
+        <w:t xml:space="preserve">obliczeniowy niż w optymalizacji bayesowskiej i konieczność strojenia samych metaparametrów</w:t>
+      </w:r>
+      <w:r>
+        <w:t xml:space="preserve"> </w:t>
+      </w:r>
+      <w:r>
+        <w:t xml:space="preserve">algorytmu (wielkość populacji, prawdopodobieństwa krzyżowania i mutacji).</w:t>
+      </w:r>
+    </w:p>
+    <w:p>
+      <w:pPr>
+        <w:pStyle w:val="Heading3"/>
+      </w:pPr>
+      <w:r>
+        <w:t xml:space="preserve">4.4.2. Implementacja na bazie DEAP</w:t>
+      </w:r>
+    </w:p>
+    <w:p>
+      <w:pPr>
+        <w:pStyle w:val="BodyText"/>
+      </w:pPr>
+      <w:r>
+        <w:t xml:space="preserve">Optymalizację zrealizowałem w bibliotece DEAP (Fortin i in. [7], Distributed Evolutionary</w:t>
+      </w:r>
+      <w:r>
+        <w:t xml:space="preserve"> </w:t>
+      </w:r>
+      <w:r>
+        <w:t xml:space="preserve">Algorithms in Python, wersja 1.4.3). DEAP udostępnia gotowe operatory selekcji, krzyżowania i</w:t>
+      </w:r>
+      <w:r>
+        <w:t xml:space="preserve"> </w:t>
+      </w:r>
+      <w:r>
+        <w:t xml:space="preserve">mutacji, łatwo integruje się ze scikit-learn i pozwala też sięgnąć po bardziej zaawansowane</w:t>
+      </w:r>
+      <w:r>
+        <w:t xml:space="preserve"> </w:t>
+      </w:r>
+      <w:r>
+        <w:t xml:space="preserve">warianty obliczeń ewolucyjnych (NSGA-II, CMA-ES, programowanie genetyczne), gdyby</w:t>
+      </w:r>
+      <w:r>
+        <w:t xml:space="preserve"> </w:t>
+      </w:r>
+      <w:r>
+        <w:t xml:space="preserve">projekt rozszerzano w przyszłości. W module src/optimization/ga_optimizer.py znajdują się</w:t>
+      </w:r>
+      <w:r>
+        <w:t xml:space="preserve"> </w:t>
+      </w:r>
+      <w:r>
+        <w:t xml:space="preserve">dwie kluczowe funkcje: setup_toolbox (konfiguracja DEAP) i run_ga_optimization (główna</w:t>
+      </w:r>
+      <w:r>
+        <w:t xml:space="preserve"> </w:t>
+      </w:r>
+      <w:r>
+        <w:t xml:space="preserve">pętla ewolucyjna).</w:t>
+      </w:r>
+    </w:p>
+    <w:p>
+      <w:pPr>
+        <w:pStyle w:val="BodyText"/>
+      </w:pPr>
+      <w:r>
+        <w:t xml:space="preserve">Podczas implementacji szybko okazało się, że same operatory mutacji i krzyżowania nie</w:t>
+      </w:r>
+      <w:r>
+        <w:t xml:space="preserve"> </w:t>
+      </w:r>
+      <w:r>
+        <w:t xml:space="preserve">wystarczą - trzeba pilnować ograniczeń dziedziny. DEAP z operatorem cxBlend potrafił mi</w:t>
+      </w:r>
+    </w:p>
+    <w:p>
+      <w:pPr>
+        <w:pStyle w:val="BodyText"/>
+      </w:pPr>
+      <w:r>
+        <w:t xml:space="preserve">wygenerować wartości ujemne dla parametrów takich jak n_estimators w Random Forest, czego</w:t>
+      </w:r>
+      <w:r>
+        <w:t xml:space="preserve"> </w:t>
+      </w:r>
+      <w:r>
+        <w:t xml:space="preserve">scikit-learn naturalnie nie zaakceptował. Dodanie dekoratora checkBounds rozwiązało problem,</w:t>
+      </w:r>
+      <w:r>
+        <w:t xml:space="preserve"> </w:t>
+      </w:r>
+      <w:r>
+        <w:t xml:space="preserve">ale dopiero po kilku nieudanych uruchomieniach i ręcznym przejrzeniu wartości osobników.</w:t>
+      </w:r>
+      <w:r>
+        <w:t xml:space="preserve"> </w:t>
+      </w:r>
+      <w:r>
+        <w:t xml:space="preserve">Lekcja: w tego typu optymalizacji warto narzucić ograniczenia od pierwszej generacji, nawet</w:t>
+      </w:r>
+      <w:r>
+        <w:t xml:space="preserve"> </w:t>
+      </w:r>
+      <w:r>
+        <w:t xml:space="preserve">jeśli wstępne osobniki wyglądają poprawnie.</w:t>
+      </w:r>
+    </w:p>
+    <w:p>
+      <w:pPr>
+        <w:pStyle w:val="BodyText"/>
+      </w:pPr>
+      <w:r>
+        <w:t xml:space="preserve">Reprezentacja osobnika</w:t>
+      </w:r>
+    </w:p>
+    <w:p>
+      <w:pPr>
+        <w:pStyle w:val="BodyText"/>
+      </w:pPr>
+      <w:r>
+        <w:t xml:space="preserve">Osobnik jest listą wartości hiperparametrów. Każdy hiperparametr ma w</w:t>
+      </w:r>
+      <w:r>
+        <w:t xml:space="preserve"> </w:t>
+      </w:r>
+      <w:r>
+        <w:t xml:space="preserve">src/optimization/search_spaces.py zdefiniowaną przestrzeń przeszukiwań - z trzema typami:</w:t>
+      </w:r>
+    </w:p>
+    <w:p>
+      <w:pPr>
+        <w:pStyle w:val="SourceCode"/>
+      </w:pPr>
       <w:r>
         <w:rPr>
           <w:rStyle w:val="VerbatimChar"/>
         </w:rPr>
-        <w:t xml:space="preserve">s    t    a       c       k           _       m           e   t       h        o       d   =           '       a           u       t   o   '   ,</w:t>
+        <w:t xml:space="preserve">•    integer - liczba całkowita w zakresie (np. n_estimators w RF: 50-500);</w:t>
       </w:r>
       <w:r>
         <w:br/>
@@ -7632,7 +7843,7 @@
         <w:rPr>
           <w:rStyle w:val="VerbatimChar"/>
         </w:rPr>
-        <w:t xml:space="preserve">p     a       s       s       t           h           r       o       u        g       h       =           F           a       l       s   e   ,</w:t>
+        <w:t xml:space="preserve">•    float - liczba zmiennoprzecinkowa, opcjonalnie w skali logarytmicznej (np. C w SVM lub</w:t>
       </w:r>
       <w:r>
         <w:br/>
@@ -7641,7 +7852,19 @@
         <w:rPr>
           <w:rStyle w:val="VerbatimChar"/>
         </w:rPr>
-        <w:t xml:space="preserve">n         _               j                       o               b                s               =                       -           1       ,</w:t>
+        <w:t xml:space="preserve">     learning_rate w XGB);</w:t>
+      </w:r>
+      <w:r>
+        <w:br/>
+      </w:r>
+      <w:r>
+        <w:br/>
+      </w:r>
+      <w:r>
+        <w:rPr>
+          <w:rStyle w:val="VerbatimChar"/>
+        </w:rPr>
+        <w:t xml:space="preserve">•    categorical - indeks w liście wartości (np. kernel ∈ {'rbf', 'linear', 'poly'}).</w:t>
       </w:r>
     </w:p>
     <w:p>
@@ -7649,99 +7872,412 @@
         <w:pStyle w:val="FirstParagraph"/>
       </w:pPr>
       <w:r>
-        <w:t xml:space="preserve">)</w:t>
-      </w:r>
-    </w:p>
-    <w:p>
-      <w:pPr>
-        <w:pStyle w:val="BodyText"/>
-      </w:pPr>
-      <w:r>
-        <w:t xml:space="preserve">Listing 2. Konfiguracja meta-modelu w stacking ensemble (src/models/ensemble.py).</w:t>
-      </w:r>
-    </w:p>
-    <w:p>
-      <w:pPr>
-        <w:pStyle w:val="Heading3"/>
-      </w:pPr>
-      <w:r>
-        <w:t xml:space="preserve">4.3.9. Wykrywanie rozbieżności w zespole</w:t>
-      </w:r>
-    </w:p>
-    <w:p>
-      <w:pPr>
-        <w:pStyle w:val="BodyText"/>
-      </w:pPr>
-      <w:r>
-        <w:t xml:space="preserve">Funkcja get_disagreement_summary (moduł src/models/disagreement.py) oblicza wskaźnik</w:t>
-      </w:r>
-      <w:r>
-        <w:t xml:space="preserve"> </w:t>
-      </w:r>
-      <w:r>
-        <w:t xml:space="preserve">rozbieżności między predykcjami klasyfikatorów. Wskaźnikiem jest znormalizowana entropia</w:t>
-      </w:r>
-      <w:r>
-        <w:t xml:space="preserve"> </w:t>
-      </w:r>
-      <w:r>
-        <w:t xml:space="preserve">rozkładu predykcji binarnych. Dla siedmiu klasyfikatorów rozkład typu [7, 0] (jednomyślność)</w:t>
-      </w:r>
-      <w:r>
-        <w:t xml:space="preserve"> </w:t>
-      </w:r>
-      <w:r>
-        <w:t xml:space="preserve">daje entropię równą zero, a rozkład [4, 3] (maksymalna niezgoda) zbliża się do jedności. W</w:t>
-      </w:r>
-      <w:r>
-        <w:t xml:space="preserve"> </w:t>
-      </w:r>
-      <w:r>
-        <w:t xml:space="preserve">obecnej implementacji próg uznania próbki za graniczną ustawiono empirycznie na 0,7.</w:t>
-      </w:r>
-      <w:r>
-        <w:t xml:space="preserve"> </w:t>
-      </w:r>
-      <w:r>
-        <w:t xml:space="preserve">Przekroczenie progu jest flagowane w odpowiedzi API i jest sygnałem dla analityka, że dany</w:t>
-      </w:r>
-      <w:r>
-        <w:t xml:space="preserve"> </w:t>
-      </w:r>
-      <w:r>
-        <w:t xml:space="preserve">przypadek wymaga ręcznej weryfikacji.</w:t>
-      </w:r>
-    </w:p>
-    <w:p>
-      <w:pPr>
-        <w:pStyle w:val="BodyText"/>
-      </w:pPr>
-      <w:r>
-        <w:t xml:space="preserve">Wybór entropii zamiast prostszej miary, takiej jak proporcja głosów mniejszościowych, ma</w:t>
-      </w:r>
-      <w:r>
-        <w:t xml:space="preserve"> </w:t>
-      </w:r>
-      <w:r>
-        <w:t xml:space="preserve">uzasadnienie informacyjne. Entropia traktuje rozkład [6, 1] i [5, 2] różnie, co odzwierciedla</w:t>
-      </w:r>
-      <w:r>
-        <w:t xml:space="preserve"> </w:t>
-      </w:r>
-      <w:r>
-        <w:t xml:space="preserve">intuicję, że jeden dysydent w grupie siedmiu jest słabszym sygnałem niezgody niż dwóch. Dla</w:t>
-      </w:r>
-      <w:r>
-        <w:t xml:space="preserve"> </w:t>
-      </w:r>
-      <w:r>
-        <w:t xml:space="preserve">rozkładu jednomyślnego entropia jest dokładnie zerowa, co dobrze pasuje do agregatora</w:t>
-      </w:r>
-      <w:r>
-        <w:t xml:space="preserve"> </w:t>
-      </w:r>
-      <w:r>
-        <w:t xml:space="preserve">opisanego w rozdziale 4.7.</w:t>
+        <w:t xml:space="preserve">Operatory genetyczne</w:t>
+      </w:r>
+    </w:p>
+    <w:p>
+      <w:pPr>
+        <w:pStyle w:val="SourceCode"/>
+      </w:pPr>
+      <w:r>
+        <w:rPr>
+          <w:rStyle w:val="VerbatimChar"/>
+        </w:rPr>
+        <w:t xml:space="preserve">•    Selekcja: turniejowa, rozmiar turnieju 3 (tools.selTournament(tournsize=3)). Wybór</w:t>
+      </w:r>
+      <w:r>
+        <w:br/>
+      </w:r>
+      <w:r>
+        <w:rPr>
+          <w:rStyle w:val="VerbatimChar"/>
+        </w:rPr>
+        <w:t xml:space="preserve">     trzech osobników i przepuszczenie najlepszego do kolejnej generacji równoważy</w:t>
+      </w:r>
+      <w:r>
+        <w:br/>
+      </w:r>
+      <w:r>
+        <w:rPr>
+          <w:rStyle w:val="VerbatimChar"/>
+        </w:rPr>
+        <w:t xml:space="preserve">     eksplorację i eksploatację.</w:t>
+      </w:r>
+      <w:r>
+        <w:br/>
+      </w:r>
+      <w:r>
+        <w:rPr>
+          <w:rStyle w:val="VerbatimChar"/>
+        </w:rPr>
+        <w:t xml:space="preserve">•    Krzyżowanie: mieszane (tools.cxBlend(alpha=0.5)). Tworzy dziecko jako kombinację</w:t>
+      </w:r>
+      <w:r>
+        <w:br/>
+      </w:r>
+      <w:r>
+        <w:rPr>
+          <w:rStyle w:val="VerbatimChar"/>
+        </w:rPr>
+        <w:t xml:space="preserve">     afiniczną rodziców z parametrem mieszania 𝛼 = 0,5. Z prawdopodobieństwem cxpb=0.7.</w:t>
+      </w:r>
+      <w:r>
+        <w:br/>
+      </w:r>
+      <w:r>
+        <w:rPr>
+          <w:rStyle w:val="VerbatimChar"/>
+        </w:rPr>
+        <w:t xml:space="preserve">•    Mutacja:        ograniczona     wielomianowa   (tools.mutPolynomialBounded(eta=20.0,</w:t>
+      </w:r>
+      <w:r>
+        <w:br/>
+      </w:r>
+      <w:r>
+        <w:rPr>
+          <w:rStyle w:val="VerbatimChar"/>
+        </w:rPr>
+        <w:t xml:space="preserve">     indpb=0.2)).    Dla każdego genu z prawdopodobieństwem 20% generuje wartość z</w:t>
+      </w:r>
+      <w:r>
+        <w:br/>
+      </w:r>
+      <w:r>
+        <w:rPr>
+          <w:rStyle w:val="VerbatimChar"/>
+        </w:rPr>
+        <w:t xml:space="preserve">     rozkładu wielomianowego ograniczonego do dolnego i górnego ograniczenia parametru.</w:t>
+      </w:r>
+      <w:r>
+        <w:br/>
+      </w:r>
+      <w:r>
+        <w:rPr>
+          <w:rStyle w:val="VerbatimChar"/>
+        </w:rPr>
+        <w:t xml:space="preserve">     Parametr eta=20 koncentruje mutacje blisko wartości oryginalnej, sprzyjając lokalnej</w:t>
+      </w:r>
+      <w:r>
+        <w:br/>
+      </w:r>
+      <w:r>
+        <w:rPr>
+          <w:rStyle w:val="VerbatimChar"/>
+        </w:rPr>
+        <w:t xml:space="preserve">     eksploatacji.</w:t>
+      </w:r>
+    </w:p>
+    <w:p>
+      <w:pPr>
+        <w:pStyle w:val="FirstParagraph"/>
+      </w:pPr>
+      <w:r>
+        <w:t xml:space="preserve">Oprócz tego zaimplementowano dekorator checkBounds, który egzekwuje ograniczenia po</w:t>
+      </w:r>
+      <w:r>
+        <w:t xml:space="preserve"> </w:t>
+      </w:r>
+      <w:r>
+        <w:t xml:space="preserve">krzyżowaniu i mutacji. Eliminuje to przypadki, w których operatory ciągłe generują wartości</w:t>
+      </w:r>
+      <w:r>
+        <w:t xml:space="preserve"> </w:t>
+      </w:r>
+      <w:r>
+        <w:t xml:space="preserve">spoza dopuszczalnego zakresu albo liczby zespolone (problem znany z cxBlend dla skrajnych</w:t>
+      </w:r>
+      <w:r>
+        <w:t xml:space="preserve"> </w:t>
+      </w:r>
+      <w:r>
+        <w:t xml:space="preserve">alfa).</w:t>
+      </w:r>
+    </w:p>
+    <w:p>
+      <w:pPr>
+        <w:pStyle w:val="BodyText"/>
+      </w:pPr>
+      <w:r>
+        <w:t xml:space="preserve">Funkcja celu</w:t>
+      </w:r>
+    </w:p>
+    <w:p>
+      <w:pPr>
+        <w:pStyle w:val="BodyText"/>
+      </w:pPr>
+      <w:r>
+        <w:t xml:space="preserve">Funkcja celu (moduł src/optimization/fitness.py) maksymalizuje F1-score z 5-krotnej</w:t>
+      </w:r>
+      <w:r>
+        <w:t xml:space="preserve"> </w:t>
+      </w:r>
+      <w:r>
+        <w:t xml:space="preserve">stratifikowanej walidacji krzyżowej (cross_val_score(… cv=5, scoring=f1_scorer)). Wybór</w:t>
+      </w:r>
+      <w:r>
+        <w:t xml:space="preserve"> </w:t>
+      </w:r>
+      <w:r>
+        <w:t xml:space="preserve">F1 jest motywowany wrażliwością problemu na koszt fałszywych negatywów (przeoczona</w:t>
+      </w:r>
+      <w:r>
+        <w:t xml:space="preserve"> </w:t>
+      </w:r>
+      <w:r>
+        <w:t xml:space="preserve">próbka phishingowa) oraz fałszywych pozytywów (nieprawidłowo oznaczony legalny</w:t>
+      </w:r>
+      <w:r>
+        <w:t xml:space="preserve"> </w:t>
+      </w:r>
+      <w:r>
+        <w:t xml:space="preserve">komunikat). Klasa-mniejszościowa to phishing, a F1 binarny dobrze balansuje precyzję i czułość.</w:t>
+      </w:r>
+    </w:p>
+    <w:p>
+      <w:pPr>
+        <w:pStyle w:val="BodyText"/>
+      </w:pPr>
+      <w:r>
+        <w:t xml:space="preserve">Stratifikowana 5-krotna walidacja krzyżowa chroni przed overfittingiem do losowego podziału i</w:t>
+      </w:r>
+      <w:r>
+        <w:t xml:space="preserve"> </w:t>
+      </w:r>
+      <w:r>
+        <w:t xml:space="preserve">jest standardem porównawczym w literaturze.</w:t>
+      </w:r>
+    </w:p>
+    <w:p>
+      <w:pPr>
+        <w:pStyle w:val="BodyText"/>
+      </w:pPr>
+      <w:r>
+        <w:t xml:space="preserve">Pętla ewolucyjna</w:t>
+      </w:r>
+    </w:p>
+    <w:p>
+      <w:pPr>
+        <w:pStyle w:val="BodyText"/>
+      </w:pPr>
+      <w:r>
+        <w:t xml:space="preserve">Pętla wykorzystuje algorytm eaSimple z DEAP:</w:t>
+      </w:r>
+    </w:p>
+    <w:p>
+      <w:pPr>
+        <w:pStyle w:val="SourceCode"/>
+      </w:pPr>
+      <w:r>
+        <w:rPr>
+          <w:rStyle w:val="VerbatimChar"/>
+        </w:rPr>
+        <w:t xml:space="preserve"> •   populacja początkowa: 50 osobników losowych w przestrzeni przeszukiwań;</w:t>
+      </w:r>
+      <w:r>
+        <w:br/>
+      </w:r>
+      <w:r>
+        <w:rPr>
+          <w:rStyle w:val="VerbatimChar"/>
+        </w:rPr>
+        <w:t xml:space="preserve"> •   liczba generacji: 30;</w:t>
+      </w:r>
+      <w:r>
+        <w:br/>
+      </w:r>
+      <w:r>
+        <w:rPr>
+          <w:rStyle w:val="VerbatimChar"/>
+        </w:rPr>
+        <w:t xml:space="preserve"> •   prawdopodobieństwo krzyżowania: 0,7;</w:t>
+      </w:r>
+      <w:r>
+        <w:br/>
+      </w:r>
+      <w:r>
+        <w:rPr>
+          <w:rStyle w:val="VerbatimChar"/>
+        </w:rPr>
+        <w:t xml:space="preserve"> •   prawdopodobieństwo mutacji: 0,2;</w:t>
+      </w:r>
+      <w:r>
+        <w:br/>
+      </w:r>
+      <w:r>
+        <w:rPr>
+          <w:rStyle w:val="VerbatimChar"/>
+        </w:rPr>
+        <w:t xml:space="preserve"> •   Hall of Fame: 10 najlepszych osobników, automatycznie przenoszonych pomiędzy</w:t>
+      </w:r>
+      <w:r>
+        <w:br/>
+      </w:r>
+      <w:r>
+        <w:rPr>
+          <w:rStyle w:val="VerbatimChar"/>
+        </w:rPr>
+        <w:t xml:space="preserve">     generacjami (elitaryzm).</w:t>
+      </w:r>
+    </w:p>
+    <w:p>
+      <w:pPr>
+        <w:pStyle w:val="FirstParagraph"/>
+      </w:pPr>
+      <w:r>
+        <w:t xml:space="preserve">Każdy bieg jest rejestrowany w MLflow [23] (src/optimization/mlflow_tracker.py):</w:t>
+      </w:r>
+      <w:r>
+        <w:t xml:space="preserve"> </w:t>
+      </w:r>
+      <w:r>
+        <w:t xml:space="preserve">zapisywane są hiperparametry, F1-score, średnie, odchylenia standardowe, minima i maksima</w:t>
+      </w:r>
+      <w:r>
+        <w:t xml:space="preserve"> </w:t>
+      </w:r>
+      <w:r>
+        <w:t xml:space="preserve">populacji w każdej generacji, a także najlepszy osobnik jako artefakt.</w:t>
+      </w:r>
+    </w:p>
+    <w:p>
+      <w:pPr>
+        <w:pStyle w:val="BodyText"/>
+      </w:pPr>
+      <w:r>
+        <w:t xml:space="preserve">Wersjonowanie modeli</w:t>
+      </w:r>
+    </w:p>
+    <w:p>
+      <w:pPr>
+        <w:pStyle w:val="BodyText"/>
+      </w:pPr>
+      <w:r>
+        <w:t xml:space="preserve">Po zakończeniu optymalizacji najlepszy model jest zapisywany w</w:t>
+      </w:r>
+      <w:r>
+        <w:t xml:space="preserve"> </w:t>
+      </w:r>
+      <w:r>
+        <w:t xml:space="preserve">models/optimized/{classifier}_optimized.joblib wraz z metadanymi</w:t>
+      </w:r>
+      <w:r>
+        <w:t xml:space="preserve"> </w:t>
+      </w:r>
+      <w:r>
+        <w:t xml:space="preserve">(models/optimized/{classifier}_metadata.json - data treningu, F1 testowy, hiperparametry,</w:t>
+      </w:r>
+      <w:r>
+        <w:t xml:space="preserve"> </w:t>
+      </w:r>
+      <w:r>
+        <w:t xml:space="preserve">znacznik typu ga_optimized). Rejestr aktywnych modeli (src/optimization/model_registry.py )</w:t>
+      </w:r>
+      <w:r>
+        <w:t xml:space="preserve"> </w:t>
+      </w:r>
+      <w:r>
+        <w:t xml:space="preserve">wskazuje, którą wersję modelu (bazową, zoptymalizowaną) ma ładować API. Mechanizm</w:t>
+      </w:r>
+      <w:r>
+        <w:t xml:space="preserve"> </w:t>
+      </w:r>
+      <w:r>
+        <w:t xml:space="preserve">pozwala bezboleśnie podmieniać modele bez modyfikacji kodu serwera.</w:t>
+      </w:r>
+    </w:p>
+    <w:p>
+      <w:pPr>
+        <w:pStyle w:val="BodyText"/>
+      </w:pPr>
+      <w:r>
+        <w:t xml:space="preserve">Przykładowa zawartość pliku metadanych po wykonaniu optymalizacji dla regresji logistycznej</w:t>
+      </w:r>
+      <w:r>
+        <w:t xml:space="preserve"> </w:t>
+      </w:r>
+      <w:r>
+        <w:t xml:space="preserve">(najlepszy z siedmiu klasyfikatorów po GA, F1=0,9749):</w:t>
+      </w:r>
+    </w:p>
+    <w:p>
+      <w:pPr>
+        <w:pStyle w:val="BodyText"/>
+      </w:pPr>
+      <w:r>
+        <w:t xml:space="preserve">{</w:t>
+      </w:r>
+      <w:r>
+        <w:t xml:space="preserve"> </w:t>
+      </w:r>
+      <w:r>
+        <w:t xml:space="preserve">“hyperparameters”</w:t>
+      </w:r>
+      <w:r>
+        <w:t xml:space="preserve">: {</w:t>
+      </w:r>
+      <w:r>
+        <w:t xml:space="preserve"> </w:t>
+      </w:r>
+      <w:r>
+        <w:t xml:space="preserve">“C”</w:t>
+      </w:r>
+      <w:r>
+        <w:t xml:space="preserve">: 7.974174081913068,</w:t>
+      </w:r>
+      <w:r>
+        <w:t xml:space="preserve"> </w:t>
+      </w:r>
+      <w:r>
+        <w:t xml:space="preserve">“penalty”</w:t>
+      </w:r>
+      <w:r>
+        <w:t xml:space="preserve">:</w:t>
+      </w:r>
+      <w:r>
+        <w:t xml:space="preserve"> </w:t>
+      </w:r>
+      <w:r>
+        <w:t xml:space="preserve">“l2”</w:t>
+      </w:r>
+      <w:r>
+        <w:t xml:space="preserve"> </w:t>
+      </w:r>
+      <w:r>
+        <w:t xml:space="preserve">},</w:t>
+      </w:r>
+      <w:r>
+        <w:t xml:space="preserve"> </w:t>
+      </w:r>
+      <w:r>
+        <w:t xml:space="preserve">}</w:t>
+      </w:r>
+    </w:p>
+    <w:p>
+      <w:pPr>
+        <w:pStyle w:val="BodyText"/>
+      </w:pPr>
+      <w:r>
+        <w:t xml:space="preserve">Listing 4. Przykład metadanych modelu po optymalizacji GA</w:t>
+      </w:r>
+      <w:r>
+        <w:t xml:space="preserve"> </w:t>
+      </w:r>
+      <w:r>
+        <w:t xml:space="preserve">(models/optimized/lr_metadata.json).</w:t>
+      </w:r>
+    </w:p>
+    <w:p>
+      <w:pPr>
+        <w:pStyle w:val="BodyText"/>
+      </w:pPr>
+      <w:r>
+        <w:t xml:space="preserve">Pełny komplet siedmiu plików metadanych jest zapisany w repozytorium i jest jednym z</w:t>
+      </w:r>
+      <w:r>
+        <w:t xml:space="preserve"> </w:t>
+      </w:r>
+      <w:r>
+        <w:t xml:space="preserve">głównych źródeł wyników raportowanych w rozdziale piątym pracy.</w:t>
       </w:r>
     </w:p>
     <w:p>
@@ -7749,901 +8285,59 @@
         <w:pStyle w:val="Heading2"/>
       </w:pPr>
       <w:r>
-        <w:t xml:space="preserve">4.4. Optymalizacja ewolucyjna (algorytm genetyczny)</w:t>
-      </w:r>
-    </w:p>
-    <w:p>
-      <w:pPr>
-        <w:pStyle w:val="Heading3"/>
-      </w:pPr>
-      <w:r>
-        <w:t xml:space="preserve">4.4.1. Motywacja i krótki rys historyczny</w:t>
-      </w:r>
-    </w:p>
-    <w:p>
-      <w:pPr>
-        <w:pStyle w:val="BodyText"/>
-      </w:pPr>
-      <w:r>
-        <w:t xml:space="preserve">Dobór hiperparametrów klasyfikatora ML jest klasycznym problemem optymalizacji w</w:t>
-      </w:r>
-      <w:r>
-        <w:t xml:space="preserve"> </w:t>
-      </w:r>
-      <w:r>
-        <w:t xml:space="preserve">przestrzeni o mieszanym typie. Część parametrów jest liczbami całkowitymi (liczba drzew,</w:t>
-      </w:r>
-      <w:r>
-        <w:t xml:space="preserve"> </w:t>
-      </w:r>
-      <w:r>
-        <w:t xml:space="preserve">głębokość), część liczbami rzeczywistymi w skali liniowej lub logarytmicznej (C w SVM,</w:t>
-      </w:r>
-      <w:r>
-        <w:t xml:space="preserve"> </w:t>
-      </w:r>
-      <w:r>
-        <w:t xml:space="preserve">learning_rate w XGBoost), a część zmiennymi kategorialnymi (rodzaj jądra, kryterium</w:t>
-      </w:r>
-      <w:r>
-        <w:t xml:space="preserve"> </w:t>
-      </w:r>
-      <w:r>
-        <w:t xml:space="preserve">podziału). Przestrzeń ta jest nieciągła i nie ma dostępnego gradientu, a próba dostrojenia każdego</w:t>
-      </w:r>
-      <w:r>
-        <w:t xml:space="preserve"> </w:t>
-      </w:r>
-      <w:r>
-        <w:t xml:space="preserve">parametru ręcznie nawet dla jednego klasyfikatora kosztuje godziny pracy badacza i daje wyniki</w:t>
-      </w:r>
-      <w:r>
-        <w:t xml:space="preserve"> </w:t>
-      </w:r>
-      <w:r>
-        <w:t xml:space="preserve">gorsze od metod automatycznych.</w:t>
-      </w:r>
-    </w:p>
-    <w:p>
-      <w:pPr>
-        <w:pStyle w:val="BodyText"/>
-      </w:pPr>
-      <w:r>
-        <w:t xml:space="preserve">Klasyczna metoda wyszukiwania siatkowego (grid search) skaluje się wykładniczo z liczbą</w:t>
-      </w:r>
-      <w:r>
-        <w:t xml:space="preserve"> </w:t>
-      </w:r>
-      <w:r>
-        <w:t xml:space="preserve">wymiarów. Dla XGBoost, dla którego optymalizowano dziewięć parametrów, trzy wartości na</w:t>
-      </w:r>
-      <w:r>
-        <w:t xml:space="preserve"> </w:t>
-      </w:r>
-      <w:r>
-        <w:t xml:space="preserve">każdym wymiarze dają 39 = 19683 konfiguracji, co po pięciokrotnej walidacji krzyżowej daje</w:t>
-      </w:r>
-      <w:r>
-        <w:t xml:space="preserve"> </w:t>
-      </w:r>
-      <w:r>
-        <w:t xml:space="preserve">blisko 100 tysięcy treningów. Wyszukiwanie losowe (random search) jest istotnie bardziej</w:t>
-      </w:r>
-      <w:r>
-        <w:t xml:space="preserve"> </w:t>
-      </w:r>
-      <w:r>
-        <w:t xml:space="preserve">efektywne, ponieważ większość wymiarów ma niski wpływ i przeszukiwanie ich z siatkowym</w:t>
-      </w:r>
-      <w:r>
-        <w:t xml:space="preserve"> </w:t>
-      </w:r>
-      <w:r>
-        <w:t xml:space="preserve">krokiem jest marnotrawne [40]. Jeszcze efektywniejsza jest optymalizacja bayesowska (na</w:t>
-      </w:r>
-      <w:r>
-        <w:t xml:space="preserve"> </w:t>
-      </w:r>
-      <w:r>
-        <w:t xml:space="preserve">przykład Optuna), która modeluje funkcję celu zastępczo i dobiera kolejne próbki na podstawie</w:t>
-      </w:r>
-      <w:r>
-        <w:t xml:space="preserve"> </w:t>
-      </w:r>
-      <w:r>
-        <w:t xml:space="preserve">modelu zastępczego. Domyślnym samplerem biblioteki Optuna jest TPE (Tree-structured Parzen Estimator), a wariant oparty na procesie Gaussa stanowi osobną, opcjonalną metodę. Optymalizacja bayesowska bywa wrażliwa na zmienne kategorialne i dobór przestrzeni; w tym projekcie wartości kategorialne i tak mapowane są na indeksy (src/optimization/search_spaces.py). Algorytm genetyczny wybrano ze względu na naturalną obsługę mieszanych przestrzeni (całkowitych, ciągłych i kategorialnych) bez sztucznych przekształceń oraz prostą kontrolę kosztu obliczeń, a nie z powodu udowodnionej przewagi skuteczności nad optymalizacją bayesowską.</w:t>
-      </w:r>
-    </w:p>
-    <w:p>
-      <w:pPr>
-        <w:pStyle w:val="BodyText"/>
-      </w:pPr>
-      <w:r>
-        <w:t xml:space="preserve">Algorytmy genetyczne, sformułowane przez Johna Hollanda w latach siedemdziesiątych [34] i</w:t>
-      </w:r>
-      <w:r>
-        <w:t xml:space="preserve"> </w:t>
-      </w:r>
-      <w:r>
-        <w:t xml:space="preserve">rozwijane jako odrębna gałąź obliczeń ewolucyjnych [18], przyjmują inną drogę. Przeszukują</w:t>
-      </w:r>
-      <w:r>
-        <w:t xml:space="preserve"> </w:t>
-      </w:r>
-      <w:r>
-        <w:t xml:space="preserve">przestrzeń utrzymując populację rozwiązań, które ewoluują przez selekcję, krzyżowanie i</w:t>
-      </w:r>
-      <w:r>
-        <w:t xml:space="preserve"> </w:t>
-      </w:r>
-      <w:r>
-        <w:t xml:space="preserve">mutację. W praktyce daje to kilka korzyści, które dobrze pasują do problemu hiperparametrów:</w:t>
-      </w:r>
-      <w:r>
-        <w:t xml:space="preserve"> </w:t>
-      </w:r>
-      <w:r>
-        <w:t xml:space="preserve">GA radzi sobie z mieszanką liczb całkowitych, ciągłych i kategorialnych bez sztucznego</w:t>
-      </w:r>
-      <w:r>
-        <w:t xml:space="preserve"> </w:t>
-      </w:r>
-      <w:r>
-        <w:t xml:space="preserve">mapowania, populacyjny charakter pomaga wyjść z lokalnych ekstremów, a ocena osobników w</w:t>
-      </w:r>
-      <w:r>
-        <w:t xml:space="preserve"> </w:t>
-      </w:r>
-      <w:r>
-        <w:t xml:space="preserve">jednej generacji jest niezależna, więc całość łatwo zrównoleglić. Ceną jest większy koszt</w:t>
-      </w:r>
-      <w:r>
-        <w:t xml:space="preserve"> </w:t>
-      </w:r>
-      <w:r>
-        <w:t xml:space="preserve">obliczeniowy niż w optymalizacji bayesowskiej i konieczność strojenia samych metaparametrów</w:t>
-      </w:r>
-      <w:r>
-        <w:t xml:space="preserve"> </w:t>
-      </w:r>
-      <w:r>
-        <w:t xml:space="preserve">algorytmu (wielkość populacji, prawdopodobieństwa krzyżowania i mutacji).</w:t>
-      </w:r>
-    </w:p>
-    <w:p>
-      <w:pPr>
-        <w:pStyle w:val="Heading3"/>
-      </w:pPr>
-      <w:r>
-        <w:t xml:space="preserve">4.4.2. Implementacja na bazie DEAP</w:t>
-      </w:r>
-    </w:p>
-    <w:p>
-      <w:pPr>
-        <w:pStyle w:val="BodyText"/>
-      </w:pPr>
-      <w:r>
-        <w:t xml:space="preserve">Optymalizację zrealizowałem w bibliotece DEAP (Fortin i in. [7], Distributed Evolutionary</w:t>
-      </w:r>
-      <w:r>
-        <w:t xml:space="preserve"> </w:t>
-      </w:r>
-      <w:r>
-        <w:t xml:space="preserve">Algorithms in Python, wersja 1.4.3). DEAP udostępnia gotowe operatory selekcji, krzyżowania i</w:t>
-      </w:r>
-      <w:r>
-        <w:t xml:space="preserve"> </w:t>
-      </w:r>
-      <w:r>
-        <w:t xml:space="preserve">mutacji, łatwo integruje się ze scikit-learn i pozwala też sięgnąć po bardziej zaawansowane</w:t>
-      </w:r>
-      <w:r>
-        <w:t xml:space="preserve"> </w:t>
-      </w:r>
-      <w:r>
-        <w:t xml:space="preserve">warianty obliczeń ewolucyjnych (NSGA-II, CMA-ES, programowanie genetyczne), gdyby</w:t>
-      </w:r>
-      <w:r>
-        <w:t xml:space="preserve"> </w:t>
-      </w:r>
-      <w:r>
-        <w:t xml:space="preserve">projekt rozszerzano w przyszłości. W module src/optimization/ga_optimizer.py znajdują się</w:t>
-      </w:r>
-      <w:r>
-        <w:t xml:space="preserve"> </w:t>
-      </w:r>
-      <w:r>
-        <w:t xml:space="preserve">dwie kluczowe funkcje: setup_toolbox (konfiguracja DEAP) i run_ga_optimization (główna</w:t>
-      </w:r>
-      <w:r>
-        <w:t xml:space="preserve"> </w:t>
-      </w:r>
-      <w:r>
-        <w:t xml:space="preserve">pętla ewolucyjna).</w:t>
-      </w:r>
-    </w:p>
-    <w:p>
-      <w:pPr>
-        <w:pStyle w:val="BodyText"/>
-      </w:pPr>
-      <w:r>
-        <w:t xml:space="preserve">Podczas implementacji szybko okazało się, że same operatory mutacji i krzyżowania nie</w:t>
-      </w:r>
-      <w:r>
-        <w:t xml:space="preserve"> </w:t>
-      </w:r>
-      <w:r>
-        <w:t xml:space="preserve">wystarczą - trzeba pilnować ograniczeń dziedziny. DEAP z operatorem cxBlend potrafił mi</w:t>
-      </w:r>
-    </w:p>
-    <w:p>
-      <w:pPr>
-        <w:pStyle w:val="BodyText"/>
-      </w:pPr>
-      <w:r>
-        <w:t xml:space="preserve">wygenerować wartości ujemne dla parametrów takich jak n_estimators w Random Forest, czego</w:t>
-      </w:r>
-      <w:r>
-        <w:t xml:space="preserve"> </w:t>
-      </w:r>
-      <w:r>
-        <w:t xml:space="preserve">scikit-learn naturalnie nie zaakceptował. Dodanie dekoratora checkBounds rozwiązało problem,</w:t>
-      </w:r>
-      <w:r>
-        <w:t xml:space="preserve"> </w:t>
-      </w:r>
-      <w:r>
-        <w:t xml:space="preserve">ale dopiero po kilku nieudanych uruchomieniach i ręcznym przejrzeniu wartości osobników.</w:t>
-      </w:r>
-      <w:r>
-        <w:t xml:space="preserve"> </w:t>
-      </w:r>
-      <w:r>
-        <w:t xml:space="preserve">Lekcja: w tego typu optymalizacji warto narzucić ograniczenia od pierwszej generacji, nawet</w:t>
-      </w:r>
-      <w:r>
-        <w:t xml:space="preserve"> </w:t>
-      </w:r>
-      <w:r>
-        <w:t xml:space="preserve">jeśli wstępne osobniki wyglądają poprawnie.</w:t>
-      </w:r>
-    </w:p>
-    <w:p>
-      <w:pPr>
-        <w:pStyle w:val="BodyText"/>
-      </w:pPr>
-      <w:r>
-        <w:t xml:space="preserve">Reprezentacja osobnika</w:t>
-      </w:r>
-    </w:p>
-    <w:p>
-      <w:pPr>
-        <w:pStyle w:val="BodyText"/>
-      </w:pPr>
-      <w:r>
-        <w:t xml:space="preserve">Osobnik jest listą wartości hiperparametrów. Każdy hiperparametr ma w</w:t>
-      </w:r>
-      <w:r>
-        <w:t xml:space="preserve"> </w:t>
-      </w:r>
-      <w:r>
-        <w:t xml:space="preserve">src/optimization/search_spaces.py zdefiniowaną przestrzeń przeszukiwań - z trzema typami:</w:t>
+        <w:t xml:space="preserve">4.5. System regułowy</w:t>
+      </w:r>
+    </w:p>
+    <w:p>
+      <w:pPr>
+        <w:pStyle w:val="BodyText"/>
+      </w:pPr>
+      <w:r>
+        <w:t xml:space="preserve">System regułowy zapisuje wiedzę ekspercką w pliku YAML i ocenia adres URL przez</w:t>
+      </w:r>
+      <w:r>
+        <w:t xml:space="preserve"> </w:t>
+      </w:r>
+      <w:r>
+        <w:t xml:space="preserve">sprawdzenie kilku zważonych warunków. Plik z regułami ładuje RuleEngine (moduł</w:t>
+      </w:r>
+      <w:r>
+        <w:t xml:space="preserve"> </w:t>
+      </w:r>
+      <w:r>
+        <w:t xml:space="preserve">src/paradigms/rules/engine.py) i waliduje go schemat Pydantic.</w:t>
+      </w:r>
+    </w:p>
+    <w:p>
+      <w:pPr>
+        <w:pStyle w:val="BodyText"/>
+      </w:pPr>
+      <w:r>
+        <w:t xml:space="preserve">Struktura reguły</w:t>
+      </w:r>
+      <w:r>
+        <w:t xml:space="preserve"> </w:t>
+      </w:r>
+      <w:r>
+        <w:t xml:space="preserve">description:</w:t>
+      </w:r>
+      <w:r>
+        <w:t xml:space="preserve"> </w:t>
+      </w:r>
+      <w:r>
+        <w:t xml:space="preserve">“URL uses known URL shortening service”</w:t>
+      </w:r>
+      <w:r>
+        <w:t xml:space="preserve"> </w:t>
+      </w:r>
+      <w:r>
+        <w:t xml:space="preserve">- t . c o</w:t>
       </w:r>
     </w:p>
     <w:p>
       <w:pPr>
         <w:pStyle w:val="SourceCode"/>
       </w:pPr>
-      <w:r>
-        <w:rPr>
-          <w:rStyle w:val="VerbatimChar"/>
-        </w:rPr>
-        <w:t xml:space="preserve">•    integer - liczba całkowita w zakresie (np. n_estimators w RF: 50-500);</w:t>
-      </w:r>
-      <w:r>
-        <w:br/>
-      </w:r>
-      <w:r>
-        <w:rPr>
-          <w:rStyle w:val="VerbatimChar"/>
-        </w:rPr>
-        <w:t xml:space="preserve">•    float - liczba zmiennoprzecinkowa, opcjonalnie w skali logarytmicznej (np. C w SVM lub</w:t>
-      </w:r>
-      <w:r>
-        <w:br/>
-      </w:r>
-      <w:r>
-        <w:rPr>
-          <w:rStyle w:val="VerbatimChar"/>
-        </w:rPr>
-        <w:t xml:space="preserve">     learning_rate w XGB);</w:t>
-      </w:r>
-      <w:r>
-        <w:br/>
-      </w:r>
-      <w:r>
-        <w:br/>
-      </w:r>
-      <w:r>
-        <w:rPr>
-          <w:rStyle w:val="VerbatimChar"/>
-        </w:rPr>
-        <w:t xml:space="preserve">•    categorical - indeks w liście wartości (np. kernel ∈ {'rbf', 'linear', 'poly'}).</w:t>
-      </w:r>
-    </w:p>
-    <w:p>
-      <w:pPr>
-        <w:pStyle w:val="FirstParagraph"/>
-      </w:pPr>
-      <w:r>
-        <w:t xml:space="preserve">Operatory genetyczne</w:t>
-      </w:r>
-    </w:p>
-    <w:p>
-      <w:pPr>
-        <w:pStyle w:val="SourceCode"/>
-      </w:pPr>
-      <w:r>
-        <w:rPr>
-          <w:rStyle w:val="VerbatimChar"/>
-        </w:rPr>
-        <w:t xml:space="preserve">•    Selekcja: turniejowa, rozmiar turnieju 3 (tools.selTournament(tournsize=3)). Wybór</w:t>
-      </w:r>
-      <w:r>
-        <w:br/>
-      </w:r>
-      <w:r>
-        <w:rPr>
-          <w:rStyle w:val="VerbatimChar"/>
-        </w:rPr>
-        <w:t xml:space="preserve">     trzech osobników i przepuszczenie najlepszego do kolejnej generacji równoważy</w:t>
-      </w:r>
-      <w:r>
-        <w:br/>
-      </w:r>
-      <w:r>
-        <w:rPr>
-          <w:rStyle w:val="VerbatimChar"/>
-        </w:rPr>
-        <w:t xml:space="preserve">     eksplorację i eksploatację.</w:t>
-      </w:r>
-      <w:r>
-        <w:br/>
-      </w:r>
-      <w:r>
-        <w:rPr>
-          <w:rStyle w:val="VerbatimChar"/>
-        </w:rPr>
-        <w:t xml:space="preserve">•    Krzyżowanie: mieszane (tools.cxBlend(alpha=0.5)). Tworzy dziecko jako kombinację</w:t>
-      </w:r>
-      <w:r>
-        <w:br/>
-      </w:r>
-      <w:r>
-        <w:rPr>
-          <w:rStyle w:val="VerbatimChar"/>
-        </w:rPr>
-        <w:t xml:space="preserve">     afiniczną rodziców z parametrem mieszania 𝛼 = 0,5. Z prawdopodobieństwem cxpb=0.7.</w:t>
-      </w:r>
-      <w:r>
-        <w:br/>
-      </w:r>
-      <w:r>
-        <w:rPr>
-          <w:rStyle w:val="VerbatimChar"/>
-        </w:rPr>
-        <w:t xml:space="preserve">•    Mutacja:        ograniczona     wielomianowa   (tools.mutPolynomialBounded(eta=20.0,</w:t>
-      </w:r>
-      <w:r>
-        <w:br/>
-      </w:r>
-      <w:r>
-        <w:rPr>
-          <w:rStyle w:val="VerbatimChar"/>
-        </w:rPr>
-        <w:t xml:space="preserve">     indpb=0.2)).    Dla każdego genu z prawdopodobieństwem 20% generuje wartość z</w:t>
-      </w:r>
-      <w:r>
-        <w:br/>
-      </w:r>
-      <w:r>
-        <w:rPr>
-          <w:rStyle w:val="VerbatimChar"/>
-        </w:rPr>
-        <w:t xml:space="preserve">     rozkładu wielomianowego ograniczonego do dolnego i górnego ograniczenia parametru.</w:t>
-      </w:r>
-      <w:r>
-        <w:br/>
-      </w:r>
-      <w:r>
-        <w:rPr>
-          <w:rStyle w:val="VerbatimChar"/>
-        </w:rPr>
-        <w:t xml:space="preserve">     Parametr eta=20 koncentruje mutacje blisko wartości oryginalnej, sprzyjając lokalnej</w:t>
-      </w:r>
-      <w:r>
-        <w:br/>
-      </w:r>
-      <w:r>
-        <w:rPr>
-          <w:rStyle w:val="VerbatimChar"/>
-        </w:rPr>
-        <w:t xml:space="preserve">     eksploatacji.</w:t>
-      </w:r>
-    </w:p>
-    <w:p>
-      <w:pPr>
-        <w:pStyle w:val="FirstParagraph"/>
-      </w:pPr>
-      <w:r>
-        <w:t xml:space="preserve">Oprócz tego zaimplementowano dekorator checkBounds, który egzekwuje ograniczenia po</w:t>
-      </w:r>
-      <w:r>
-        <w:t xml:space="preserve"> </w:t>
-      </w:r>
-      <w:r>
-        <w:t xml:space="preserve">krzyżowaniu i mutacji. Eliminuje to przypadki, w których operatory ciągłe generują wartości</w:t>
-      </w:r>
-      <w:r>
-        <w:t xml:space="preserve"> </w:t>
-      </w:r>
-      <w:r>
-        <w:t xml:space="preserve">spoza dopuszczalnego zakresu albo liczby zespolone (problem znany z cxBlend dla skrajnych</w:t>
-      </w:r>
-      <w:r>
-        <w:t xml:space="preserve"> </w:t>
-      </w:r>
-      <w:r>
-        <w:t xml:space="preserve">alfa).</w:t>
-      </w:r>
-    </w:p>
-    <w:p>
-      <w:pPr>
-        <w:pStyle w:val="BodyText"/>
-      </w:pPr>
-      <w:r>
-        <w:t xml:space="preserve">Funkcja celu</w:t>
-      </w:r>
-    </w:p>
-    <w:p>
-      <w:pPr>
-        <w:pStyle w:val="BodyText"/>
-      </w:pPr>
-      <w:r>
-        <w:t xml:space="preserve">Funkcja celu (moduł src/optimization/fitness.py) maksymalizuje F1-score z 5-krotnej</w:t>
-      </w:r>
-      <w:r>
-        <w:t xml:space="preserve"> </w:t>
-      </w:r>
-      <w:r>
-        <w:t xml:space="preserve">stratifikowanej walidacji krzyżowej (cross_val_score(… cv=5, scoring=f1_scorer)). Wybór</w:t>
-      </w:r>
-      <w:r>
-        <w:t xml:space="preserve"> </w:t>
-      </w:r>
-      <w:r>
-        <w:t xml:space="preserve">F1 jest motywowany wrażliwością problemu na koszt fałszywych negatywów (przeoczona</w:t>
-      </w:r>
-      <w:r>
-        <w:t xml:space="preserve"> </w:t>
-      </w:r>
-      <w:r>
-        <w:t xml:space="preserve">próbka phishingowa) oraz fałszywych pozytywów (nieprawidłowo oznaczony legalny</w:t>
-      </w:r>
-      <w:r>
-        <w:t xml:space="preserve"> </w:t>
-      </w:r>
-      <w:r>
-        <w:t xml:space="preserve">komunikat). Klasa-mniejszościowa to phishing, a F1 binarny dobrze balansuje precyzję i czułość.</w:t>
-      </w:r>
-    </w:p>
-    <w:p>
-      <w:pPr>
-        <w:pStyle w:val="BodyText"/>
-      </w:pPr>
-      <w:r>
-        <w:t xml:space="preserve">Stratifikowana 5-krotna walidacja krzyżowa chroni przed overfittingiem do losowego podziału i</w:t>
-      </w:r>
-      <w:r>
-        <w:t xml:space="preserve"> </w:t>
-      </w:r>
-      <w:r>
-        <w:t xml:space="preserve">jest standardem porównawczym w literaturze.</w:t>
-      </w:r>
-    </w:p>
-    <w:p>
-      <w:pPr>
-        <w:pStyle w:val="BodyText"/>
-      </w:pPr>
-      <w:r>
-        <w:t xml:space="preserve">Pętla ewolucyjna</w:t>
-      </w:r>
-    </w:p>
-    <w:p>
-      <w:pPr>
-        <w:pStyle w:val="BodyText"/>
-      </w:pPr>
-      <w:r>
-        <w:t xml:space="preserve">Pętla wykorzystuje algorytm eaSimple z DEAP:</w:t>
-      </w:r>
-    </w:p>
-    <w:p>
-      <w:pPr>
-        <w:pStyle w:val="SourceCode"/>
-      </w:pPr>
-      <w:r>
-        <w:rPr>
-          <w:rStyle w:val="VerbatimChar"/>
-        </w:rPr>
-        <w:t xml:space="preserve"> •   populacja początkowa: 50 osobników losowych w przestrzeni przeszukiwań;</w:t>
-      </w:r>
-      <w:r>
-        <w:br/>
-      </w:r>
-      <w:r>
-        <w:rPr>
-          <w:rStyle w:val="VerbatimChar"/>
-        </w:rPr>
-        <w:t xml:space="preserve"> •   liczba generacji: 30;</w:t>
-      </w:r>
-      <w:r>
-        <w:br/>
-      </w:r>
-      <w:r>
-        <w:rPr>
-          <w:rStyle w:val="VerbatimChar"/>
-        </w:rPr>
-        <w:t xml:space="preserve"> •   prawdopodobieństwo krzyżowania: 0,7;</w:t>
-      </w:r>
-      <w:r>
-        <w:br/>
-      </w:r>
-      <w:r>
-        <w:rPr>
-          <w:rStyle w:val="VerbatimChar"/>
-        </w:rPr>
-        <w:t xml:space="preserve"> •   prawdopodobieństwo mutacji: 0,2;</w:t>
-      </w:r>
-      <w:r>
-        <w:br/>
-      </w:r>
-      <w:r>
-        <w:rPr>
-          <w:rStyle w:val="VerbatimChar"/>
-        </w:rPr>
-        <w:t xml:space="preserve"> •   Hall of Fame: 10 najlepszych osobników, automatycznie przenoszonych pomiędzy</w:t>
-      </w:r>
-      <w:r>
-        <w:br/>
-      </w:r>
-      <w:r>
-        <w:rPr>
-          <w:rStyle w:val="VerbatimChar"/>
-        </w:rPr>
-        <w:t xml:space="preserve">     generacjami (elitaryzm).</w:t>
-      </w:r>
-    </w:p>
-    <w:p>
-      <w:pPr>
-        <w:pStyle w:val="FirstParagraph"/>
-      </w:pPr>
-      <w:r>
-        <w:t xml:space="preserve">Każdy bieg jest rejestrowany w MLflow [23] (src/optimization/mlflow_tracker.py):</w:t>
-      </w:r>
-      <w:r>
-        <w:t xml:space="preserve"> </w:t>
-      </w:r>
-      <w:r>
-        <w:t xml:space="preserve">zapisywane są hiperparametry, F1-score, średnie, odchylenia standardowe, minima i maksima</w:t>
-      </w:r>
-      <w:r>
-        <w:t xml:space="preserve"> </w:t>
-      </w:r>
-      <w:r>
-        <w:t xml:space="preserve">populacji w każdej generacji, a także najlepszy osobnik jako artefakt.</w:t>
-      </w:r>
-    </w:p>
-    <w:p>
-      <w:pPr>
-        <w:pStyle w:val="BodyText"/>
-      </w:pPr>
-      <w:r>
-        <w:t xml:space="preserve">Wersjonowanie modeli</w:t>
-      </w:r>
-    </w:p>
-    <w:p>
-      <w:pPr>
-        <w:pStyle w:val="BodyText"/>
-      </w:pPr>
-      <w:r>
-        <w:t xml:space="preserve">Po zakończeniu optymalizacji najlepszy model jest zapisywany w</w:t>
-      </w:r>
-      <w:r>
-        <w:t xml:space="preserve"> </w:t>
-      </w:r>
-      <w:r>
-        <w:t xml:space="preserve">models/optimized/{classifier}_optimized.joblib wraz z metadanymi</w:t>
-      </w:r>
-      <w:r>
-        <w:t xml:space="preserve"> </w:t>
-      </w:r>
-      <w:r>
-        <w:t xml:space="preserve">(models/optimized/{classifier}_metadata.json - data treningu, F1 testowy, hiperparametry,</w:t>
-      </w:r>
-      <w:r>
-        <w:t xml:space="preserve"> </w:t>
-      </w:r>
-      <w:r>
-        <w:t xml:space="preserve">znacznik typu ga_optimized). Rejestr aktywnych modeli (src/optimization/model_registry.py )</w:t>
-      </w:r>
-      <w:r>
-        <w:t xml:space="preserve"> </w:t>
-      </w:r>
-      <w:r>
-        <w:t xml:space="preserve">wskazuje, którą wersję modelu (bazową, zoptymalizowaną) ma ładować API. Mechanizm</w:t>
-      </w:r>
-      <w:r>
-        <w:t xml:space="preserve"> </w:t>
-      </w:r>
-      <w:r>
-        <w:t xml:space="preserve">pozwala bezboleśnie podmieniać modele bez modyfikacji kodu serwera.</w:t>
-      </w:r>
-    </w:p>
-    <w:p>
-      <w:pPr>
-        <w:pStyle w:val="BodyText"/>
-      </w:pPr>
-      <w:r>
-        <w:t xml:space="preserve">Przykładowa zawartość pliku metadanych po wykonaniu optymalizacji dla regresji logistycznej</w:t>
-      </w:r>
-      <w:r>
-        <w:t xml:space="preserve"> </w:t>
-      </w:r>
-      <w:r>
-        <w:t xml:space="preserve">(najlepszy z siedmiu klasyfikatorów po GA, F1=0,9749):</w:t>
-      </w:r>
-    </w:p>
-    <w:p>
-      <w:pPr>
-        <w:pStyle w:val="BodyText"/>
-      </w:pPr>
-      <w:r>
-        <w:t xml:space="preserve">{</w:t>
-      </w:r>
-      <w:r>
-        <w:t xml:space="preserve"> </w:t>
-      </w:r>
-      <w:r>
-        <w:t xml:space="preserve">” c l a s s i f i e r _ n a m e ” : ” l r ” ,</w:t>
-      </w:r>
-      <w:r>
-        <w:t xml:space="preserve"> </w:t>
-      </w:r>
-      <w:r>
-        <w:t xml:space="preserve">“hyperparameters”</w:t>
-      </w:r>
-      <w:r>
-        <w:t xml:space="preserve">: {</w:t>
-      </w:r>
-      <w:r>
-        <w:t xml:space="preserve"> </w:t>
-      </w:r>
-      <w:r>
-        <w:t xml:space="preserve">“C”</w:t>
-      </w:r>
-      <w:r>
-        <w:t xml:space="preserve">: 7.974174081913068,</w:t>
-      </w:r>
-      <w:r>
-        <w:t xml:space="preserve"> </w:t>
-      </w:r>
-      <w:r>
-        <w:t xml:space="preserve">“penalty”</w:t>
-      </w:r>
-      <w:r>
-        <w:t xml:space="preserve">:</w:t>
-      </w:r>
-      <w:r>
-        <w:t xml:space="preserve"> </w:t>
-      </w:r>
-      <w:r>
-        <w:t xml:space="preserve">“l2”</w:t>
-      </w:r>
-      <w:r>
-        <w:t xml:space="preserve"> </w:t>
-      </w:r>
-      <w:r>
-        <w:t xml:space="preserve">},</w:t>
-      </w:r>
-      <w:r>
-        <w:t xml:space="preserve"> </w:t>
-      </w:r>
-      <w:r>
-        <w:t xml:space="preserve">” f i t n e s s ” : 0 . 9 7 4 8 7 1 7 9 4 8 7 1 7 9 4 8 ,</w:t>
-      </w:r>
-      <w:r>
-        <w:t xml:space="preserve"> </w:t>
-      </w:r>
-      <w:r>
-        <w:t xml:space="preserve">” t i m e s t a m p ” : ” 2 0 2 6 - 0 2 - 1 1 2 3 : 5 2 : 4 2 ” ,</w:t>
-      </w:r>
-      <w:r>
-        <w:t xml:space="preserve"> </w:t>
-      </w:r>
-      <w:r>
-        <w:t xml:space="preserve">” m o d e l _ t y p e ” : ” g a _ o p t i m i z e d ”</w:t>
-      </w:r>
-      <w:r>
-        <w:t xml:space="preserve"> </w:t>
-      </w:r>
-      <w:r>
-        <w:t xml:space="preserve">}</w:t>
-      </w:r>
-    </w:p>
-    <w:p>
-      <w:pPr>
-        <w:pStyle w:val="BodyText"/>
-      </w:pPr>
-      <w:r>
-        <w:t xml:space="preserve">Listing 4. Przykład metadanych modelu po optymalizacji GA</w:t>
-      </w:r>
-      <w:r>
-        <w:t xml:space="preserve"> </w:t>
-      </w:r>
-      <w:r>
-        <w:t xml:space="preserve">(models/optimized/lr_metadata.json).</w:t>
-      </w:r>
-    </w:p>
-    <w:p>
-      <w:pPr>
-        <w:pStyle w:val="BodyText"/>
-      </w:pPr>
-      <w:r>
-        <w:t xml:space="preserve">Pełny komplet siedmiu plików metadanych jest zapisany w repozytorium i jest jednym z</w:t>
-      </w:r>
-      <w:r>
-        <w:t xml:space="preserve"> </w:t>
-      </w:r>
-      <w:r>
-        <w:t xml:space="preserve">głównych źródeł wyników raportowanych w rozdziale piątym pracy.</w:t>
-      </w:r>
-    </w:p>
-    <w:p>
-      <w:pPr>
-        <w:pStyle w:val="Heading2"/>
-      </w:pPr>
-      <w:r>
-        <w:t xml:space="preserve">4.5. System regułowy</w:t>
-      </w:r>
-    </w:p>
-    <w:p>
-      <w:pPr>
-        <w:pStyle w:val="BodyText"/>
-      </w:pPr>
-      <w:r>
-        <w:t xml:space="preserve">System regułowy zapisuje wiedzę ekspercką w pliku YAML i ocenia adres URL przez</w:t>
-      </w:r>
-      <w:r>
-        <w:t xml:space="preserve"> </w:t>
-      </w:r>
-      <w:r>
-        <w:t xml:space="preserve">sprawdzenie kilku zważonych warunków. Plik z regułami ładuje RuleEngine (moduł</w:t>
-      </w:r>
-      <w:r>
-        <w:t xml:space="preserve"> </w:t>
-      </w:r>
-      <w:r>
-        <w:t xml:space="preserve">src/paradigms/rules/engine.py) i waliduje go schemat Pydantic.</w:t>
-      </w:r>
-    </w:p>
-    <w:p>
-      <w:pPr>
-        <w:pStyle w:val="BodyText"/>
-      </w:pPr>
-      <w:r>
-        <w:t xml:space="preserve">Struktura reguły</w:t>
-      </w:r>
-      <w:r>
-        <w:t xml:space="preserve"> </w:t>
-      </w:r>
-      <w:r>
-        <w:t xml:space="preserve">- n a m e : s h o r t e n e d _ u r l</w:t>
-      </w:r>
-      <w:r>
-        <w:t xml:space="preserve"> </w:t>
-      </w:r>
-      <w:r>
-        <w:t xml:space="preserve">description:</w:t>
-      </w:r>
-      <w:r>
-        <w:t xml:space="preserve"> </w:t>
-      </w:r>
-      <w:r>
-        <w:t xml:space="preserve">“URL uses known URL shortening service”</w:t>
-      </w:r>
-      <w:r>
-        <w:t xml:space="preserve"> </w:t>
-      </w:r>
-      <w:r>
-        <w:t xml:space="preserve">w e i g h t : 0 . 2 0</w:t>
-      </w:r>
-      <w:r>
-        <w:t xml:space="preserve"> </w:t>
-      </w:r>
-      <w:r>
-        <w:t xml:space="preserve">c a t e g o r y : u r l _ s t r u c t u r e</w:t>
-      </w:r>
-      <w:r>
-        <w:t xml:space="preserve"> </w:t>
-      </w:r>
-      <w:r>
-        <w:t xml:space="preserve">c o n d i t i o n :</w:t>
-      </w:r>
-      <w:r>
-        <w:t xml:space="preserve"> </w:t>
-      </w:r>
-      <w:r>
-        <w:t xml:space="preserve">t y p e : d o m a i n _ m a t c h</w:t>
-      </w:r>
-      <w:r>
-        <w:t xml:space="preserve"> </w:t>
-      </w:r>
-      <w:r>
-        <w:t xml:space="preserve">f e a t u r e : d o m a i n</w:t>
-      </w:r>
-      <w:r>
-        <w:t xml:space="preserve"> </w:t>
-      </w:r>
-      <w:r>
-        <w:t xml:space="preserve">d o m a i n s :</w:t>
-      </w:r>
-      <w:r>
-        <w:t xml:space="preserve"> </w:t>
-      </w:r>
-      <w:r>
-        <w:t xml:space="preserve">- b i t . l y</w:t>
-      </w:r>
-      <w:r>
-        <w:t xml:space="preserve"> </w:t>
-      </w:r>
-      <w:r>
-        <w:t xml:space="preserve">- t i n y u r l . c o m</w:t>
-      </w:r>
-      <w:r>
-        <w:t xml:space="preserve"> </w:t>
-      </w:r>
-      <w:r>
-        <w:t xml:space="preserve">- g o o . g l</w:t>
-      </w:r>
-      <w:r>
-        <w:t xml:space="preserve"> </w:t>
-      </w:r>
-      <w:r>
-        <w:t xml:space="preserve">- t . c o</w:t>
-      </w:r>
-    </w:p>
-    <w:p>
-      <w:pPr>
-        <w:pStyle w:val="SourceCode"/>
-      </w:pPr>
-      <w:r>
-        <w:rPr>
-          <w:rStyle w:val="VerbatimChar"/>
-        </w:rPr>
-        <w:t xml:space="preserve">     -                           o               w               .               l            y</w:t>
-      </w:r>
-      <w:r>
-        <w:br/>
-      </w:r>
-      <w:r>
-        <w:rPr>
-          <w:rStyle w:val="VerbatimChar"/>
-        </w:rPr>
-        <w:t xml:space="preserve">     -                           i               s               .               g            d</w:t>
-      </w:r>
-      <w:r>
-        <w:br/>
-      </w:r>
       <w:r>
         <w:rPr>
           <w:rStyle w:val="VerbatimChar"/>
@@ -9104,15 +8798,6 @@
       </w:r>
       <w:r>
         <w:br/>
-      </w:r>
-      <w:r>
-        <w:br/>
-      </w:r>
-      <w:r>
-        <w:rPr>
-          <w:rStyle w:val="VerbatimChar"/>
-        </w:rPr>
-        <w:t xml:space="preserve">                               𝑃(𝑋 ∣ 𝐶) = ∏ 𝑃 (𝑥𝑖 ∣ 𝐶)</w:t>
       </w:r>
       <w:r>
         <w:br/>

</xml_diff>

<commit_message>
feat(docs): crop architecture diagram to graphic only; drop non-figure page 26
A1 is now the cropped architecture diagram (readable box diagram from s.25, just
the graphic). Page 26 contained no figure (text only) and was removed from the
appendix. Screenshots renumbered A2-A4.

Co-Authored-By: Claude Opus 4.8 <noreply@anthropic.com>
</commit_message>
<xml_diff>
--- a/praca-inzynierska-poprawiona.docx
+++ b/praca-inzynierska-poprawiona.docx
@@ -13833,7 +13833,7 @@
       </w:r>
     </w:p>
     <w:bookmarkEnd w:id="15"/>
-    <w:bookmarkStart w:id="31" w:name="X76524fbbc7d67c5c8a9c1febf3aee3aa1a15cb5"/>
+    <w:bookmarkStart w:id="28" w:name="X76524fbbc7d67c5c8a9c1febf3aee3aa1a15cb5"/>
     <w:p>
       <w:pPr>
         <w:pStyle w:val="Heading1"/>
@@ -13869,14 +13869,14 @@
       <w:r>
         <w:drawing>
           <wp:inline>
-            <wp:extent cx="5334000" cy="6902823"/>
+            <wp:extent cx="5334000" cy="4432381"/>
             <wp:effectExtent b="0" l="0" r="0" t="0"/>
-            <wp:docPr descr="Rysunek A1. Architektura systemu (render s. 25 oryginału)." title="" id="17" name="Picture"/>
+            <wp:docPr descr="Rysunek A1. Architektura logiczna systemu PhishGuard (przycięty diagram, s. 25)." title="" id="17" name="Picture"/>
             <a:graphic>
               <a:graphicData uri="http://schemas.openxmlformats.org/drawingml/2006/picture">
                 <pic:pic>
                   <pic:nvPicPr>
-                    <pic:cNvPr descr="/Users/lukaszdrazek/Inzynierka/reports/figury/strona-25.png" id="18" name="Picture"/>
+                    <pic:cNvPr descr="/Users/lukaszdrazek/Inzynierka/reports/figury2/diagram_architektura.png" id="18" name="Picture"/>
                     <pic:cNvPicPr>
                       <a:picLocks noChangeArrowheads="1" noChangeAspect="1"/>
                     </pic:cNvPicPr>
@@ -13890,7 +13890,7 @@
                   <pic:spPr bwMode="auto">
                     <a:xfrm>
                       <a:off x="0" y="0"/>
-                      <a:ext cx="5334000" cy="6902823"/>
+                      <a:ext cx="5334000" cy="4432381"/>
                     </a:xfrm>
                     <a:prstGeom prst="rect">
                       <a:avLst/>
@@ -13914,7 +13914,7 @@
         <w:pStyle w:val="ImageCaption"/>
       </w:pPr>
       <w:r>
-        <w:t xml:space="preserve">Rysunek A1. Architektura systemu (render s. 25 oryginału).</w:t>
+        <w:t xml:space="preserve">Rysunek A1. Architektura logiczna systemu PhishGuard (przycięty diagram, s. 25).</w:t>
       </w:r>
     </w:p>
     <w:p>
@@ -13926,7 +13926,7 @@
           <w:i/>
           <w:iCs/>
         </w:rPr>
-        <w:t xml:space="preserve">Rysunek A1. Architektura systemu (render s. 25 oryginału).</w:t>
+        <w:t xml:space="preserve">Rysunek A1. Architektura logiczna systemu PhishGuard (przycięty diagram, s. 25).</w:t>
       </w:r>
     </w:p>
     <w:p>
@@ -13936,14 +13936,14 @@
       <w:r>
         <w:drawing>
           <wp:inline>
-            <wp:extent cx="5334000" cy="6902823"/>
+            <wp:extent cx="5334000" cy="7077307"/>
             <wp:effectExtent b="0" l="0" r="0" t="0"/>
-            <wp:docPr descr="Rysunek A2. Architektura / przepływ danych (render s. 26 oryginału)." title="" id="20" name="Picture"/>
+            <wp:docPr descr="Rysunek A2. Interfejs — zrzut ekranu (s. 48 oryginału)." title="" id="20" name="Picture"/>
             <a:graphic>
               <a:graphicData uri="http://schemas.openxmlformats.org/drawingml/2006/picture">
                 <pic:pic>
                   <pic:nvPicPr>
-                    <pic:cNvPr descr="/Users/lukaszdrazek/Inzynierka/reports/figury/strona-26.png" id="21" name="Picture"/>
+                    <pic:cNvPr descr="/Users/lukaszdrazek/Inzynierka/reports/figury2/zrzut-000.png" id="21" name="Picture"/>
                     <pic:cNvPicPr>
                       <a:picLocks noChangeArrowheads="1" noChangeAspect="1"/>
                     </pic:cNvPicPr>
@@ -13957,7 +13957,7 @@
                   <pic:spPr bwMode="auto">
                     <a:xfrm>
                       <a:off x="0" y="0"/>
-                      <a:ext cx="5334000" cy="6902823"/>
+                      <a:ext cx="5334000" cy="7077307"/>
                     </a:xfrm>
                     <a:prstGeom prst="rect">
                       <a:avLst/>
@@ -13981,7 +13981,7 @@
         <w:pStyle w:val="ImageCaption"/>
       </w:pPr>
       <w:r>
-        <w:t xml:space="preserve">Rysunek A2. Architektura / przepływ danych (render s. 26 oryginału).</w:t>
+        <w:t xml:space="preserve">Rysunek A2. Interfejs — zrzut ekranu (s. 48 oryginału).</w:t>
       </w:r>
     </w:p>
     <w:p>
@@ -13993,7 +13993,7 @@
           <w:i/>
           <w:iCs/>
         </w:rPr>
-        <w:t xml:space="preserve">Rysunek A2. Architektura / przepływ danych (render s. 26 oryginału).</w:t>
+        <w:t xml:space="preserve">Rysunek A2. Interfejs — zrzut ekranu (s. 48 oryginału).</w:t>
       </w:r>
     </w:p>
     <w:p>
@@ -14005,12 +14005,12 @@
           <wp:inline>
             <wp:extent cx="5334000" cy="7077307"/>
             <wp:effectExtent b="0" l="0" r="0" t="0"/>
-            <wp:docPr descr="Rysunek A3. Interfejs — zrzut ekranu (s. 48 oryginału)." title="" id="23" name="Picture"/>
+            <wp:docPr descr="Rysunek A3. Interfejs — zrzut ekranu (s. 49 oryginału)." title="" id="23" name="Picture"/>
             <a:graphic>
               <a:graphicData uri="http://schemas.openxmlformats.org/drawingml/2006/picture">
                 <pic:pic>
                   <pic:nvPicPr>
-                    <pic:cNvPr descr="/Users/lukaszdrazek/Inzynierka/reports/figury2/zrzut-000.png" id="24" name="Picture"/>
+                    <pic:cNvPr descr="/Users/lukaszdrazek/Inzynierka/reports/figury2/zrzut-001.png" id="24" name="Picture"/>
                     <pic:cNvPicPr>
                       <a:picLocks noChangeArrowheads="1" noChangeAspect="1"/>
                     </pic:cNvPicPr>
@@ -14048,7 +14048,7 @@
         <w:pStyle w:val="ImageCaption"/>
       </w:pPr>
       <w:r>
-        <w:t xml:space="preserve">Rysunek A3. Interfejs — zrzut ekranu (s. 48 oryginału).</w:t>
+        <w:t xml:space="preserve">Rysunek A3. Interfejs — zrzut ekranu (s. 49 oryginału).</w:t>
       </w:r>
     </w:p>
     <w:p>
@@ -14060,7 +14060,7 @@
           <w:i/>
           <w:iCs/>
         </w:rPr>
-        <w:t xml:space="preserve">Rysunek A3. Interfejs — zrzut ekranu (s. 48 oryginału).</w:t>
+        <w:t xml:space="preserve">Rysunek A3. Interfejs — zrzut ekranu (s. 49 oryginału).</w:t>
       </w:r>
     </w:p>
     <w:p>
@@ -14072,12 +14072,12 @@
           <wp:inline>
             <wp:extent cx="5334000" cy="7077307"/>
             <wp:effectExtent b="0" l="0" r="0" t="0"/>
-            <wp:docPr descr="Rysunek A4. Interfejs — zrzut ekranu (s. 49 oryginału)." title="" id="26" name="Picture"/>
+            <wp:docPr descr="Rysunek A4. Interfejs — zrzut ekranu (s. 50 oryginału)." title="" id="26" name="Picture"/>
             <a:graphic>
               <a:graphicData uri="http://schemas.openxmlformats.org/drawingml/2006/picture">
                 <pic:pic>
                   <pic:nvPicPr>
-                    <pic:cNvPr descr="/Users/lukaszdrazek/Inzynierka/reports/figury2/zrzut-001.png" id="27" name="Picture"/>
+                    <pic:cNvPr descr="/Users/lukaszdrazek/Inzynierka/reports/figury2/zrzut-002.png" id="27" name="Picture"/>
                     <pic:cNvPicPr>
                       <a:picLocks noChangeArrowheads="1" noChangeAspect="1"/>
                     </pic:cNvPicPr>
@@ -14115,7 +14115,7 @@
         <w:pStyle w:val="ImageCaption"/>
       </w:pPr>
       <w:r>
-        <w:t xml:space="preserve">Rysunek A4. Interfejs — zrzut ekranu (s. 49 oryginału).</w:t>
+        <w:t xml:space="preserve">Rysunek A4. Interfejs — zrzut ekranu (s. 50 oryginału).</w:t>
       </w:r>
     </w:p>
     <w:p>
@@ -14127,78 +14127,11 @@
           <w:i/>
           <w:iCs/>
         </w:rPr>
-        <w:t xml:space="preserve">Rysunek A4. Interfejs — zrzut ekranu (s. 49 oryginału).</w:t>
-      </w:r>
-    </w:p>
-    <w:p>
-      <w:pPr>
-        <w:pStyle w:val="CaptionedFigure"/>
-      </w:pPr>
-      <w:r>
-        <w:drawing>
-          <wp:inline>
-            <wp:extent cx="5334000" cy="7077307"/>
-            <wp:effectExtent b="0" l="0" r="0" t="0"/>
-            <wp:docPr descr="Rysunek A5. Interfejs — zrzut ekranu (s. 50 oryginału)." title="" id="29" name="Picture"/>
-            <a:graphic>
-              <a:graphicData uri="http://schemas.openxmlformats.org/drawingml/2006/picture">
-                <pic:pic>
-                  <pic:nvPicPr>
-                    <pic:cNvPr descr="/Users/lukaszdrazek/Inzynierka/reports/figury2/zrzut-002.png" id="30" name="Picture"/>
-                    <pic:cNvPicPr>
-                      <a:picLocks noChangeArrowheads="1" noChangeAspect="1"/>
-                    </pic:cNvPicPr>
-                  </pic:nvPicPr>
-                  <pic:blipFill>
-                    <a:blip r:embed="rId28"/>
-                    <a:stretch>
-                      <a:fillRect/>
-                    </a:stretch>
-                  </pic:blipFill>
-                  <pic:spPr bwMode="auto">
-                    <a:xfrm>
-                      <a:off x="0" y="0"/>
-                      <a:ext cx="5334000" cy="7077307"/>
-                    </a:xfrm>
-                    <a:prstGeom prst="rect">
-                      <a:avLst/>
-                    </a:prstGeom>
-                    <a:noFill/>
-                    <a:ln w="9525">
-                      <a:noFill/>
-                      <a:headEnd/>
-                      <a:tailEnd/>
-                    </a:ln>
-                  </pic:spPr>
-                </pic:pic>
-              </a:graphicData>
-            </a:graphic>
-          </wp:inline>
-        </w:drawing>
-      </w:r>
-    </w:p>
-    <w:p>
-      <w:pPr>
-        <w:pStyle w:val="ImageCaption"/>
-      </w:pPr>
-      <w:r>
-        <w:t xml:space="preserve">Rysunek A5. Interfejs — zrzut ekranu (s. 50 oryginału).</w:t>
-      </w:r>
-    </w:p>
-    <w:p>
-      <w:pPr>
-        <w:pStyle w:val="BodyText"/>
-      </w:pPr>
-      <w:r>
-        <w:rPr>
-          <w:i/>
-          <w:iCs/>
-        </w:rPr>
-        <w:t xml:space="preserve">Rysunek A5. Interfejs — zrzut ekranu (s. 50 oryginału).</w:t>
-      </w:r>
-    </w:p>
-    <w:bookmarkEnd w:id="31"/>
-    <w:bookmarkStart w:id="32" w:name="X6aa2ea93f36e86d4a816f8245b4a3606ca86790"/>
+        <w:t xml:space="preserve">Rysunek A4. Interfejs — zrzut ekranu (s. 50 oryginału).</w:t>
+      </w:r>
+    </w:p>
+    <w:bookmarkEnd w:id="28"/>
+    <w:bookmarkStart w:id="29" w:name="X6aa2ea93f36e86d4a816f8245b4a3606ca86790"/>
     <w:p>
       <w:pPr>
         <w:pStyle w:val="Heading1"/>
@@ -16824,7 +16757,7 @@
         <w:t xml:space="preserve">@classmetho</w:t>
       </w:r>
     </w:p>
-    <w:bookmarkEnd w:id="32"/>
+    <w:bookmarkEnd w:id="29"/>
     <w:sectPr>
       <w:footerReference w:type="default" r:id="rId9"/>
       <w:footerReference w:type="first" r:id="rId10"/>

</xml_diff>